<commit_message>
Format Hebrew project book as Word document
Co-authored-by: Cursor <cursoragent@cursor.com>
</commit_message>
<xml_diff>
--- a/secure_chat/book/SecureChat_Project_Book_HE.docx
+++ b/secure_chat/book/SecureChat_Project_Book_HE.docx
@@ -4,12 +4,136 @@
   <w:body>
     <w:p>
       <w:pPr>
-        <w:jc w:val="right"/>
-        <w:bidi w:val="1"/>
-      </w:pPr>
-      <w:r>
-        <w:rPr>
-          <w:rFonts w:ascii="Arial" w:hAnsi="Arial" w:cs="Arial"/>
+        <w:pStyle w:val="Title"/>
+        <w:jc w:val="right"/>
+        <w:bidi w:val="1"/>
+      </w:pPr>
+      <w:r>
+        <w:rPr>
+          <w:rFonts w:ascii="Arial" w:hAnsi="Arial" w:cs="Arial"/>
+          <w:b/>
+          <w:sz w:val="44"/>
+        </w:rPr>
+        <w:t>??? ??????: SecureChat</w:t>
+      </w:r>
+    </w:p>
+    <w:p>
+      <w:pPr>
+        <w:jc w:val="right"/>
+        <w:bidi w:val="1"/>
+      </w:pPr>
+      <w:r>
+        <w:rPr>
+          <w:rFonts w:ascii="Arial" w:hAnsi="Arial" w:cs="Arial"/>
+          <w:b/>
+          <w:sz w:val="28"/>
+        </w:rPr>
+        <w:t>????? ?'?? ??????? ????? ???????</w:t>
+      </w:r>
+    </w:p>
+    <w:p>
+      <w:pPr>
+        <w:jc w:val="right"/>
+        <w:bidi w:val="1"/>
+      </w:pPr>
+      <w:r>
+        <w:rPr>
+          <w:rFonts w:ascii="Arial" w:hAnsi="Arial" w:cs="Arial"/>
+          <w:b w:val="0"/>
+          <w:sz w:val="24"/>
+        </w:rPr>
+        <w:t>?? ??????: ____________</w:t>
+      </w:r>
+    </w:p>
+    <w:p>
+      <w:pPr>
+        <w:jc w:val="right"/>
+        <w:bidi w:val="1"/>
+      </w:pPr>
+      <w:r>
+        <w:rPr>
+          <w:rFonts w:ascii="Arial" w:hAnsi="Arial" w:cs="Arial"/>
+          <w:b w:val="0"/>
+          <w:sz w:val="24"/>
+        </w:rPr>
+        <w:t>?? ??? ????: ____________</w:t>
+      </w:r>
+    </w:p>
+    <w:p>
+      <w:pPr>
+        <w:jc w:val="right"/>
+        <w:bidi w:val="1"/>
+      </w:pPr>
+      <w:r>
+        <w:rPr>
+          <w:rFonts w:ascii="Arial" w:hAnsi="Arial" w:cs="Arial"/>
+          <w:b w:val="0"/>
+          <w:sz w:val="24"/>
+        </w:rPr>
+        <w:t>?? ?????: ____________</w:t>
+      </w:r>
+    </w:p>
+    <w:p>
+      <w:pPr>
+        <w:jc w:val="right"/>
+        <w:bidi w:val="1"/>
+      </w:pPr>
+      <w:r>
+        <w:rPr>
+          <w:rFonts w:ascii="Arial" w:hAnsi="Arial" w:cs="Arial"/>
+          <w:b w:val="0"/>
+          <w:sz w:val="24"/>
+        </w:rPr>
+        <w:t>????? ????: ____________</w:t>
+      </w:r>
+    </w:p>
+    <w:p>
+      <w:r>
+        <w:br w:type="page"/>
+      </w:r>
+    </w:p>
+    <w:p>
+      <w:pPr>
+        <w:pStyle w:val="Heading1"/>
+        <w:jc w:val="right"/>
+        <w:bidi w:val="1"/>
+      </w:pPr>
+      <w:r>
+        <w:rPr>
+          <w:rFonts w:ascii="Arial" w:hAnsi="Arial" w:cs="Arial"/>
+          <w:b/>
+          <w:sz w:val="32"/>
+        </w:rPr>
+        <w:t>???? ??????? ???????</w:t>
+      </w:r>
+    </w:p>
+    <w:p>
+      <w:pPr>
+        <w:jc w:val="right"/>
+        <w:bidi w:val="1"/>
+      </w:pPr>
+      <w:r>
+        <w:fldChar w:fldCharType="begin"/>
+        <w:instrText xml:space="preserve">TOC \o "1-3" \h \z \u</w:instrText>
+        <w:fldChar w:fldCharType="separate"/>
+        <w:t>???? ???? ???? ?????? ??? ??? ????? ???? ??????? ???????.</w:t>
+        <w:fldChar w:fldCharType="end"/>
+      </w:r>
+    </w:p>
+    <w:p>
+      <w:r>
+        <w:br w:type="page"/>
+      </w:r>
+    </w:p>
+    <w:p>
+      <w:pPr>
+        <w:jc w:val="right"/>
+        <w:bidi w:val="1"/>
+      </w:pPr>
+      <w:r>
+        <w:rPr>
+          <w:rFonts w:ascii="Arial" w:hAnsi="Arial" w:cs="Arial"/>
+          <w:b w:val="0"/>
           <w:sz w:val="24"/>
         </w:rPr>
         <w:t>﻿# ספר פרויקט: SecureChat</w:t>
@@ -25,6 +149,7 @@
       <w:r>
         <w:rPr>
           <w:rFonts w:ascii="Arial" w:hAnsi="Arial" w:cs="Arial"/>
+          <w:b/>
           <w:sz w:val="32"/>
         </w:rPr>
         <w:t>פרטי התלמיד</w:t>
@@ -39,6 +164,7 @@
       <w:r>
         <w:rPr>
           <w:rFonts w:ascii="Arial" w:hAnsi="Arial" w:cs="Arial"/>
+          <w:b w:val="0"/>
           <w:sz w:val="24"/>
         </w:rPr>
         <w:t>שם הפרויקט: SecureChat - מערכת צ'אט מאובטחת מרובת משתמשים</w:t>
@@ -52,6 +178,7 @@
       <w:r>
         <w:rPr>
           <w:rFonts w:ascii="Arial" w:hAnsi="Arial" w:cs="Arial"/>
+          <w:b w:val="0"/>
           <w:sz w:val="24"/>
         </w:rPr>
         <w:t>מקצוע: תכנון ותכנות מערכות - חלופת מערכות הגנת סייבר</w:t>
@@ -65,6 +192,7 @@
       <w:r>
         <w:rPr>
           <w:rFonts w:ascii="Arial" w:hAnsi="Arial" w:cs="Arial"/>
+          <w:b w:val="0"/>
           <w:sz w:val="24"/>
         </w:rPr>
         <w:t>רמת לימוד: 5 יחידות לימוד</w:t>
@@ -78,6 +206,7 @@
       <w:r>
         <w:rPr>
           <w:rFonts w:ascii="Arial" w:hAnsi="Arial" w:cs="Arial"/>
+          <w:b w:val="0"/>
           <w:sz w:val="24"/>
         </w:rPr>
         <w:t>שם התלמיד: ____________</w:t>
@@ -91,6 +220,7 @@
       <w:r>
         <w:rPr>
           <w:rFonts w:ascii="Arial" w:hAnsi="Arial" w:cs="Arial"/>
+          <w:b w:val="0"/>
           <w:sz w:val="24"/>
         </w:rPr>
         <w:t>תעודת זהות: ____________</w:t>
@@ -104,6 +234,7 @@
       <w:r>
         <w:rPr>
           <w:rFonts w:ascii="Arial" w:hAnsi="Arial" w:cs="Arial"/>
+          <w:b w:val="0"/>
           <w:sz w:val="24"/>
         </w:rPr>
         <w:t>שם בית הספר: ____________</w:t>
@@ -117,6 +248,7 @@
       <w:r>
         <w:rPr>
           <w:rFonts w:ascii="Arial" w:hAnsi="Arial" w:cs="Arial"/>
+          <w:b w:val="0"/>
           <w:sz w:val="24"/>
         </w:rPr>
         <w:t>סמל מוסד: ____________</w:t>
@@ -130,6 +262,7 @@
       <w:r>
         <w:rPr>
           <w:rFonts w:ascii="Arial" w:hAnsi="Arial" w:cs="Arial"/>
+          <w:b w:val="0"/>
           <w:sz w:val="24"/>
         </w:rPr>
         <w:t>שם המורה: ____________</w:t>
@@ -143,6 +276,7 @@
       <w:r>
         <w:rPr>
           <w:rFonts w:ascii="Arial" w:hAnsi="Arial" w:cs="Arial"/>
+          <w:b w:val="0"/>
           <w:sz w:val="24"/>
         </w:rPr>
         <w:t>תאריך הגשה: ____________</w:t>
@@ -157,6 +291,7 @@
       <w:r>
         <w:rPr>
           <w:rFonts w:ascii="Arial" w:hAnsi="Arial" w:cs="Arial"/>
+          <w:b w:val="0"/>
           <w:sz w:val="24"/>
         </w:rPr>
         <w:t>????????????????????????</w:t>
@@ -172,6 +307,7 @@
       <w:r>
         <w:rPr>
           <w:rFonts w:ascii="Arial" w:hAnsi="Arial" w:cs="Arial"/>
+          <w:b/>
           <w:sz w:val="32"/>
         </w:rPr>
         <w:t>תוכן עניינים</w:t>
@@ -186,6 +322,7 @@
       <w:r>
         <w:rPr>
           <w:rFonts w:ascii="Arial" w:hAnsi="Arial" w:cs="Arial"/>
+          <w:b w:val="0"/>
           <w:sz w:val="24"/>
         </w:rPr>
         <w:t>1. מבוא וייזום הפרויקט</w:t>
@@ -199,6 +336,7 @@
       <w:r>
         <w:rPr>
           <w:rFonts w:ascii="Arial" w:hAnsi="Arial" w:cs="Arial"/>
+          <w:b w:val="0"/>
           <w:sz w:val="24"/>
         </w:rPr>
         <w:t>2. אפיון המערכת</w:t>
@@ -212,6 +350,7 @@
       <w:r>
         <w:rPr>
           <w:rFonts w:ascii="Arial" w:hAnsi="Arial" w:cs="Arial"/>
+          <w:b w:val="0"/>
           <w:sz w:val="24"/>
         </w:rPr>
         <w:t>3. לוח זמנים</w:t>
@@ -225,6 +364,7 @@
       <w:r>
         <w:rPr>
           <w:rFonts w:ascii="Arial" w:hAnsi="Arial" w:cs="Arial"/>
+          <w:b w:val="0"/>
           <w:sz w:val="24"/>
         </w:rPr>
         <w:t>4. ניהול סיכונים</w:t>
@@ -238,6 +378,7 @@
       <w:r>
         <w:rPr>
           <w:rFonts w:ascii="Arial" w:hAnsi="Arial" w:cs="Arial"/>
+          <w:b w:val="0"/>
           <w:sz w:val="24"/>
         </w:rPr>
         <w:t>5. תיאור תחום הידע</w:t>
@@ -251,6 +392,7 @@
       <w:r>
         <w:rPr>
           <w:rFonts w:ascii="Arial" w:hAnsi="Arial" w:cs="Arial"/>
+          <w:b w:val="0"/>
           <w:sz w:val="24"/>
         </w:rPr>
         <w:t>6. ארכיטקטורת המערכת</w:t>
@@ -264,6 +406,7 @@
       <w:r>
         <w:rPr>
           <w:rFonts w:ascii="Arial" w:hAnsi="Arial" w:cs="Arial"/>
+          <w:b w:val="0"/>
           <w:sz w:val="24"/>
         </w:rPr>
         <w:t>7. חלוקה למודולים</w:t>
@@ -277,6 +420,7 @@
       <w:r>
         <w:rPr>
           <w:rFonts w:ascii="Arial" w:hAnsi="Arial" w:cs="Arial"/>
+          <w:b w:val="0"/>
           <w:sz w:val="24"/>
         </w:rPr>
         <w:t>8. פרוטוקול התקשורת</w:t>
@@ -290,6 +434,7 @@
       <w:r>
         <w:rPr>
           <w:rFonts w:ascii="Arial" w:hAnsi="Arial" w:cs="Arial"/>
+          <w:b w:val="0"/>
           <w:sz w:val="24"/>
         </w:rPr>
         <w:t>9. אלגוריתמים מרכזיים</w:t>
@@ -303,6 +448,7 @@
       <w:r>
         <w:rPr>
           <w:rFonts w:ascii="Arial" w:hAnsi="Arial" w:cs="Arial"/>
+          <w:b w:val="0"/>
           <w:sz w:val="24"/>
         </w:rPr>
         <w:t>10. אבטחת מידע וחולשות</w:t>
@@ -316,6 +462,7 @@
       <w:r>
         <w:rPr>
           <w:rFonts w:ascii="Arial" w:hAnsi="Arial" w:cs="Arial"/>
+          <w:b w:val="0"/>
           <w:sz w:val="24"/>
         </w:rPr>
         <w:t>11. תיאור מימוש הפרויקט</w:t>
@@ -329,6 +476,7 @@
       <w:r>
         <w:rPr>
           <w:rFonts w:ascii="Arial" w:hAnsi="Arial" w:cs="Arial"/>
+          <w:b w:val="0"/>
           <w:sz w:val="24"/>
         </w:rPr>
         <w:t>12. תכנות מונחה עצמים</w:t>
@@ -342,6 +490,7 @@
       <w:r>
         <w:rPr>
           <w:rFonts w:ascii="Arial" w:hAnsi="Arial" w:cs="Arial"/>
+          <w:b w:val="0"/>
           <w:sz w:val="24"/>
         </w:rPr>
         <w:t>13. שמירת נתונים וקבצים</w:t>
@@ -355,6 +504,7 @@
       <w:r>
         <w:rPr>
           <w:rFonts w:ascii="Arial" w:hAnsi="Arial" w:cs="Arial"/>
+          <w:b w:val="0"/>
           <w:sz w:val="24"/>
         </w:rPr>
         <w:t>14. בדיקות</w:t>
@@ -368,6 +518,7 @@
       <w:r>
         <w:rPr>
           <w:rFonts w:ascii="Arial" w:hAnsi="Arial" w:cs="Arial"/>
+          <w:b w:val="0"/>
           <w:sz w:val="24"/>
         </w:rPr>
         <w:t>15. מדריך למשתמש</w:t>
@@ -381,6 +532,7 @@
       <w:r>
         <w:rPr>
           <w:rFonts w:ascii="Arial" w:hAnsi="Arial" w:cs="Arial"/>
+          <w:b w:val="0"/>
           <w:sz w:val="24"/>
         </w:rPr>
         <w:t>16. סיכום אישי ורפלקציה</w:t>
@@ -394,6 +546,7 @@
       <w:r>
         <w:rPr>
           <w:rFonts w:ascii="Arial" w:hAnsi="Arial" w:cs="Arial"/>
+          <w:b w:val="0"/>
           <w:sz w:val="24"/>
         </w:rPr>
         <w:t>17. ביבליוגרפיה</w:t>
@@ -407,6 +560,7 @@
       <w:r>
         <w:rPr>
           <w:rFonts w:ascii="Arial" w:hAnsi="Arial" w:cs="Arial"/>
+          <w:b w:val="0"/>
           <w:sz w:val="24"/>
         </w:rPr>
         <w:t>18. נספחים</w:t>
@@ -421,6 +575,7 @@
       <w:r>
         <w:rPr>
           <w:rFonts w:ascii="Arial" w:hAnsi="Arial" w:cs="Arial"/>
+          <w:b w:val="0"/>
           <w:sz w:val="24"/>
         </w:rPr>
         <w:t>????????????????????????</w:t>
@@ -436,6 +591,7 @@
       <w:r>
         <w:rPr>
           <w:rFonts w:ascii="Arial" w:hAnsi="Arial" w:cs="Arial"/>
+          <w:b/>
           <w:sz w:val="32"/>
         </w:rPr>
         <w:t>1. מבוא וייזום הפרויקט</w:t>
@@ -450,6 +606,7 @@
       <w:r>
         <w:rPr>
           <w:rFonts w:ascii="Arial" w:hAnsi="Arial" w:cs="Arial"/>
+          <w:b w:val="0"/>
           <w:sz w:val="24"/>
         </w:rPr>
         <w:t>הפרויקט SecureChat הוא מערכת צ'אט מאובטחת המאפשרת למספר משתמשים להתחבר לשרת מרכזי, להירשם, להתחבר, להצטרף לחדרים, ליצור חדרים חדשים, לשלוח הודעות טקסט, אימוג'ים, תמונות, קבצים וסרטונים, ולנהל פעולות מתקדמות כמו הודעות פרטיות, פרופיל משתמש, חיפוש הודעות, חברים, גלריית תמונות, פאנל מנהל בסיסי וקודי 2FA להדגמה.</w:t>
@@ -464,6 +621,7 @@
       <w:r>
         <w:rPr>
           <w:rFonts w:ascii="Arial" w:hAnsi="Arial" w:cs="Arial"/>
+          <w:b w:val="0"/>
           <w:sz w:val="24"/>
         </w:rPr>
         <w:t>המערכת נבנתה כפרויקט רשתות וסייבר ולכן היא מדגישה תקשורת בין לקוח לשרת, שימוש בסוקטים, תהליכונים, הצפנה, שמירת נתונים, ממשק משתמש גרפי וניתוח חולשות אבטחה.</w:t>
@@ -479,6 +637,7 @@
       <w:r>
         <w:rPr>
           <w:rFonts w:ascii="Arial" w:hAnsi="Arial" w:cs="Arial"/>
+          <w:b/>
           <w:sz w:val="28"/>
         </w:rPr>
         <w:t>מטרת הפרויקט</w:t>
@@ -493,6 +652,7 @@
       <w:r>
         <w:rPr>
           <w:rFonts w:ascii="Arial" w:hAnsi="Arial" w:cs="Arial"/>
+          <w:b w:val="0"/>
           <w:sz w:val="24"/>
         </w:rPr>
         <w:t>מטרת הפרויקט היא לפתח מערכת תקשורת אמיתית המדמה שירות צ'אט מודרני, תוך שימוש בעקרונות שנלמדו ברשתות, מערכות הפעלה ואבטחת מידע. המערכת צריכה להראות יכולת העברת מידע מקצה לקצה בין כמה לקוחות במקביל, בצורה מוצפנת ובטוחה יותר ממימוש בסיסי.</w:t>
@@ -508,6 +668,7 @@
       <w:r>
         <w:rPr>
           <w:rFonts w:ascii="Arial" w:hAnsi="Arial" w:cs="Arial"/>
+          <w:b/>
           <w:sz w:val="28"/>
         </w:rPr>
         <w:t>הצורך במערכת</w:t>
@@ -522,6 +683,7 @@
       <w:r>
         <w:rPr>
           <w:rFonts w:ascii="Arial" w:hAnsi="Arial" w:cs="Arial"/>
+          <w:b w:val="0"/>
           <w:sz w:val="24"/>
         </w:rPr>
         <w:t>במערכות צ'אט רגילות מועבר מידע אישי בין משתמשים. מידע כזה יכול לכלול הודעות פרטיות, קבצים, תמונות וסרטונים. לכן חשוב להגן על המידע בזמן מעבר ברשת, למנוע גישה לא מורשית, למנוע קריסות של השרת ולשמור נתונים בצורה מסודרת.</w:t>
@@ -537,6 +699,7 @@
       <w:r>
         <w:rPr>
           <w:rFonts w:ascii="Arial" w:hAnsi="Arial" w:cs="Arial"/>
+          <w:b/>
           <w:sz w:val="28"/>
         </w:rPr>
         <w:t>קהל יעד</w:t>
@@ -551,6 +714,7 @@
       <w:r>
         <w:rPr>
           <w:rFonts w:ascii="Arial" w:hAnsi="Arial" w:cs="Arial"/>
+          <w:b w:val="0"/>
           <w:sz w:val="24"/>
         </w:rPr>
         <w:t>המערכת מיועדת לקבוצת משתמשים קטנה או בינונית, לדוגמה תלמידי כיתה, צוות עבודה או קבוצת חברים שרוצים לתקשר בתוך רשת מקומית או סביבת הדגמה.</w:t>
@@ -566,6 +730,7 @@
       <w:r>
         <w:rPr>
           <w:rFonts w:ascii="Arial" w:hAnsi="Arial" w:cs="Arial"/>
+          <w:b/>
           <w:sz w:val="28"/>
         </w:rPr>
         <w:t>גבולות הפרויקט</w:t>
@@ -580,6 +745,7 @@
       <w:r>
         <w:rPr>
           <w:rFonts w:ascii="Arial" w:hAnsi="Arial" w:cs="Arial"/>
+          <w:b w:val="0"/>
           <w:sz w:val="24"/>
         </w:rPr>
         <w:t>הפרויקט אינו מוצר מסחרי מלא. הוא מיועד להדגמת יכולות תכנות, רשתות וסייבר. לכן חלק מהיכולות הן גרסאות לימודיות, לדוגמה קוד 2FA שמוצג בתוך המערכת ולא נשלח באמת לטלפון.</w:t>
@@ -594,6 +760,7 @@
       <w:r>
         <w:rPr>
           <w:rFonts w:ascii="Arial" w:hAnsi="Arial" w:cs="Arial"/>
+          <w:b w:val="0"/>
           <w:sz w:val="24"/>
         </w:rPr>
         <w:t>????????????????????????</w:t>
@@ -609,6 +776,7 @@
       <w:r>
         <w:rPr>
           <w:rFonts w:ascii="Arial" w:hAnsi="Arial" w:cs="Arial"/>
+          <w:b/>
           <w:sz w:val="32"/>
         </w:rPr>
         <w:t>2. אפיון המערכת</w:t>
@@ -624,6 +792,7 @@
       <w:r>
         <w:rPr>
           <w:rFonts w:ascii="Arial" w:hAnsi="Arial" w:cs="Arial"/>
+          <w:b/>
           <w:sz w:val="28"/>
         </w:rPr>
         <w:t>משתמשים במערכת</w:t>
@@ -638,6 +807,7 @@
       <w:r>
         <w:rPr>
           <w:rFonts w:ascii="Arial" w:hAnsi="Arial" w:cs="Arial"/>
+          <w:b w:val="0"/>
           <w:sz w:val="24"/>
         </w:rPr>
         <w:t>1. משתמש רגיל</w:t>
@@ -651,6 +821,7 @@
       <w:r>
         <w:rPr>
           <w:rFonts w:ascii="Arial" w:hAnsi="Arial" w:cs="Arial"/>
+          <w:b w:val="0"/>
           <w:sz w:val="24"/>
         </w:rPr>
         <w:t xml:space="preserve">   יכול להירשם, להתחבר, לשלוח הודעות, להצטרף לחדרים, ליצור חדרים, לשלוח קבצים, להשתמש בפקודות מתקדמות ולראות משתמשים מחוברים.</w:t>
@@ -665,6 +836,7 @@
       <w:r>
         <w:rPr>
           <w:rFonts w:ascii="Arial" w:hAnsi="Arial" w:cs="Arial"/>
+          <w:b w:val="0"/>
           <w:sz w:val="24"/>
         </w:rPr>
         <w:t>2. מנהל מערכת</w:t>
@@ -678,6 +850,7 @@
       <w:r>
         <w:rPr>
           <w:rFonts w:ascii="Arial" w:hAnsi="Arial" w:cs="Arial"/>
+          <w:b w:val="0"/>
           <w:sz w:val="24"/>
         </w:rPr>
         <w:t xml:space="preserve">   המשתמש הראשון שנרשם למערכת מוגדר כמנהל. בנוסף, משתמש בשם admin מוגדר כמנהל. מנהל יכול לצפות בלוגים בסיסיים ולבעוט משתמש מחובר באמצעות פקודת מנהל.</w:t>
@@ -693,6 +866,7 @@
       <w:r>
         <w:rPr>
           <w:rFonts w:ascii="Arial" w:hAnsi="Arial" w:cs="Arial"/>
+          <w:b/>
           <w:sz w:val="28"/>
         </w:rPr>
         <w:t>יכולות מרכזיות</w:t>
@@ -707,6 +881,7 @@
       <w:r>
         <w:rPr>
           <w:rFonts w:ascii="Arial" w:hAnsi="Arial" w:cs="Arial"/>
+          <w:b w:val="0"/>
           <w:sz w:val="24"/>
         </w:rPr>
         <w:t>1. הרשמה והתחברות עם שם משתמש וסיסמה.</w:t>
@@ -720,6 +895,7 @@
       <w:r>
         <w:rPr>
           <w:rFonts w:ascii="Arial" w:hAnsi="Arial" w:cs="Arial"/>
+          <w:b w:val="0"/>
           <w:sz w:val="24"/>
         </w:rPr>
         <w:t>2. שמירת סיסמאות כ-hash עם salt ולא כטקסט גלוי.</w:t>
@@ -733,6 +909,7 @@
       <w:r>
         <w:rPr>
           <w:rFonts w:ascii="Arial" w:hAnsi="Arial" w:cs="Arial"/>
+          <w:b w:val="0"/>
           <w:sz w:val="24"/>
         </w:rPr>
         <w:t>3. תקשורת מוצפנת בין לקוח לשרת באמצעות TLS.</w:t>
@@ -746,6 +923,7 @@
       <w:r>
         <w:rPr>
           <w:rFonts w:ascii="Arial" w:hAnsi="Arial" w:cs="Arial"/>
+          <w:b w:val="0"/>
           <w:sz w:val="24"/>
         </w:rPr>
         <w:t>4. שרת מרובה לקוחות המבוסס על Thread לכל לקוח.</w:t>
@@ -759,6 +937,7 @@
       <w:r>
         <w:rPr>
           <w:rFonts w:ascii="Arial" w:hAnsi="Arial" w:cs="Arial"/>
+          <w:b w:val="0"/>
           <w:sz w:val="24"/>
         </w:rPr>
         <w:t>5. פרוטוקול הודעות עצמאי המבוסס על JSON עם כותרת אורך.</w:t>
@@ -772,6 +951,7 @@
       <w:r>
         <w:rPr>
           <w:rFonts w:ascii="Arial" w:hAnsi="Arial" w:cs="Arial"/>
+          <w:b w:val="0"/>
           <w:sz w:val="24"/>
         </w:rPr>
         <w:t>6. חדרי צ'אט, כולל יצירת חדרים חדשים.</w:t>
@@ -785,6 +965,7 @@
       <w:r>
         <w:rPr>
           <w:rFonts w:ascii="Arial" w:hAnsi="Arial" w:cs="Arial"/>
+          <w:b w:val="0"/>
           <w:sz w:val="24"/>
         </w:rPr>
         <w:t>7. חדרים עם סיסמה בפורמט room:password.</w:t>
@@ -798,6 +979,7 @@
       <w:r>
         <w:rPr>
           <w:rFonts w:ascii="Arial" w:hAnsi="Arial" w:cs="Arial"/>
+          <w:b w:val="0"/>
           <w:sz w:val="24"/>
         </w:rPr>
         <w:t>8. שליחת הודעות טקסט ואימוג'ים.</w:t>
@@ -811,6 +993,7 @@
       <w:r>
         <w:rPr>
           <w:rFonts w:ascii="Arial" w:hAnsi="Arial" w:cs="Arial"/>
+          <w:b w:val="0"/>
           <w:sz w:val="24"/>
         </w:rPr>
         <w:t>9. שליחת קבצים, תמונות וסרטונים.</w:t>
@@ -824,6 +1007,7 @@
       <w:r>
         <w:rPr>
           <w:rFonts w:ascii="Arial" w:hAnsi="Arial" w:cs="Arial"/>
+          <w:b w:val="0"/>
           <w:sz w:val="24"/>
         </w:rPr>
         <w:t>10. הצגת תמונות ישירות במסך הצ'אט.</w:t>
@@ -837,6 +1021,7 @@
       <w:r>
         <w:rPr>
           <w:rFonts w:ascii="Arial" w:hAnsi="Arial" w:cs="Arial"/>
+          <w:b w:val="0"/>
           <w:sz w:val="24"/>
         </w:rPr>
         <w:t>11. קישורים לחיצים לפתיחת קבצים וסרטונים.</w:t>
@@ -850,6 +1035,7 @@
       <w:r>
         <w:rPr>
           <w:rFonts w:ascii="Arial" w:hAnsi="Arial" w:cs="Arial"/>
+          <w:b w:val="0"/>
           <w:sz w:val="24"/>
         </w:rPr>
         <w:t>12. הודעות פרטיות באמצעות /dm.</w:t>
@@ -863,6 +1049,7 @@
       <w:r>
         <w:rPr>
           <w:rFonts w:ascii="Arial" w:hAnsi="Arial" w:cs="Arial"/>
+          <w:b w:val="0"/>
           <w:sz w:val="24"/>
         </w:rPr>
         <w:t>13. פרופיל משתמש באמצעות /profile.</w:t>
@@ -876,6 +1063,7 @@
       <w:r>
         <w:rPr>
           <w:rFonts w:ascii="Arial" w:hAnsi="Arial" w:cs="Arial"/>
+          <w:b w:val="0"/>
           <w:sz w:val="24"/>
         </w:rPr>
         <w:t>14. חיפוש הודעות באמצעות /search.</w:t>
@@ -889,6 +1077,7 @@
       <w:r>
         <w:rPr>
           <w:rFonts w:ascii="Arial" w:hAnsi="Arial" w:cs="Arial"/>
+          <w:b w:val="0"/>
           <w:sz w:val="24"/>
         </w:rPr>
         <w:t>15. חיווי הקלדה.</w:t>
@@ -902,6 +1091,7 @@
       <w:r>
         <w:rPr>
           <w:rFonts w:ascii="Arial" w:hAnsi="Arial" w:cs="Arial"/>
+          <w:b w:val="0"/>
           <w:sz w:val="24"/>
         </w:rPr>
         <w:t>16. אישורי קריאה כהודעות מערכת.</w:t>
@@ -915,6 +1105,7 @@
       <w:r>
         <w:rPr>
           <w:rFonts w:ascii="Arial" w:hAnsi="Arial" w:cs="Arial"/>
+          <w:b w:val="0"/>
           <w:sz w:val="24"/>
         </w:rPr>
         <w:t>17. בקשות חברות ורשימת חברים.</w:t>
@@ -928,6 +1119,7 @@
       <w:r>
         <w:rPr>
           <w:rFonts w:ascii="Arial" w:hAnsi="Arial" w:cs="Arial"/>
+          <w:b w:val="0"/>
           <w:sz w:val="24"/>
         </w:rPr>
         <w:t>18. גלריית תמונות לחדר.</w:t>
@@ -941,6 +1133,7 @@
       <w:r>
         <w:rPr>
           <w:rFonts w:ascii="Arial" w:hAnsi="Arial" w:cs="Arial"/>
+          <w:b w:val="0"/>
           <w:sz w:val="24"/>
         </w:rPr>
         <w:t>19. עריכה ומחיקה של הודעות לפי מזהה.</w:t>
@@ -954,6 +1147,7 @@
       <w:r>
         <w:rPr>
           <w:rFonts w:ascii="Arial" w:hAnsi="Arial" w:cs="Arial"/>
+          <w:b w:val="0"/>
           <w:sz w:val="24"/>
         </w:rPr>
         <w:t>20. פאנל אבטחה בסיסי דרך /admin logs.</w:t>
@@ -967,6 +1161,7 @@
       <w:r>
         <w:rPr>
           <w:rFonts w:ascii="Arial" w:hAnsi="Arial" w:cs="Arial"/>
+          <w:b w:val="0"/>
           <w:sz w:val="24"/>
         </w:rPr>
         <w:t>21. קוד 2FA לימודי דרך /2fa.</w:t>
@@ -982,6 +1177,7 @@
       <w:r>
         <w:rPr>
           <w:rFonts w:ascii="Arial" w:hAnsi="Arial" w:cs="Arial"/>
+          <w:b/>
           <w:sz w:val="28"/>
         </w:rPr>
         <w:t>דרישות פונקציונליות</w:t>
@@ -996,6 +1192,7 @@
       <w:r>
         <w:rPr>
           <w:rFonts w:ascii="Arial" w:hAnsi="Arial" w:cs="Arial"/>
+          <w:b w:val="0"/>
           <w:sz w:val="24"/>
         </w:rPr>
         <w:t>1. המערכת תאפשר למשתמש חדש להירשם.</w:t>
@@ -1009,6 +1206,7 @@
       <w:r>
         <w:rPr>
           <w:rFonts w:ascii="Arial" w:hAnsi="Arial" w:cs="Arial"/>
+          <w:b w:val="0"/>
           <w:sz w:val="24"/>
         </w:rPr>
         <w:t>2. המערכת תאפשר למשתמש קיים להתחבר.</w:t>
@@ -1022,6 +1220,7 @@
       <w:r>
         <w:rPr>
           <w:rFonts w:ascii="Arial" w:hAnsi="Arial" w:cs="Arial"/>
+          <w:b w:val="0"/>
           <w:sz w:val="24"/>
         </w:rPr>
         <w:t>3. המערכת תציג הודעת הצלחה או כישלון בעת הרשמה והתחברות.</w:t>
@@ -1035,6 +1234,7 @@
       <w:r>
         <w:rPr>
           <w:rFonts w:ascii="Arial" w:hAnsi="Arial" w:cs="Arial"/>
+          <w:b w:val="0"/>
           <w:sz w:val="24"/>
         </w:rPr>
         <w:t>4. רק משתמש מחובר יוכל להיכנס למסך הצ'אט.</w:t>
@@ -1048,6 +1248,7 @@
       <w:r>
         <w:rPr>
           <w:rFonts w:ascii="Arial" w:hAnsi="Arial" w:cs="Arial"/>
+          <w:b w:val="0"/>
           <w:sz w:val="24"/>
         </w:rPr>
         <w:t>5. השרת יוכל לטפל בכמה לקוחות בו זמנית.</w:t>
@@ -1061,6 +1262,7 @@
       <w:r>
         <w:rPr>
           <w:rFonts w:ascii="Arial" w:hAnsi="Arial" w:cs="Arial"/>
+          <w:b w:val="0"/>
           <w:sz w:val="24"/>
         </w:rPr>
         <w:t>6. משתמש יוכל לשלוח הודעה לכל החברים בחדר.</w:t>
@@ -1074,6 +1276,7 @@
       <w:r>
         <w:rPr>
           <w:rFonts w:ascii="Arial" w:hAnsi="Arial" w:cs="Arial"/>
+          <w:b w:val="0"/>
           <w:sz w:val="24"/>
         </w:rPr>
         <w:t>7. משתמש יוכל ליצור חדר חדש.</w:t>
@@ -1087,6 +1290,7 @@
       <w:r>
         <w:rPr>
           <w:rFonts w:ascii="Arial" w:hAnsi="Arial" w:cs="Arial"/>
+          <w:b w:val="0"/>
           <w:sz w:val="24"/>
         </w:rPr>
         <w:t>8. משתמש יוכל להצטרף לחדר קיים.</w:t>
@@ -1100,6 +1304,7 @@
       <w:r>
         <w:rPr>
           <w:rFonts w:ascii="Arial" w:hAnsi="Arial" w:cs="Arial"/>
+          <w:b w:val="0"/>
           <w:sz w:val="24"/>
         </w:rPr>
         <w:t>9. משתמש יוכל לשלוח קובץ, תמונה או סרטון.</w:t>
@@ -1113,6 +1318,7 @@
       <w:r>
         <w:rPr>
           <w:rFonts w:ascii="Arial" w:hAnsi="Arial" w:cs="Arial"/>
+          <w:b w:val="0"/>
           <w:sz w:val="24"/>
         </w:rPr>
         <w:t>10. משתמש יוכל לפתוח קובץ שהתקבל מתוך הצ'אט.</w:t>
@@ -1128,6 +1334,7 @@
       <w:r>
         <w:rPr>
           <w:rFonts w:ascii="Arial" w:hAnsi="Arial" w:cs="Arial"/>
+          <w:b/>
           <w:sz w:val="28"/>
         </w:rPr>
         <w:t>דרישות לא פונקציונליות</w:t>
@@ -1142,6 +1349,7 @@
       <w:r>
         <w:rPr>
           <w:rFonts w:ascii="Arial" w:hAnsi="Arial" w:cs="Arial"/>
+          <w:b w:val="0"/>
           <w:sz w:val="24"/>
         </w:rPr>
         <w:t>1. השרת לא יקרוס כאשר לקוח מתנתק.</w:t>
@@ -1155,6 +1363,7 @@
       <w:r>
         <w:rPr>
           <w:rFonts w:ascii="Arial" w:hAnsi="Arial" w:cs="Arial"/>
+          <w:b w:val="0"/>
           <w:sz w:val="24"/>
         </w:rPr>
         <w:t>2. השרת יבדוק קלטים בעייתיים.</w:t>
@@ -1168,6 +1377,7 @@
       <w:r>
         <w:rPr>
           <w:rFonts w:ascii="Arial" w:hAnsi="Arial" w:cs="Arial"/>
+          <w:b w:val="0"/>
           <w:sz w:val="24"/>
         </w:rPr>
         <w:t>3. המערכת תגביל גודל הודעות וקבצים.</w:t>
@@ -1181,6 +1391,7 @@
       <w:r>
         <w:rPr>
           <w:rFonts w:ascii="Arial" w:hAnsi="Arial" w:cs="Arial"/>
+          <w:b w:val="0"/>
           <w:sz w:val="24"/>
         </w:rPr>
         <w:t>4. המידע הרגיש יעבור בתקשורת מוצפנת.</w:t>
@@ -1194,6 +1405,7 @@
       <w:r>
         <w:rPr>
           <w:rFonts w:ascii="Arial" w:hAnsi="Arial" w:cs="Arial"/>
+          <w:b w:val="0"/>
           <w:sz w:val="24"/>
         </w:rPr>
         <w:t>5. הקוד יחולק למחלקות וקבצים בצורה ברורה.</w:t>
@@ -1207,6 +1419,7 @@
       <w:r>
         <w:rPr>
           <w:rFonts w:ascii="Arial" w:hAnsi="Arial" w:cs="Arial"/>
+          <w:b w:val="0"/>
           <w:sz w:val="24"/>
         </w:rPr>
         <w:t>6. הממשק יהיה אינטראקטיבי ונוח להדגמה.</w:t>
@@ -1221,6 +1434,7 @@
       <w:r>
         <w:rPr>
           <w:rFonts w:ascii="Arial" w:hAnsi="Arial" w:cs="Arial"/>
+          <w:b w:val="0"/>
           <w:sz w:val="24"/>
         </w:rPr>
         <w:t>????????????????????????</w:t>
@@ -1236,6 +1450,7 @@
       <w:r>
         <w:rPr>
           <w:rFonts w:ascii="Arial" w:hAnsi="Arial" w:cs="Arial"/>
+          <w:b/>
           <w:sz w:val="32"/>
         </w:rPr>
         <w:t>3. לוח זמנים</w:t>
@@ -1250,6 +1465,7 @@
       <w:r>
         <w:rPr>
           <w:rFonts w:ascii="Arial" w:hAnsi="Arial" w:cs="Arial"/>
+          <w:b w:val="0"/>
           <w:sz w:val="24"/>
         </w:rPr>
         <w:t>1. שלב רעיון ואפיון</w:t>
@@ -1263,6 +1479,7 @@
       <w:r>
         <w:rPr>
           <w:rFonts w:ascii="Arial" w:hAnsi="Arial" w:cs="Arial"/>
+          <w:b w:val="0"/>
           <w:sz w:val="24"/>
         </w:rPr>
         <w:t xml:space="preserve">   בחירת נושא הצ'אט המאובטח, הגדרת משתמשים, הגדרת יכולות חובה ותכנון כללי של המערכת.</w:t>
@@ -1277,6 +1494,7 @@
       <w:r>
         <w:rPr>
           <w:rFonts w:ascii="Arial" w:hAnsi="Arial" w:cs="Arial"/>
+          <w:b w:val="0"/>
           <w:sz w:val="24"/>
         </w:rPr>
         <w:t>2. שלב תכנון ארכיטקטורה</w:t>
@@ -1290,6 +1508,7 @@
       <w:r>
         <w:rPr>
           <w:rFonts w:ascii="Arial" w:hAnsi="Arial" w:cs="Arial"/>
+          <w:b w:val="0"/>
           <w:sz w:val="24"/>
         </w:rPr>
         <w:t xml:space="preserve">   החלטה על שרת מרכזי, לקוחות גרפיים, בסיס נתונים SQLite, פרוטוקול JSON והצפנת TLS.</w:t>
@@ -1304,6 +1523,7 @@
       <w:r>
         <w:rPr>
           <w:rFonts w:ascii="Arial" w:hAnsi="Arial" w:cs="Arial"/>
+          <w:b w:val="0"/>
           <w:sz w:val="24"/>
         </w:rPr>
         <w:t>3. שלב מימוש בסיסי</w:t>
@@ -1317,6 +1537,7 @@
       <w:r>
         <w:rPr>
           <w:rFonts w:ascii="Arial" w:hAnsi="Arial" w:cs="Arial"/>
+          <w:b w:val="0"/>
           <w:sz w:val="24"/>
         </w:rPr>
         <w:t xml:space="preserve">   בניית שרת סוקטים, לקוח Tkinter, הרשמה, התחברות ושליחת הודעות.</w:t>
@@ -1331,6 +1552,7 @@
       <w:r>
         <w:rPr>
           <w:rFonts w:ascii="Arial" w:hAnsi="Arial" w:cs="Arial"/>
+          <w:b w:val="0"/>
           <w:sz w:val="24"/>
         </w:rPr>
         <w:t>4. שלב אבטחה</w:t>
@@ -1344,6 +1566,7 @@
       <w:r>
         <w:rPr>
           <w:rFonts w:ascii="Arial" w:hAnsi="Arial" w:cs="Arial"/>
+          <w:b w:val="0"/>
           <w:sz w:val="24"/>
         </w:rPr>
         <w:t xml:space="preserve">   הוספת TLS, hashing לסיסמאות, בדיקות קלט והגבלות גודל.</w:t>
@@ -1358,6 +1581,7 @@
       <w:r>
         <w:rPr>
           <w:rFonts w:ascii="Arial" w:hAnsi="Arial" w:cs="Arial"/>
+          <w:b w:val="0"/>
           <w:sz w:val="24"/>
         </w:rPr>
         <w:t>5. שלב יכולות מתקדמות</w:t>
@@ -1371,6 +1595,7 @@
       <w:r>
         <w:rPr>
           <w:rFonts w:ascii="Arial" w:hAnsi="Arial" w:cs="Arial"/>
+          <w:b w:val="0"/>
           <w:sz w:val="24"/>
         </w:rPr>
         <w:t xml:space="preserve">   הוספת חדרים, קבצים, תמונות, סרטונים, הודעות פרטיות, חיפוש, חברים ופאנל מנהל.</w:t>
@@ -1385,6 +1610,7 @@
       <w:r>
         <w:rPr>
           <w:rFonts w:ascii="Arial" w:hAnsi="Arial" w:cs="Arial"/>
+          <w:b w:val="0"/>
           <w:sz w:val="24"/>
         </w:rPr>
         <w:t>6. שלב בדיקות</w:t>
@@ -1398,6 +1624,7 @@
       <w:r>
         <w:rPr>
           <w:rFonts w:ascii="Arial" w:hAnsi="Arial" w:cs="Arial"/>
+          <w:b w:val="0"/>
           <w:sz w:val="24"/>
         </w:rPr>
         <w:t xml:space="preserve">   הרצת כמה לקוחות במקביל, בדיקת הרשמה, התחברות, הודעות, קבצים וחדרים.</w:t>
@@ -1412,6 +1639,7 @@
       <w:r>
         <w:rPr>
           <w:rFonts w:ascii="Arial" w:hAnsi="Arial" w:cs="Arial"/>
+          <w:b w:val="0"/>
           <w:sz w:val="24"/>
         </w:rPr>
         <w:t>7. שלב תיעוד</w:t>
@@ -1425,6 +1653,7 @@
       <w:r>
         <w:rPr>
           <w:rFonts w:ascii="Arial" w:hAnsi="Arial" w:cs="Arial"/>
+          <w:b w:val="0"/>
           <w:sz w:val="24"/>
         </w:rPr>
         <w:t xml:space="preserve">   כתיבת ספר הפרויקט, מדריך משתמש, בדיקות וסיכום אישי.</w:t>
@@ -1439,6 +1668,7 @@
       <w:r>
         <w:rPr>
           <w:rFonts w:ascii="Arial" w:hAnsi="Arial" w:cs="Arial"/>
+          <w:b w:val="0"/>
           <w:sz w:val="24"/>
         </w:rPr>
         <w:t>????????????????????????</w:t>
@@ -1454,6 +1684,7 @@
       <w:r>
         <w:rPr>
           <w:rFonts w:ascii="Arial" w:hAnsi="Arial" w:cs="Arial"/>
+          <w:b/>
           <w:sz w:val="32"/>
         </w:rPr>
         <w:t>4. ניהול סיכונים</w:t>
@@ -1468,6 +1699,7 @@
       <w:r>
         <w:rPr>
           <w:rFonts w:ascii="Arial" w:hAnsi="Arial" w:cs="Arial"/>
+          <w:b w:val="0"/>
           <w:sz w:val="24"/>
         </w:rPr>
         <w:t>1. סיכון: השרת קורס כאשר לקוח מתנתק בפתאומיות.</w:t>
@@ -1481,6 +1713,7 @@
       <w:r>
         <w:rPr>
           <w:rFonts w:ascii="Arial" w:hAnsi="Arial" w:cs="Arial"/>
+          <w:b w:val="0"/>
           <w:sz w:val="24"/>
         </w:rPr>
         <w:t xml:space="preserve">   פתרון: שימוש ב-try/except וסגירת חיבור בצורה מבוקרת.</w:t>
@@ -1495,6 +1728,7 @@
       <w:r>
         <w:rPr>
           <w:rFonts w:ascii="Arial" w:hAnsi="Arial" w:cs="Arial"/>
+          <w:b w:val="0"/>
           <w:sz w:val="24"/>
         </w:rPr>
         <w:t>2. סיכון: משתמש שולח הודעה גדולה מדי.</w:t>
@@ -1508,6 +1742,7 @@
       <w:r>
         <w:rPr>
           <w:rFonts w:ascii="Arial" w:hAnsi="Arial" w:cs="Arial"/>
+          <w:b w:val="0"/>
           <w:sz w:val="24"/>
         </w:rPr>
         <w:t xml:space="preserve">   פתרון: הגבלת גודל packet וגודל הודעה.</w:t>
@@ -1522,6 +1757,7 @@
       <w:r>
         <w:rPr>
           <w:rFonts w:ascii="Arial" w:hAnsi="Arial" w:cs="Arial"/>
+          <w:b w:val="0"/>
           <w:sz w:val="24"/>
         </w:rPr>
         <w:t>3. סיכון: משתמש שולח קובץ גדול מדי.</w:t>
@@ -1535,6 +1771,7 @@
       <w:r>
         <w:rPr>
           <w:rFonts w:ascii="Arial" w:hAnsi="Arial" w:cs="Arial"/>
+          <w:b w:val="0"/>
           <w:sz w:val="24"/>
         </w:rPr>
         <w:t xml:space="preserve">   פתרון: הגבלת גודל קובץ בקבוע MAX_FILE_SIZE.</w:t>
@@ -1549,6 +1786,7 @@
       <w:r>
         <w:rPr>
           <w:rFonts w:ascii="Arial" w:hAnsi="Arial" w:cs="Arial"/>
+          <w:b w:val="0"/>
           <w:sz w:val="24"/>
         </w:rPr>
         <w:t>4. סיכון: SQL Injection.</w:t>
@@ -1562,6 +1800,7 @@
       <w:r>
         <w:rPr>
           <w:rFonts w:ascii="Arial" w:hAnsi="Arial" w:cs="Arial"/>
+          <w:b w:val="0"/>
           <w:sz w:val="24"/>
         </w:rPr>
         <w:t xml:space="preserve">   פתרון: שימוש בשאילתות עם פרמטרים במקום חיבור מחרוזות SQL.</w:t>
@@ -1576,6 +1815,7 @@
       <w:r>
         <w:rPr>
           <w:rFonts w:ascii="Arial" w:hAnsi="Arial" w:cs="Arial"/>
+          <w:b w:val="0"/>
           <w:sz w:val="24"/>
         </w:rPr>
         <w:t>5. סיכון: שמירת סיסמאות כטקסט גלוי.</w:t>
@@ -1589,6 +1829,7 @@
       <w:r>
         <w:rPr>
           <w:rFonts w:ascii="Arial" w:hAnsi="Arial" w:cs="Arial"/>
+          <w:b w:val="0"/>
           <w:sz w:val="24"/>
         </w:rPr>
         <w:t xml:space="preserve">   פתרון: שמירת סיסמאות באמצעות PBKDF2 עם salt.</w:t>
@@ -1603,6 +1844,7 @@
       <w:r>
         <w:rPr>
           <w:rFonts w:ascii="Arial" w:hAnsi="Arial" w:cs="Arial"/>
+          <w:b w:val="0"/>
           <w:sz w:val="24"/>
         </w:rPr>
         <w:t>6. סיכון: האזנה לתעבורה ברשת.</w:t>
@@ -1616,6 +1858,7 @@
       <w:r>
         <w:rPr>
           <w:rFonts w:ascii="Arial" w:hAnsi="Arial" w:cs="Arial"/>
+          <w:b w:val="0"/>
           <w:sz w:val="24"/>
         </w:rPr>
         <w:t xml:space="preserve">   פתרון: שימוש ב-TLS להצפנת התקשורת.</w:t>
@@ -1630,6 +1873,7 @@
       <w:r>
         <w:rPr>
           <w:rFonts w:ascii="Arial" w:hAnsi="Arial" w:cs="Arial"/>
+          <w:b w:val="0"/>
           <w:sz w:val="24"/>
         </w:rPr>
         <w:t>7. סיכון: שם קובץ מסוכן עם נתיב כמו ../.</w:t>
@@ -1643,6 +1887,7 @@
       <w:r>
         <w:rPr>
           <w:rFonts w:ascii="Arial" w:hAnsi="Arial" w:cs="Arial"/>
+          <w:b w:val="0"/>
           <w:sz w:val="24"/>
         </w:rPr>
         <w:t xml:space="preserve">   פתרון: ניקוי שם הקובץ והחלפת תווי נתיב.</w:t>
@@ -1657,6 +1902,7 @@
       <w:r>
         <w:rPr>
           <w:rFonts w:ascii="Arial" w:hAnsi="Arial" w:cs="Arial"/>
+          <w:b w:val="0"/>
           <w:sz w:val="24"/>
         </w:rPr>
         <w:t>8. סיכון: עומס בגלל לקוחות מרובים.</w:t>
@@ -1670,6 +1916,7 @@
       <w:r>
         <w:rPr>
           <w:rFonts w:ascii="Arial" w:hAnsi="Arial" w:cs="Arial"/>
+          <w:b w:val="0"/>
           <w:sz w:val="24"/>
         </w:rPr>
         <w:t xml:space="preserve">   פתרון: כל לקוח מטופל בתהליכון נפרד.</w:t>
@@ -1684,6 +1931,7 @@
       <w:r>
         <w:rPr>
           <w:rFonts w:ascii="Arial" w:hAnsi="Arial" w:cs="Arial"/>
+          <w:b w:val="0"/>
           <w:sz w:val="24"/>
         </w:rPr>
         <w:t>????????????????????????</w:t>
@@ -1699,6 +1947,7 @@
       <w:r>
         <w:rPr>
           <w:rFonts w:ascii="Arial" w:hAnsi="Arial" w:cs="Arial"/>
+          <w:b/>
           <w:sz w:val="32"/>
         </w:rPr>
         <w:t>5. תיאור תחום הידע</w:t>
@@ -1714,6 +1963,7 @@
       <w:r>
         <w:rPr>
           <w:rFonts w:ascii="Arial" w:hAnsi="Arial" w:cs="Arial"/>
+          <w:b/>
           <w:sz w:val="28"/>
         </w:rPr>
         <w:t>רשתות תקשורת</w:t>
@@ -1728,6 +1978,7 @@
       <w:r>
         <w:rPr>
           <w:rFonts w:ascii="Arial" w:hAnsi="Arial" w:cs="Arial"/>
+          <w:b w:val="0"/>
           <w:sz w:val="24"/>
         </w:rPr>
         <w:t>המערכת משתמשת בתקשורת TCP. TCP מתאים לפרויקט כי הוא מספק העברה אמינה של מידע. בצ'אט חשוב שהודעה תגיע בשלמותה ובסדר נכון, ולכן TCP מתאים יותר מ-UDP.</w:t>
@@ -1742,6 +1993,7 @@
       <w:r>
         <w:rPr>
           <w:rFonts w:ascii="Arial" w:hAnsi="Arial" w:cs="Arial"/>
+          <w:b w:val="0"/>
           <w:sz w:val="24"/>
         </w:rPr>
         <w:t>הלקוח מתחבר לכתובת IP ול-port של השרת. ברירת המחדל היא 127.0.0.1:5050, כלומר ריצה מקומית על אותו מחשב. ניתן לשנות את הכתובת כדי להריץ את המערכת ברשת מקומית.</w:t>
@@ -1757,6 +2009,7 @@
       <w:r>
         <w:rPr>
           <w:rFonts w:ascii="Arial" w:hAnsi="Arial" w:cs="Arial"/>
+          <w:b/>
           <w:sz w:val="28"/>
         </w:rPr>
         <w:t>מודל לקוח-שרת</w:t>
@@ -1771,6 +2024,7 @@
       <w:r>
         <w:rPr>
           <w:rFonts w:ascii="Arial" w:hAnsi="Arial" w:cs="Arial"/>
+          <w:b w:val="0"/>
           <w:sz w:val="24"/>
         </w:rPr>
         <w:t>השרת הוא רכיב מרכזי שמקבל חיבורים מכל הלקוחות. כל לקוח שולח בקשות לשרת, והשרת מחליט למי להעביר את המידע. לדוגמה, כאשר משתמש שולח הודעה בחדר, השרת שולח אותה לכל המשתמשים שנמצאים באותו חדר.</w:t>
@@ -1786,6 +2040,7 @@
       <w:r>
         <w:rPr>
           <w:rFonts w:ascii="Arial" w:hAnsi="Arial" w:cs="Arial"/>
+          <w:b/>
           <w:sz w:val="28"/>
         </w:rPr>
         <w:t>סוקטים</w:t>
@@ -1800,6 +2055,7 @@
       <w:r>
         <w:rPr>
           <w:rFonts w:ascii="Arial" w:hAnsi="Arial" w:cs="Arial"/>
+          <w:b w:val="0"/>
           <w:sz w:val="24"/>
         </w:rPr>
         <w:t>Socket הוא נקודת קצה לתקשורת ברשת. בפרויקט יש socket בצד השרת שמאזין לחיבורים, ו-socket בצד הלקוח שמתחבר לשרת.</w:t>
@@ -1815,6 +2071,7 @@
       <w:r>
         <w:rPr>
           <w:rFonts w:ascii="Arial" w:hAnsi="Arial" w:cs="Arial"/>
+          <w:b/>
           <w:sz w:val="28"/>
         </w:rPr>
         <w:t>Thread</w:t>
@@ -1829,6 +2086,7 @@
       <w:r>
         <w:rPr>
           <w:rFonts w:ascii="Arial" w:hAnsi="Arial" w:cs="Arial"/>
+          <w:b w:val="0"/>
           <w:sz w:val="24"/>
         </w:rPr>
         <w:t>Thread הוא תהליכון שמאפשר להריץ כמה משימות במקביל בתוך אותו תהליך. בפרויקט השרת יוצר Thread לכל לקוח. כך לקוח אחד לא חוסם לקוחות אחרים.</w:t>
@@ -1844,6 +2102,7 @@
       <w:r>
         <w:rPr>
           <w:rFonts w:ascii="Arial" w:hAnsi="Arial" w:cs="Arial"/>
+          <w:b/>
           <w:sz w:val="28"/>
         </w:rPr>
         <w:t>הצפנה</w:t>
@@ -1858,6 +2117,7 @@
       <w:r>
         <w:rPr>
           <w:rFonts w:ascii="Arial" w:hAnsi="Arial" w:cs="Arial"/>
+          <w:b w:val="0"/>
           <w:sz w:val="24"/>
         </w:rPr>
         <w:t>המערכת משתמשת ב-TLS כדי להצפין את התעבורה בין הלקוח לשרת. בנוסף, סיסמאות לא נשמרות במאגר כטקסט רגיל אלא כ-hash.</w:t>
@@ -1873,6 +2133,7 @@
       <w:r>
         <w:rPr>
           <w:rFonts w:ascii="Arial" w:hAnsi="Arial" w:cs="Arial"/>
+          <w:b/>
           <w:sz w:val="28"/>
         </w:rPr>
         <w:t>בסיס נתונים</w:t>
@@ -1887,6 +2148,7 @@
       <w:r>
         <w:rPr>
           <w:rFonts w:ascii="Arial" w:hAnsi="Arial" w:cs="Arial"/>
+          <w:b w:val="0"/>
           <w:sz w:val="24"/>
         </w:rPr>
         <w:t>המערכת משתמשת ב-SQLite. זהו בסיס נתונים מבוסס קובץ, שמתאים לפרויקט לימודי כי אין צורך להתקין שרת בסיס נתונים חיצוני.</w:t>
@@ -1901,6 +2163,7 @@
       <w:r>
         <w:rPr>
           <w:rFonts w:ascii="Arial" w:hAnsi="Arial" w:cs="Arial"/>
+          <w:b w:val="0"/>
           <w:sz w:val="24"/>
         </w:rPr>
         <w:t>????????????????????????</w:t>
@@ -1916,6 +2179,7 @@
       <w:r>
         <w:rPr>
           <w:rFonts w:ascii="Arial" w:hAnsi="Arial" w:cs="Arial"/>
+          <w:b/>
           <w:sz w:val="32"/>
         </w:rPr>
         <w:t>6. ארכיטקטורת המערכת</w:t>
@@ -1930,6 +2194,7 @@
       <w:r>
         <w:rPr>
           <w:rFonts w:ascii="Arial" w:hAnsi="Arial" w:cs="Arial"/>
+          <w:b w:val="0"/>
           <w:sz w:val="24"/>
         </w:rPr>
         <w:t>המערכת מחולקת לשלושה חלקים עיקריים:</w:t>
@@ -1944,6 +2209,7 @@
       <w:r>
         <w:rPr>
           <w:rFonts w:ascii="Arial" w:hAnsi="Arial" w:cs="Arial"/>
+          <w:b w:val="0"/>
           <w:sz w:val="24"/>
         </w:rPr>
         <w:t>1. לקוח גרפי</w:t>
@@ -1957,6 +2223,7 @@
       <w:r>
         <w:rPr>
           <w:rFonts w:ascii="Arial" w:hAnsi="Arial" w:cs="Arial"/>
+          <w:b w:val="0"/>
           <w:sz w:val="24"/>
         </w:rPr>
         <w:t xml:space="preserve">   קובץ מרכזי: secure_chat/client_gui.py</w:t>
@@ -1970,6 +2237,7 @@
       <w:r>
         <w:rPr>
           <w:rFonts w:ascii="Arial" w:hAnsi="Arial" w:cs="Arial"/>
+          <w:b w:val="0"/>
           <w:sz w:val="24"/>
         </w:rPr>
         <w:t xml:space="preserve">   תפקיד: ממשק משתמש, התחברות, הרשמה, שליחת הודעות, הצגת הודעות, שליחת קבצים ופתיחת קישורים.</w:t>
@@ -1984,6 +2252,7 @@
       <w:r>
         <w:rPr>
           <w:rFonts w:ascii="Arial" w:hAnsi="Arial" w:cs="Arial"/>
+          <w:b w:val="0"/>
           <w:sz w:val="24"/>
         </w:rPr>
         <w:t>2. שרת</w:t>
@@ -1997,6 +2266,7 @@
       <w:r>
         <w:rPr>
           <w:rFonts w:ascii="Arial" w:hAnsi="Arial" w:cs="Arial"/>
+          <w:b w:val="0"/>
           <w:sz w:val="24"/>
         </w:rPr>
         <w:t xml:space="preserve">   קובץ מרכזי: secure_chat/server.py</w:t>
@@ -2010,6 +2280,7 @@
       <w:r>
         <w:rPr>
           <w:rFonts w:ascii="Arial" w:hAnsi="Arial" w:cs="Arial"/>
+          <w:b w:val="0"/>
           <w:sz w:val="24"/>
         </w:rPr>
         <w:t xml:space="preserve">   תפקיד: קבלת חיבורים, אימות משתמשים, ניהול חדרים, הפצת הודעות, קבלת קבצים וניהול פקודות מתקדמות.</w:t>
@@ -2024,6 +2295,7 @@
       <w:r>
         <w:rPr>
           <w:rFonts w:ascii="Arial" w:hAnsi="Arial" w:cs="Arial"/>
+          <w:b w:val="0"/>
           <w:sz w:val="24"/>
         </w:rPr>
         <w:t>3. שכבות עזר</w:t>
@@ -2037,6 +2309,7 @@
       <w:r>
         <w:rPr>
           <w:rFonts w:ascii="Arial" w:hAnsi="Arial" w:cs="Arial"/>
+          <w:b w:val="0"/>
           <w:sz w:val="24"/>
         </w:rPr>
         <w:t xml:space="preserve">   קבצים מרכזיים: protocol.py, storage.py, security.py, models.py, config.py</w:t>
@@ -2050,6 +2323,7 @@
       <w:r>
         <w:rPr>
           <w:rFonts w:ascii="Arial" w:hAnsi="Arial" w:cs="Arial"/>
+          <w:b w:val="0"/>
           <w:sz w:val="24"/>
         </w:rPr>
         <w:t xml:space="preserve">   תפקיד: פרוטוקול, בסיס נתונים, אבטחה, מודלים וקבועים.</w:t>
@@ -2065,6 +2339,7 @@
       <w:r>
         <w:rPr>
           <w:rFonts w:ascii="Arial" w:hAnsi="Arial" w:cs="Arial"/>
+          <w:b/>
           <w:sz w:val="28"/>
         </w:rPr>
         <w:t>תרשים ארכיטקטורה</w:t>
@@ -2078,6 +2353,7 @@
       <w:r>
         <w:rPr>
           <w:rFonts w:ascii="Consolas" w:hAnsi="Consolas" w:cs="Consolas"/>
+          <w:b w:val="0"/>
           <w:sz w:val="20"/>
         </w:rPr>
         <w:t>+------------------+       TLS + TCP       +----------------------+</w:t>
@@ -2090,6 +2366,7 @@
       <w:r>
         <w:rPr>
           <w:rFonts w:ascii="Consolas" w:hAnsi="Consolas" w:cs="Consolas"/>
+          <w:b w:val="0"/>
           <w:sz w:val="20"/>
         </w:rPr>
         <w:t>| Tkinter Client 1 | &lt;-------------------&gt; |                      |</w:t>
@@ -2102,6 +2379,7 @@
       <w:r>
         <w:rPr>
           <w:rFonts w:ascii="Consolas" w:hAnsi="Consolas" w:cs="Consolas"/>
+          <w:b w:val="0"/>
           <w:sz w:val="20"/>
         </w:rPr>
         <w:t>+------------------+                       |                      |</w:t>
@@ -2114,6 +2392,7 @@
       <w:r>
         <w:rPr>
           <w:rFonts w:ascii="Consolas" w:hAnsi="Consolas" w:cs="Consolas"/>
+          <w:b w:val="0"/>
           <w:sz w:val="20"/>
         </w:rPr>
         <w:t xml:space="preserve">                                           |  SecureChat Server   |</w:t>
@@ -2126,6 +2405,7 @@
       <w:r>
         <w:rPr>
           <w:rFonts w:ascii="Consolas" w:hAnsi="Consolas" w:cs="Consolas"/>
+          <w:b w:val="0"/>
           <w:sz w:val="20"/>
         </w:rPr>
         <w:t>+------------------+       TLS + TCP       |                      |</w:t>
@@ -2138,6 +2418,7 @@
       <w:r>
         <w:rPr>
           <w:rFonts w:ascii="Consolas" w:hAnsi="Consolas" w:cs="Consolas"/>
+          <w:b w:val="0"/>
           <w:sz w:val="20"/>
         </w:rPr>
         <w:t>| Tkinter Client 2 | &lt;-------------------&gt; |                      |</w:t>
@@ -2150,6 +2431,7 @@
       <w:r>
         <w:rPr>
           <w:rFonts w:ascii="Consolas" w:hAnsi="Consolas" w:cs="Consolas"/>
+          <w:b w:val="0"/>
           <w:sz w:val="20"/>
         </w:rPr>
         <w:t>+------------------+                       +----------+-----------+</w:t>
@@ -2162,6 +2444,7 @@
       <w:r>
         <w:rPr>
           <w:rFonts w:ascii="Consolas" w:hAnsi="Consolas" w:cs="Consolas"/>
+          <w:b w:val="0"/>
           <w:sz w:val="20"/>
         </w:rPr>
         <w:t xml:space="preserve">                                                      |</w:t>
@@ -2174,6 +2457,7 @@
       <w:r>
         <w:rPr>
           <w:rFonts w:ascii="Consolas" w:hAnsi="Consolas" w:cs="Consolas"/>
+          <w:b w:val="0"/>
           <w:sz w:val="20"/>
         </w:rPr>
         <w:t xml:space="preserve">                                                      |</w:t>
@@ -2186,6 +2470,7 @@
       <w:r>
         <w:rPr>
           <w:rFonts w:ascii="Consolas" w:hAnsi="Consolas" w:cs="Consolas"/>
+          <w:b w:val="0"/>
           <w:sz w:val="20"/>
         </w:rPr>
         <w:t xml:space="preserve">                                             +--------v---------+</w:t>
@@ -2198,6 +2483,7 @@
       <w:r>
         <w:rPr>
           <w:rFonts w:ascii="Consolas" w:hAnsi="Consolas" w:cs="Consolas"/>
+          <w:b w:val="0"/>
           <w:sz w:val="20"/>
         </w:rPr>
         <w:t xml:space="preserve">                                             | SQLite Database  |</w:t>
@@ -2210,6 +2496,7 @@
       <w:r>
         <w:rPr>
           <w:rFonts w:ascii="Consolas" w:hAnsi="Consolas" w:cs="Consolas"/>
+          <w:b w:val="0"/>
           <w:sz w:val="20"/>
         </w:rPr>
         <w:t xml:space="preserve">                                             | Uploaded Files   |</w:t>
@@ -2222,6 +2509,7 @@
       <w:r>
         <w:rPr>
           <w:rFonts w:ascii="Consolas" w:hAnsi="Consolas" w:cs="Consolas"/>
+          <w:b w:val="0"/>
           <w:sz w:val="20"/>
         </w:rPr>
         <w:t xml:space="preserve">                                             | Server Log       |</w:t>
@@ -2234,6 +2522,7 @@
       <w:r>
         <w:rPr>
           <w:rFonts w:ascii="Consolas" w:hAnsi="Consolas" w:cs="Consolas"/>
+          <w:b w:val="0"/>
           <w:sz w:val="20"/>
         </w:rPr>
         <w:t xml:space="preserve">                                             +------------------+</w:t>
@@ -2249,6 +2538,7 @@
       <w:r>
         <w:rPr>
           <w:rFonts w:ascii="Arial" w:hAnsi="Arial" w:cs="Arial"/>
+          <w:b/>
           <w:sz w:val="28"/>
         </w:rPr>
         <w:t>זרימת מידע בסיסית</w:t>
@@ -2263,6 +2553,7 @@
       <w:r>
         <w:rPr>
           <w:rFonts w:ascii="Arial" w:hAnsi="Arial" w:cs="Arial"/>
+          <w:b w:val="0"/>
           <w:sz w:val="24"/>
         </w:rPr>
         <w:t>1. הלקוח מתחבר לשרת דרך socket מוצפן.</w:t>
@@ -2276,6 +2567,7 @@
       <w:r>
         <w:rPr>
           <w:rFonts w:ascii="Arial" w:hAnsi="Arial" w:cs="Arial"/>
+          <w:b w:val="0"/>
           <w:sz w:val="24"/>
         </w:rPr>
         <w:t>2. הלקוח שולח בקשת הרשמה או התחברות.</w:t>
@@ -2289,6 +2581,7 @@
       <w:r>
         <w:rPr>
           <w:rFonts w:ascii="Arial" w:hAnsi="Arial" w:cs="Arial"/>
+          <w:b w:val="0"/>
           <w:sz w:val="24"/>
         </w:rPr>
         <w:t>3. השרת בודק את הפרטים מול בסיס הנתונים.</w:t>
@@ -2302,6 +2595,7 @@
       <w:r>
         <w:rPr>
           <w:rFonts w:ascii="Arial" w:hAnsi="Arial" w:cs="Arial"/>
+          <w:b w:val="0"/>
           <w:sz w:val="24"/>
         </w:rPr>
         <w:t>4. לאחר התחברות מוצלחת הלקוח נכנס למסך הצ'אט.</w:t>
@@ -2315,6 +2609,7 @@
       <w:r>
         <w:rPr>
           <w:rFonts w:ascii="Arial" w:hAnsi="Arial" w:cs="Arial"/>
+          <w:b w:val="0"/>
           <w:sz w:val="24"/>
         </w:rPr>
         <w:t>5. המשתמש שולח הודעה או קובץ.</w:t>
@@ -2328,6 +2623,7 @@
       <w:r>
         <w:rPr>
           <w:rFonts w:ascii="Arial" w:hAnsi="Arial" w:cs="Arial"/>
+          <w:b w:val="0"/>
           <w:sz w:val="24"/>
         </w:rPr>
         <w:t>6. השרת מקבל את המידע, בודק אותו ושולח אותו למשתמשים המתאימים.</w:t>
@@ -2342,6 +2638,7 @@
       <w:r>
         <w:rPr>
           <w:rFonts w:ascii="Arial" w:hAnsi="Arial" w:cs="Arial"/>
+          <w:b w:val="0"/>
           <w:sz w:val="24"/>
         </w:rPr>
         <w:t>????????????????????????</w:t>
@@ -2357,6 +2654,7 @@
       <w:r>
         <w:rPr>
           <w:rFonts w:ascii="Arial" w:hAnsi="Arial" w:cs="Arial"/>
+          <w:b/>
           <w:sz w:val="32"/>
         </w:rPr>
         <w:t>7. חלוקה למודולים</w:t>
@@ -2372,6 +2670,7 @@
       <w:r>
         <w:rPr>
           <w:rFonts w:ascii="Arial" w:hAnsi="Arial" w:cs="Arial"/>
+          <w:b/>
           <w:sz w:val="28"/>
         </w:rPr>
         <w:t>`client_gui.py`</w:t>
@@ -2386,6 +2685,7 @@
       <w:r>
         <w:rPr>
           <w:rFonts w:ascii="Arial" w:hAnsi="Arial" w:cs="Arial"/>
+          <w:b w:val="0"/>
           <w:sz w:val="24"/>
         </w:rPr>
         <w:t>מודול זה אחראי על הצד הגרפי של המשתמש. הוא בונה את מסך ההתחברות, מסך הצ'אט, רשימת החדרים, רשימת המשתמשים, תצוגת ההודעות, כפתורי אימוג'ים, כפתורי שליחת קבצים וקישורים לפתיחת קבצים.</w:t>
@@ -2401,6 +2701,7 @@
       <w:r>
         <w:rPr>
           <w:rFonts w:ascii="Arial" w:hAnsi="Arial" w:cs="Arial"/>
+          <w:b/>
           <w:sz w:val="28"/>
         </w:rPr>
         <w:t>`server.py`</w:t>
@@ -2415,6 +2716,7 @@
       <w:r>
         <w:rPr>
           <w:rFonts w:ascii="Arial" w:hAnsi="Arial" w:cs="Arial"/>
+          <w:b w:val="0"/>
           <w:sz w:val="24"/>
         </w:rPr>
         <w:t>מודול זה אחראי על שרת התקשורת. הוא מאזין לחיבורים, יוצר Thread לכל לקוח, מפענח packets שמתקבלים, מפיץ הודעות ומטפל בפקודות מתקדמות.</w:t>
@@ -2430,6 +2732,7 @@
       <w:r>
         <w:rPr>
           <w:rFonts w:ascii="Arial" w:hAnsi="Arial" w:cs="Arial"/>
+          <w:b/>
           <w:sz w:val="28"/>
         </w:rPr>
         <w:t>`protocol.py`</w:t>
@@ -2444,6 +2747,7 @@
       <w:r>
         <w:rPr>
           <w:rFonts w:ascii="Arial" w:hAnsi="Arial" w:cs="Arial"/>
+          <w:b w:val="0"/>
           <w:sz w:val="24"/>
         </w:rPr>
         <w:t>מודול זה מגדיר את פרוטוקול התקשורת. כל הודעה נשלחת כמבנה JSON עם כותרת באורך 4 בתים שמציינת את גודל ההודעה.</w:t>
@@ -2459,6 +2763,7 @@
       <w:r>
         <w:rPr>
           <w:rFonts w:ascii="Arial" w:hAnsi="Arial" w:cs="Arial"/>
+          <w:b/>
           <w:sz w:val="28"/>
         </w:rPr>
         <w:t>`storage.py`</w:t>
@@ -2473,6 +2778,7 @@
       <w:r>
         <w:rPr>
           <w:rFonts w:ascii="Arial" w:hAnsi="Arial" w:cs="Arial"/>
+          <w:b w:val="0"/>
           <w:sz w:val="24"/>
         </w:rPr>
         <w:t>מודול זה אחראי על שמירה ושליפה של נתונים. הוא משתמש ב-SQLite ושומר משתמשים, הודעות, חדרים, לוגים, חברים והיסטוריית הורדות.</w:t>
@@ -2488,6 +2794,7 @@
       <w:r>
         <w:rPr>
           <w:rFonts w:ascii="Arial" w:hAnsi="Arial" w:cs="Arial"/>
+          <w:b/>
           <w:sz w:val="28"/>
         </w:rPr>
         <w:t>`security.py`</w:t>
@@ -2502,6 +2809,7 @@
       <w:r>
         <w:rPr>
           <w:rFonts w:ascii="Arial" w:hAnsi="Arial" w:cs="Arial"/>
+          <w:b w:val="0"/>
           <w:sz w:val="24"/>
         </w:rPr>
         <w:t>מודול זה אחראי על אבטחה: בדיקת קלטים, hashing לסיסמאות, יצירת TLS context ותעודות פיתוח.</w:t>
@@ -2517,6 +2825,7 @@
       <w:r>
         <w:rPr>
           <w:rFonts w:ascii="Arial" w:hAnsi="Arial" w:cs="Arial"/>
+          <w:b/>
           <w:sz w:val="28"/>
         </w:rPr>
         <w:t>`models.py`</w:t>
@@ -2531,6 +2840,7 @@
       <w:r>
         <w:rPr>
           <w:rFonts w:ascii="Arial" w:hAnsi="Arial" w:cs="Arial"/>
+          <w:b w:val="0"/>
           <w:sz w:val="24"/>
         </w:rPr>
         <w:t>מודול זה כולל מחלקות נתונים כמו User, ChatMessage, ClientInfo ו-ServerEvent.</w:t>
@@ -2546,6 +2856,7 @@
       <w:r>
         <w:rPr>
           <w:rFonts w:ascii="Arial" w:hAnsi="Arial" w:cs="Arial"/>
+          <w:b/>
           <w:sz w:val="28"/>
         </w:rPr>
         <w:t>`config.py`</w:t>
@@ -2560,6 +2871,7 @@
       <w:r>
         <w:rPr>
           <w:rFonts w:ascii="Arial" w:hAnsi="Arial" w:cs="Arial"/>
+          <w:b w:val="0"/>
           <w:sz w:val="24"/>
         </w:rPr>
         <w:t>מודול זה כולל קבועים מרכזיים כמו כתובת ברירת מחדל, port, נתיבי קבצים ומגבלות גודל.</w:t>
@@ -2574,6 +2886,7 @@
       <w:r>
         <w:rPr>
           <w:rFonts w:ascii="Arial" w:hAnsi="Arial" w:cs="Arial"/>
+          <w:b w:val="0"/>
           <w:sz w:val="24"/>
         </w:rPr>
         <w:t>????????????????????????</w:t>
@@ -2589,6 +2902,7 @@
       <w:r>
         <w:rPr>
           <w:rFonts w:ascii="Arial" w:hAnsi="Arial" w:cs="Arial"/>
+          <w:b/>
           <w:sz w:val="32"/>
         </w:rPr>
         <w:t>8. פרוטוקול התקשורת</w:t>
@@ -2603,6 +2917,7 @@
       <w:r>
         <w:rPr>
           <w:rFonts w:ascii="Arial" w:hAnsi="Arial" w:cs="Arial"/>
+          <w:b w:val="0"/>
           <w:sz w:val="24"/>
         </w:rPr>
         <w:t>הפרויקט מממש פרוטוקול עצמאי מעל TCP. הפרוטוקול בנוי כך:</w:t>
@@ -2617,6 +2932,7 @@
       <w:r>
         <w:rPr>
           <w:rFonts w:ascii="Arial" w:hAnsi="Arial" w:cs="Arial"/>
+          <w:b w:val="0"/>
           <w:sz w:val="24"/>
         </w:rPr>
         <w:t>1. 4 בתים ראשונים</w:t>
@@ -2630,6 +2946,7 @@
       <w:r>
         <w:rPr>
           <w:rFonts w:ascii="Arial" w:hAnsi="Arial" w:cs="Arial"/>
+          <w:b w:val="0"/>
           <w:sz w:val="24"/>
         </w:rPr>
         <w:t xml:space="preserve">   מציינים את אורך ה-payload.</w:t>
@@ -2644,6 +2961,7 @@
       <w:r>
         <w:rPr>
           <w:rFonts w:ascii="Arial" w:hAnsi="Arial" w:cs="Arial"/>
+          <w:b w:val="0"/>
           <w:sz w:val="24"/>
         </w:rPr>
         <w:t>2. Payload</w:t>
@@ -2657,6 +2975,7 @@
       <w:r>
         <w:rPr>
           <w:rFonts w:ascii="Arial" w:hAnsi="Arial" w:cs="Arial"/>
+          <w:b w:val="0"/>
           <w:sz w:val="24"/>
         </w:rPr>
         <w:t xml:space="preserve">   מחרוזת JSON בקידוד UTF-8.</w:t>
@@ -2672,6 +2991,7 @@
       <w:r>
         <w:rPr>
           <w:rFonts w:ascii="Arial" w:hAnsi="Arial" w:cs="Arial"/>
+          <w:b/>
           <w:sz w:val="28"/>
         </w:rPr>
         <w:t>דוגמת packet להרשמה</w:t>
@@ -2685,6 +3005,7 @@
       <w:r>
         <w:rPr>
           <w:rFonts w:ascii="Consolas" w:hAnsi="Consolas" w:cs="Consolas"/>
+          <w:b w:val="0"/>
           <w:sz w:val="20"/>
         </w:rPr>
         <w:t>{</w:t>
@@ -2697,6 +3018,7 @@
       <w:r>
         <w:rPr>
           <w:rFonts w:ascii="Consolas" w:hAnsi="Consolas" w:cs="Consolas"/>
+          <w:b w:val="0"/>
           <w:sz w:val="20"/>
         </w:rPr>
         <w:t xml:space="preserve">  "type": "register",</w:t>
@@ -2709,6 +3031,7 @@
       <w:r>
         <w:rPr>
           <w:rFonts w:ascii="Consolas" w:hAnsi="Consolas" w:cs="Consolas"/>
+          <w:b w:val="0"/>
           <w:sz w:val="20"/>
         </w:rPr>
         <w:t xml:space="preserve">  "username": "dani",</w:t>
@@ -2721,6 +3044,7 @@
       <w:r>
         <w:rPr>
           <w:rFonts w:ascii="Consolas" w:hAnsi="Consolas" w:cs="Consolas"/>
+          <w:b w:val="0"/>
           <w:sz w:val="20"/>
         </w:rPr>
         <w:t xml:space="preserve">  "password": "123456"</w:t>
@@ -2733,6 +3057,7 @@
       <w:r>
         <w:rPr>
           <w:rFonts w:ascii="Consolas" w:hAnsi="Consolas" w:cs="Consolas"/>
+          <w:b w:val="0"/>
           <w:sz w:val="20"/>
         </w:rPr>
         <w:t>}</w:t>
@@ -2748,6 +3073,7 @@
       <w:r>
         <w:rPr>
           <w:rFonts w:ascii="Arial" w:hAnsi="Arial" w:cs="Arial"/>
+          <w:b/>
           <w:sz w:val="28"/>
         </w:rPr>
         <w:t>דוגמת packet להתחברות</w:t>
@@ -2761,6 +3087,7 @@
       <w:r>
         <w:rPr>
           <w:rFonts w:ascii="Consolas" w:hAnsi="Consolas" w:cs="Consolas"/>
+          <w:b w:val="0"/>
           <w:sz w:val="20"/>
         </w:rPr>
         <w:t>{</w:t>
@@ -2773,6 +3100,7 @@
       <w:r>
         <w:rPr>
           <w:rFonts w:ascii="Consolas" w:hAnsi="Consolas" w:cs="Consolas"/>
+          <w:b w:val="0"/>
           <w:sz w:val="20"/>
         </w:rPr>
         <w:t xml:space="preserve">  "type": "login",</w:t>
@@ -2785,6 +3113,7 @@
       <w:r>
         <w:rPr>
           <w:rFonts w:ascii="Consolas" w:hAnsi="Consolas" w:cs="Consolas"/>
+          <w:b w:val="0"/>
           <w:sz w:val="20"/>
         </w:rPr>
         <w:t xml:space="preserve">  "username": "dani",</w:t>
@@ -2797,6 +3126,7 @@
       <w:r>
         <w:rPr>
           <w:rFonts w:ascii="Consolas" w:hAnsi="Consolas" w:cs="Consolas"/>
+          <w:b w:val="0"/>
           <w:sz w:val="20"/>
         </w:rPr>
         <w:t xml:space="preserve">  "password": "123456"</w:t>
@@ -2809,6 +3139,7 @@
       <w:r>
         <w:rPr>
           <w:rFonts w:ascii="Consolas" w:hAnsi="Consolas" w:cs="Consolas"/>
+          <w:b w:val="0"/>
           <w:sz w:val="20"/>
         </w:rPr>
         <w:t>}</w:t>
@@ -2824,6 +3155,7 @@
       <w:r>
         <w:rPr>
           <w:rFonts w:ascii="Arial" w:hAnsi="Arial" w:cs="Arial"/>
+          <w:b/>
           <w:sz w:val="28"/>
         </w:rPr>
         <w:t>דוגמת packet להודעת צ'אט</w:t>
@@ -2837,6 +3169,7 @@
       <w:r>
         <w:rPr>
           <w:rFonts w:ascii="Consolas" w:hAnsi="Consolas" w:cs="Consolas"/>
+          <w:b w:val="0"/>
           <w:sz w:val="20"/>
         </w:rPr>
         <w:t>{</w:t>
@@ -2849,6 +3182,7 @@
       <w:r>
         <w:rPr>
           <w:rFonts w:ascii="Consolas" w:hAnsi="Consolas" w:cs="Consolas"/>
+          <w:b w:val="0"/>
           <w:sz w:val="20"/>
         </w:rPr>
         <w:t xml:space="preserve">  "type": "message",</w:t>
@@ -2861,6 +3195,7 @@
       <w:r>
         <w:rPr>
           <w:rFonts w:ascii="Consolas" w:hAnsi="Consolas" w:cs="Consolas"/>
+          <w:b w:val="0"/>
           <w:sz w:val="20"/>
         </w:rPr>
         <w:t xml:space="preserve">  "body": "שלום לכולם"</w:t>
@@ -2873,6 +3208,7 @@
       <w:r>
         <w:rPr>
           <w:rFonts w:ascii="Consolas" w:hAnsi="Consolas" w:cs="Consolas"/>
+          <w:b w:val="0"/>
           <w:sz w:val="20"/>
         </w:rPr>
         <w:t>}</w:t>
@@ -2888,6 +3224,7 @@
       <w:r>
         <w:rPr>
           <w:rFonts w:ascii="Arial" w:hAnsi="Arial" w:cs="Arial"/>
+          <w:b/>
           <w:sz w:val="28"/>
         </w:rPr>
         <w:t>דוגמת packet לקובץ</w:t>
@@ -2901,6 +3238,7 @@
       <w:r>
         <w:rPr>
           <w:rFonts w:ascii="Consolas" w:hAnsi="Consolas" w:cs="Consolas"/>
+          <w:b w:val="0"/>
           <w:sz w:val="20"/>
         </w:rPr>
         <w:t>{</w:t>
@@ -2913,6 +3251,7 @@
       <w:r>
         <w:rPr>
           <w:rFonts w:ascii="Consolas" w:hAnsi="Consolas" w:cs="Consolas"/>
+          <w:b w:val="0"/>
           <w:sz w:val="20"/>
         </w:rPr>
         <w:t xml:space="preserve">  "type": "file",</w:t>
@@ -2925,6 +3264,7 @@
       <w:r>
         <w:rPr>
           <w:rFonts w:ascii="Consolas" w:hAnsi="Consolas" w:cs="Consolas"/>
+          <w:b w:val="0"/>
           <w:sz w:val="20"/>
         </w:rPr>
         <w:t xml:space="preserve">  "filename": "image.png",</w:t>
@@ -2937,6 +3277,7 @@
       <w:r>
         <w:rPr>
           <w:rFonts w:ascii="Consolas" w:hAnsi="Consolas" w:cs="Consolas"/>
+          <w:b w:val="0"/>
           <w:sz w:val="20"/>
         </w:rPr>
         <w:t xml:space="preserve">  "kind": "image",</w:t>
@@ -2949,6 +3290,7 @@
       <w:r>
         <w:rPr>
           <w:rFonts w:ascii="Consolas" w:hAnsi="Consolas" w:cs="Consolas"/>
+          <w:b w:val="0"/>
           <w:sz w:val="20"/>
         </w:rPr>
         <w:t xml:space="preserve">  "mime_type": "image/png",</w:t>
@@ -2961,6 +3303,7 @@
       <w:r>
         <w:rPr>
           <w:rFonts w:ascii="Consolas" w:hAnsi="Consolas" w:cs="Consolas"/>
+          <w:b w:val="0"/>
           <w:sz w:val="20"/>
         </w:rPr>
         <w:t xml:space="preserve">  "data": "base64-data"</w:t>
@@ -2973,6 +3316,7 @@
       <w:r>
         <w:rPr>
           <w:rFonts w:ascii="Consolas" w:hAnsi="Consolas" w:cs="Consolas"/>
+          <w:b w:val="0"/>
           <w:sz w:val="20"/>
         </w:rPr>
         <w:t>}</w:t>
@@ -2988,6 +3332,7 @@
       <w:r>
         <w:rPr>
           <w:rFonts w:ascii="Arial" w:hAnsi="Arial" w:cs="Arial"/>
+          <w:b/>
           <w:sz w:val="28"/>
         </w:rPr>
         <w:t>סוגי הודעות מרכזיים</w:t>
@@ -3002,6 +3347,7 @@
       <w:r>
         <w:rPr>
           <w:rFonts w:ascii="Arial" w:hAnsi="Arial" w:cs="Arial"/>
+          <w:b w:val="0"/>
           <w:sz w:val="24"/>
         </w:rPr>
         <w:t>1. register - הרשמה.</w:t>
@@ -3015,6 +3361,7 @@
       <w:r>
         <w:rPr>
           <w:rFonts w:ascii="Arial" w:hAnsi="Arial" w:cs="Arial"/>
+          <w:b w:val="0"/>
           <w:sz w:val="24"/>
         </w:rPr>
         <w:t>2. login - התחברות.</w:t>
@@ -3028,6 +3375,7 @@
       <w:r>
         <w:rPr>
           <w:rFonts w:ascii="Arial" w:hAnsi="Arial" w:cs="Arial"/>
+          <w:b w:val="0"/>
           <w:sz w:val="24"/>
         </w:rPr>
         <w:t>3. message - הודעת צ'אט רגילה.</w:t>
@@ -3041,6 +3389,7 @@
       <w:r>
         <w:rPr>
           <w:rFonts w:ascii="Arial" w:hAnsi="Arial" w:cs="Arial"/>
+          <w:b w:val="0"/>
           <w:sz w:val="24"/>
         </w:rPr>
         <w:t>4. file - שליחת קובץ, תמונה או סרטון.</w:t>
@@ -3054,6 +3403,7 @@
       <w:r>
         <w:rPr>
           <w:rFonts w:ascii="Arial" w:hAnsi="Arial" w:cs="Arial"/>
+          <w:b w:val="0"/>
           <w:sz w:val="24"/>
         </w:rPr>
         <w:t>5. join - הצטרפות לחדר.</w:t>
@@ -3067,6 +3417,7 @@
       <w:r>
         <w:rPr>
           <w:rFonts w:ascii="Arial" w:hAnsi="Arial" w:cs="Arial"/>
+          <w:b w:val="0"/>
           <w:sz w:val="24"/>
         </w:rPr>
         <w:t>6. create_room - יצירת חדר.</w:t>
@@ -3080,6 +3431,7 @@
       <w:r>
         <w:rPr>
           <w:rFonts w:ascii="Arial" w:hAnsi="Arial" w:cs="Arial"/>
+          <w:b w:val="0"/>
           <w:sz w:val="24"/>
         </w:rPr>
         <w:t>7. rooms - בקשת רשימת חדרים.</w:t>
@@ -3093,6 +3445,7 @@
       <w:r>
         <w:rPr>
           <w:rFonts w:ascii="Arial" w:hAnsi="Arial" w:cs="Arial"/>
+          <w:b w:val="0"/>
           <w:sz w:val="24"/>
         </w:rPr>
         <w:t>8. users - בקשת רשימת משתמשים.</w:t>
@@ -3106,6 +3459,7 @@
       <w:r>
         <w:rPr>
           <w:rFonts w:ascii="Arial" w:hAnsi="Arial" w:cs="Arial"/>
+          <w:b w:val="0"/>
           <w:sz w:val="24"/>
         </w:rPr>
         <w:t>9. command - פקודות מתקדמות.</w:t>
@@ -3119,6 +3473,7 @@
       <w:r>
         <w:rPr>
           <w:rFonts w:ascii="Arial" w:hAnsi="Arial" w:cs="Arial"/>
+          <w:b w:val="0"/>
           <w:sz w:val="24"/>
         </w:rPr>
         <w:t>10. typing - חיווי הקלדה.</w:t>
@@ -3132,6 +3487,7 @@
       <w:r>
         <w:rPr>
           <w:rFonts w:ascii="Arial" w:hAnsi="Arial" w:cs="Arial"/>
+          <w:b w:val="0"/>
           <w:sz w:val="24"/>
         </w:rPr>
         <w:t>11. read_receipt - אישור קריאה.</w:t>
@@ -3145,6 +3501,7 @@
       <w:r>
         <w:rPr>
           <w:rFonts w:ascii="Arial" w:hAnsi="Arial" w:cs="Arial"/>
+          <w:b w:val="0"/>
           <w:sz w:val="24"/>
         </w:rPr>
         <w:t>12. download_event - רישום פתיחת קובץ.</w:t>
@@ -3159,6 +3516,7 @@
       <w:r>
         <w:rPr>
           <w:rFonts w:ascii="Arial" w:hAnsi="Arial" w:cs="Arial"/>
+          <w:b w:val="0"/>
           <w:sz w:val="24"/>
         </w:rPr>
         <w:t>????????????????????????</w:t>
@@ -3174,6 +3532,7 @@
       <w:r>
         <w:rPr>
           <w:rFonts w:ascii="Arial" w:hAnsi="Arial" w:cs="Arial"/>
+          <w:b/>
           <w:sz w:val="32"/>
         </w:rPr>
         <w:t>9. אלגוריתמים מרכזיים</w:t>
@@ -3189,6 +3548,7 @@
       <w:r>
         <w:rPr>
           <w:rFonts w:ascii="Arial" w:hAnsi="Arial" w:cs="Arial"/>
+          <w:b/>
           <w:sz w:val="28"/>
         </w:rPr>
         <w:t>אלגוריתם קבלת packet</w:t>
@@ -3203,6 +3563,7 @@
       <w:r>
         <w:rPr>
           <w:rFonts w:ascii="Arial" w:hAnsi="Arial" w:cs="Arial"/>
+          <w:b w:val="0"/>
           <w:sz w:val="24"/>
         </w:rPr>
         <w:t>1. קוראים 4 בתים מה-socket.</w:t>
@@ -3216,6 +3577,7 @@
       <w:r>
         <w:rPr>
           <w:rFonts w:ascii="Arial" w:hAnsi="Arial" w:cs="Arial"/>
+          <w:b w:val="0"/>
           <w:sz w:val="24"/>
         </w:rPr>
         <w:t>2. מפרשים אותם כמספר שמייצג את גודל ה-payload.</w:t>
@@ -3229,6 +3591,7 @@
       <w:r>
         <w:rPr>
           <w:rFonts w:ascii="Arial" w:hAnsi="Arial" w:cs="Arial"/>
+          <w:b w:val="0"/>
           <w:sz w:val="24"/>
         </w:rPr>
         <w:t>3. בודקים שהגודל אינו חורג מהמותר.</w:t>
@@ -3242,6 +3605,7 @@
       <w:r>
         <w:rPr>
           <w:rFonts w:ascii="Arial" w:hAnsi="Arial" w:cs="Arial"/>
+          <w:b w:val="0"/>
           <w:sz w:val="24"/>
         </w:rPr>
         <w:t>4. קוראים בדיוק את כמות הבתים שנקבעה.</w:t>
@@ -3255,6 +3619,7 @@
       <w:r>
         <w:rPr>
           <w:rFonts w:ascii="Arial" w:hAnsi="Arial" w:cs="Arial"/>
+          <w:b w:val="0"/>
           <w:sz w:val="24"/>
         </w:rPr>
         <w:t>5. מפענחים את המידע מ-UTF-8.</w:t>
@@ -3268,6 +3633,7 @@
       <w:r>
         <w:rPr>
           <w:rFonts w:ascii="Arial" w:hAnsi="Arial" w:cs="Arial"/>
+          <w:b w:val="0"/>
           <w:sz w:val="24"/>
         </w:rPr>
         <w:t>6. ממירים את הטקסט ל-JSON.</w:t>
@@ -3281,6 +3647,7 @@
       <w:r>
         <w:rPr>
           <w:rFonts w:ascii="Arial" w:hAnsi="Arial" w:cs="Arial"/>
+          <w:b w:val="0"/>
           <w:sz w:val="24"/>
         </w:rPr>
         <w:t>7. בודקים שקיים שדה type.</w:t>
@@ -3296,6 +3663,7 @@
       <w:r>
         <w:rPr>
           <w:rFonts w:ascii="Arial" w:hAnsi="Arial" w:cs="Arial"/>
+          <w:b/>
           <w:sz w:val="28"/>
         </w:rPr>
         <w:t>אלגוריתם שליחת הודעה לחדר</w:t>
@@ -3310,6 +3678,7 @@
       <w:r>
         <w:rPr>
           <w:rFonts w:ascii="Arial" w:hAnsi="Arial" w:cs="Arial"/>
+          <w:b w:val="0"/>
           <w:sz w:val="24"/>
         </w:rPr>
         <w:t>1. הלקוח שולח packet מסוג message.</w:t>
@@ -3323,6 +3692,7 @@
       <w:r>
         <w:rPr>
           <w:rFonts w:ascii="Arial" w:hAnsi="Arial" w:cs="Arial"/>
+          <w:b w:val="0"/>
           <w:sz w:val="24"/>
         </w:rPr>
         <w:t>2. השרת בודק שהלקוח מחובר.</w:t>
@@ -3336,6 +3706,7 @@
       <w:r>
         <w:rPr>
           <w:rFonts w:ascii="Arial" w:hAnsi="Arial" w:cs="Arial"/>
+          <w:b w:val="0"/>
           <w:sz w:val="24"/>
         </w:rPr>
         <w:t>3. השרת בודק שההודעה אינה ריקה ואינה ארוכה מדי.</w:t>
@@ -3349,6 +3720,7 @@
       <w:r>
         <w:rPr>
           <w:rFonts w:ascii="Arial" w:hAnsi="Arial" w:cs="Arial"/>
+          <w:b w:val="0"/>
           <w:sz w:val="24"/>
         </w:rPr>
         <w:t>4. השרת שומר את ההודעה בבסיס הנתונים.</w:t>
@@ -3362,6 +3734,7 @@
       <w:r>
         <w:rPr>
           <w:rFonts w:ascii="Arial" w:hAnsi="Arial" w:cs="Arial"/>
+          <w:b w:val="0"/>
           <w:sz w:val="24"/>
         </w:rPr>
         <w:t>5. השרת עובר על כל הלקוחות המחוברים.</w:t>
@@ -3375,6 +3748,7 @@
       <w:r>
         <w:rPr>
           <w:rFonts w:ascii="Arial" w:hAnsi="Arial" w:cs="Arial"/>
+          <w:b w:val="0"/>
           <w:sz w:val="24"/>
         </w:rPr>
         <w:t>6. השרת שולח את ההודעה רק ללקוחות שנמצאים באותו חדר.</w:t>
@@ -3390,6 +3764,7 @@
       <w:r>
         <w:rPr>
           <w:rFonts w:ascii="Arial" w:hAnsi="Arial" w:cs="Arial"/>
+          <w:b/>
           <w:sz w:val="28"/>
         </w:rPr>
         <w:t>אלגוריתם הרשמה</w:t>
@@ -3404,6 +3779,7 @@
       <w:r>
         <w:rPr>
           <w:rFonts w:ascii="Arial" w:hAnsi="Arial" w:cs="Arial"/>
+          <w:b w:val="0"/>
           <w:sz w:val="24"/>
         </w:rPr>
         <w:t>1. הלקוח שולח שם משתמש וסיסמה.</w:t>
@@ -3417,6 +3793,7 @@
       <w:r>
         <w:rPr>
           <w:rFonts w:ascii="Arial" w:hAnsi="Arial" w:cs="Arial"/>
+          <w:b w:val="0"/>
           <w:sz w:val="24"/>
         </w:rPr>
         <w:t>2. השרת בודק ששם המשתמש חוקי.</w:t>
@@ -3430,6 +3807,7 @@
       <w:r>
         <w:rPr>
           <w:rFonts w:ascii="Arial" w:hAnsi="Arial" w:cs="Arial"/>
+          <w:b w:val="0"/>
           <w:sz w:val="24"/>
         </w:rPr>
         <w:t>3. השרת בודק שהסיסמה באורך מתאים.</w:t>
@@ -3443,6 +3821,7 @@
       <w:r>
         <w:rPr>
           <w:rFonts w:ascii="Arial" w:hAnsi="Arial" w:cs="Arial"/>
+          <w:b w:val="0"/>
           <w:sz w:val="24"/>
         </w:rPr>
         <w:t>4. השרת יוצר salt אקראי.</w:t>
@@ -3456,6 +3835,7 @@
       <w:r>
         <w:rPr>
           <w:rFonts w:ascii="Arial" w:hAnsi="Arial" w:cs="Arial"/>
+          <w:b w:val="0"/>
           <w:sz w:val="24"/>
         </w:rPr>
         <w:t>5. השרת מחשב hash עם PBKDF2.</w:t>
@@ -3469,6 +3849,7 @@
       <w:r>
         <w:rPr>
           <w:rFonts w:ascii="Arial" w:hAnsi="Arial" w:cs="Arial"/>
+          <w:b w:val="0"/>
           <w:sz w:val="24"/>
         </w:rPr>
         <w:t>6. השרת שומר את שם המשתמש וה-hash בבסיס הנתונים.</w:t>
@@ -3482,6 +3863,7 @@
       <w:r>
         <w:rPr>
           <w:rFonts w:ascii="Arial" w:hAnsi="Arial" w:cs="Arial"/>
+          <w:b w:val="0"/>
           <w:sz w:val="24"/>
         </w:rPr>
         <w:t>7. אם שם המשתמש כבר קיים, מוחזרת הודעת שגיאה.</w:t>
@@ -3497,6 +3879,7 @@
       <w:r>
         <w:rPr>
           <w:rFonts w:ascii="Arial" w:hAnsi="Arial" w:cs="Arial"/>
+          <w:b/>
           <w:sz w:val="28"/>
         </w:rPr>
         <w:t>אלגוריתם שליחת קובץ</w:t>
@@ -3511,6 +3894,7 @@
       <w:r>
         <w:rPr>
           <w:rFonts w:ascii="Arial" w:hAnsi="Arial" w:cs="Arial"/>
+          <w:b w:val="0"/>
           <w:sz w:val="24"/>
         </w:rPr>
         <w:t>1. המשתמש בוחר קובץ דרך הממשק.</w:t>
@@ -3524,6 +3908,7 @@
       <w:r>
         <w:rPr>
           <w:rFonts w:ascii="Arial" w:hAnsi="Arial" w:cs="Arial"/>
+          <w:b w:val="0"/>
           <w:sz w:val="24"/>
         </w:rPr>
         <w:t>2. הלקוח בודק שהקובץ אינו גדול מדי.</w:t>
@@ -3537,6 +3922,7 @@
       <w:r>
         <w:rPr>
           <w:rFonts w:ascii="Arial" w:hAnsi="Arial" w:cs="Arial"/>
+          <w:b w:val="0"/>
           <w:sz w:val="24"/>
         </w:rPr>
         <w:t>3. הלקוח קורא את הקובץ וממיר אותו ל-base64.</w:t>
@@ -3550,6 +3936,7 @@
       <w:r>
         <w:rPr>
           <w:rFonts w:ascii="Arial" w:hAnsi="Arial" w:cs="Arial"/>
+          <w:b w:val="0"/>
           <w:sz w:val="24"/>
         </w:rPr>
         <w:t>4. הלקוח שולח packet מסוג file.</w:t>
@@ -3563,6 +3950,7 @@
       <w:r>
         <w:rPr>
           <w:rFonts w:ascii="Arial" w:hAnsi="Arial" w:cs="Arial"/>
+          <w:b w:val="0"/>
           <w:sz w:val="24"/>
         </w:rPr>
         <w:t>5. השרת מפענח את base64.</w:t>
@@ -3576,6 +3964,7 @@
       <w:r>
         <w:rPr>
           <w:rFonts w:ascii="Arial" w:hAnsi="Arial" w:cs="Arial"/>
+          <w:b w:val="0"/>
           <w:sz w:val="24"/>
         </w:rPr>
         <w:t>6. השרת שומר עותק בתיקיית uploads.</w:t>
@@ -3589,6 +3978,7 @@
       <w:r>
         <w:rPr>
           <w:rFonts w:ascii="Arial" w:hAnsi="Arial" w:cs="Arial"/>
+          <w:b w:val="0"/>
           <w:sz w:val="24"/>
         </w:rPr>
         <w:t>7. השרת שולח את הקובץ לכל המשתמשים בחדר.</w:t>
@@ -3602,6 +3992,7 @@
       <w:r>
         <w:rPr>
           <w:rFonts w:ascii="Arial" w:hAnsi="Arial" w:cs="Arial"/>
+          <w:b w:val="0"/>
           <w:sz w:val="24"/>
         </w:rPr>
         <w:t>8. הלקוח המקבל שומר את הקובץ בתיקיית downloads.</w:t>
@@ -3615,6 +4006,7 @@
       <w:r>
         <w:rPr>
           <w:rFonts w:ascii="Arial" w:hAnsi="Arial" w:cs="Arial"/>
+          <w:b w:val="0"/>
           <w:sz w:val="24"/>
         </w:rPr>
         <w:t>9. אם מדובר בתמונה, מוצגת תצוגה מקדימה במסך הצ'אט.</w:t>
@@ -3629,6 +4021,7 @@
       <w:r>
         <w:rPr>
           <w:rFonts w:ascii="Arial" w:hAnsi="Arial" w:cs="Arial"/>
+          <w:b w:val="0"/>
           <w:sz w:val="24"/>
         </w:rPr>
         <w:t>????????????????????????</w:t>
@@ -3644,6 +4037,7 @@
       <w:r>
         <w:rPr>
           <w:rFonts w:ascii="Arial" w:hAnsi="Arial" w:cs="Arial"/>
+          <w:b/>
           <w:sz w:val="32"/>
         </w:rPr>
         <w:t>10. אבטחת מידע וחולשות</w:t>
@@ -3659,6 +4053,7 @@
       <w:r>
         <w:rPr>
           <w:rFonts w:ascii="Arial" w:hAnsi="Arial" w:cs="Arial"/>
+          <w:b/>
           <w:sz w:val="28"/>
         </w:rPr>
         <w:t>הצפנת תקשורת</w:t>
@@ -3673,6 +4068,7 @@
       <w:r>
         <w:rPr>
           <w:rFonts w:ascii="Arial" w:hAnsi="Arial" w:cs="Arial"/>
+          <w:b w:val="0"/>
           <w:sz w:val="24"/>
         </w:rPr>
         <w:t>המערכת משתמשת ב-TLS ולכן המידע שעובר בין הלקוח לשרת מוצפן. הדבר מקטין את הסיכון שמאזין ברשת יראה הודעות, סיסמאות או קבצים.</w:t>
@@ -3688,6 +4084,7 @@
       <w:r>
         <w:rPr>
           <w:rFonts w:ascii="Arial" w:hAnsi="Arial" w:cs="Arial"/>
+          <w:b/>
           <w:sz w:val="28"/>
         </w:rPr>
         <w:t>שמירת סיסמאות</w:t>
@@ -3702,6 +4099,7 @@
       <w:r>
         <w:rPr>
           <w:rFonts w:ascii="Arial" w:hAnsi="Arial" w:cs="Arial"/>
+          <w:b w:val="0"/>
           <w:sz w:val="24"/>
         </w:rPr>
         <w:t>סיסמאות אינן נשמרות כטקסט גלוי. במקום זאת נשמר hash שנוצר באמצעות PBKDF2 עם salt אקראי. אם בסיס הנתונים נגנב, התוקף לא מקבל את הסיסמאות המקוריות באופן ישיר.</w:t>
@@ -3717,6 +4115,7 @@
       <w:r>
         <w:rPr>
           <w:rFonts w:ascii="Arial" w:hAnsi="Arial" w:cs="Arial"/>
+          <w:b/>
           <w:sz w:val="28"/>
         </w:rPr>
         <w:t>הגנה מפני SQL Injection</w:t>
@@ -3731,6 +4130,7 @@
       <w:r>
         <w:rPr>
           <w:rFonts w:ascii="Arial" w:hAnsi="Arial" w:cs="Arial"/>
+          <w:b w:val="0"/>
           <w:sz w:val="24"/>
         </w:rPr>
         <w:t>כל השאילתות משתמשות בפרמטרים. לדוגמה, במקום לחבר מחרוזת SQL עם קלט משתמש, הקוד מעביר את הערכים בנפרד ל-SQLite.</w:t>
@@ -3746,6 +4146,7 @@
       <w:r>
         <w:rPr>
           <w:rFonts w:ascii="Arial" w:hAnsi="Arial" w:cs="Arial"/>
+          <w:b/>
           <w:sz w:val="28"/>
         </w:rPr>
         <w:t>הגבלת גודל packets</w:t>
@@ -3760,6 +4161,7 @@
       <w:r>
         <w:rPr>
           <w:rFonts w:ascii="Arial" w:hAnsi="Arial" w:cs="Arial"/>
+          <w:b w:val="0"/>
           <w:sz w:val="24"/>
         </w:rPr>
         <w:t>הפרוטוקול מגביל את גודל ה-packet. כך נמנע מצב שבו משתמש שולח מידע ענק כדי לגרום לשרת לקרוס.</w:t>
@@ -3775,6 +4177,7 @@
       <w:r>
         <w:rPr>
           <w:rFonts w:ascii="Arial" w:hAnsi="Arial" w:cs="Arial"/>
+          <w:b/>
           <w:sz w:val="28"/>
         </w:rPr>
         <w:t>הגבלת גודל קבצים</w:t>
@@ -3789,6 +4192,7 @@
       <w:r>
         <w:rPr>
           <w:rFonts w:ascii="Arial" w:hAnsi="Arial" w:cs="Arial"/>
+          <w:b w:val="0"/>
           <w:sz w:val="24"/>
         </w:rPr>
         <w:t>המערכת מגבילה את גודל הקובץ שניתן לשלוח. פעולה זו מגינה מפני הצפת זיכרון ודיסק.</w:t>
@@ -3804,6 +4208,7 @@
       <w:r>
         <w:rPr>
           <w:rFonts w:ascii="Arial" w:hAnsi="Arial" w:cs="Arial"/>
+          <w:b/>
           <w:sz w:val="28"/>
         </w:rPr>
         <w:t>ניקוי שמות קבצים</w:t>
@@ -3818,6 +4223,7 @@
       <w:r>
         <w:rPr>
           <w:rFonts w:ascii="Arial" w:hAnsi="Arial" w:cs="Arial"/>
+          <w:b w:val="0"/>
           <w:sz w:val="24"/>
         </w:rPr>
         <w:t>המערכת מחליפה תווי נתיב מסוכנים בשם הקובץ. כך נמנעת כתיבה לתיקיות לא רצויות.</w:t>
@@ -3833,6 +4239,7 @@
       <w:r>
         <w:rPr>
           <w:rFonts w:ascii="Arial" w:hAnsi="Arial" w:cs="Arial"/>
+          <w:b/>
           <w:sz w:val="28"/>
         </w:rPr>
         <w:t>ניהול חריגות</w:t>
@@ -3847,6 +4254,7 @@
       <w:r>
         <w:rPr>
           <w:rFonts w:ascii="Arial" w:hAnsi="Arial" w:cs="Arial"/>
+          <w:b w:val="0"/>
           <w:sz w:val="24"/>
         </w:rPr>
         <w:t>בשרת יש שימוש ב-try/except כדי למנוע קריסה כאשר לקוח מתנתק או שולח מידע לא תקין.</w:t>
@@ -3862,6 +4270,7 @@
       <w:r>
         <w:rPr>
           <w:rFonts w:ascii="Arial" w:hAnsi="Arial" w:cs="Arial"/>
+          <w:b/>
           <w:sz w:val="28"/>
         </w:rPr>
         <w:t>חולשות שנותרו</w:t>
@@ -3876,6 +4285,7 @@
       <w:r>
         <w:rPr>
           <w:rFonts w:ascii="Arial" w:hAnsi="Arial" w:cs="Arial"/>
+          <w:b w:val="0"/>
           <w:sz w:val="24"/>
         </w:rPr>
         <w:t>1. תעודת TLS היא תעודת פיתוח מקומית ולא תעודה מסחרית מאומתת.</w:t>
@@ -3889,6 +4299,7 @@
       <w:r>
         <w:rPr>
           <w:rFonts w:ascii="Arial" w:hAnsi="Arial" w:cs="Arial"/>
+          <w:b w:val="0"/>
           <w:sz w:val="24"/>
         </w:rPr>
         <w:t>2. קוד 2FA הוא לימודי בלבד ולא נשלח לערוץ חיצוני.</w:t>
@@ -3902,6 +4313,7 @@
       <w:r>
         <w:rPr>
           <w:rFonts w:ascii="Arial" w:hAnsi="Arial" w:cs="Arial"/>
+          <w:b w:val="0"/>
           <w:sz w:val="24"/>
         </w:rPr>
         <w:t>3. אין מערכת הרשאות מלאה ברמת ארגון מסחרי.</w:t>
@@ -3915,6 +4327,7 @@
       <w:r>
         <w:rPr>
           <w:rFonts w:ascii="Arial" w:hAnsi="Arial" w:cs="Arial"/>
+          <w:b w:val="0"/>
           <w:sz w:val="24"/>
         </w:rPr>
         <w:t>4. אין סריקת אנטי-וירוס לקבצים שנשלחים.</w:t>
@@ -3928,6 +4341,7 @@
       <w:r>
         <w:rPr>
           <w:rFonts w:ascii="Arial" w:hAnsi="Arial" w:cs="Arial"/>
+          <w:b w:val="0"/>
           <w:sz w:val="24"/>
         </w:rPr>
         <w:t>5. אין הגבלת קצב התחברות מתקדמת נגד brute force.</w:t>
@@ -3943,6 +4357,7 @@
       <w:r>
         <w:rPr>
           <w:rFonts w:ascii="Arial" w:hAnsi="Arial" w:cs="Arial"/>
+          <w:b/>
           <w:sz w:val="28"/>
         </w:rPr>
         <w:t>שיפורים עתידיים באבטחה</w:t>
@@ -3957,6 +4372,7 @@
       <w:r>
         <w:rPr>
           <w:rFonts w:ascii="Arial" w:hAnsi="Arial" w:cs="Arial"/>
+          <w:b w:val="0"/>
           <w:sz w:val="24"/>
         </w:rPr>
         <w:t>1. שימוש בתעודת TLS חתומה על ידי CA.</w:t>
@@ -3970,6 +4386,7 @@
       <w:r>
         <w:rPr>
           <w:rFonts w:ascii="Arial" w:hAnsi="Arial" w:cs="Arial"/>
+          <w:b w:val="0"/>
           <w:sz w:val="24"/>
         </w:rPr>
         <w:t>2. הוספת rate limiting להתחברות.</w:t>
@@ -3983,6 +4400,7 @@
       <w:r>
         <w:rPr>
           <w:rFonts w:ascii="Arial" w:hAnsi="Arial" w:cs="Arial"/>
+          <w:b w:val="0"/>
           <w:sz w:val="24"/>
         </w:rPr>
         <w:t>3. הוספת אימות דו שלבי אמיתי באפליקציית Authenticator.</w:t>
@@ -3996,6 +4414,7 @@
       <w:r>
         <w:rPr>
           <w:rFonts w:ascii="Arial" w:hAnsi="Arial" w:cs="Arial"/>
+          <w:b w:val="0"/>
           <w:sz w:val="24"/>
         </w:rPr>
         <w:t>4. סריקת קבצים לפני פתיחה.</w:t>
@@ -4009,6 +4428,7 @@
       <w:r>
         <w:rPr>
           <w:rFonts w:ascii="Arial" w:hAnsi="Arial" w:cs="Arial"/>
+          <w:b w:val="0"/>
           <w:sz w:val="24"/>
         </w:rPr>
         <w:t>5. הרשאות מפורטות יותר לכל חדר.</w:t>
@@ -4023,6 +4443,7 @@
       <w:r>
         <w:rPr>
           <w:rFonts w:ascii="Arial" w:hAnsi="Arial" w:cs="Arial"/>
+          <w:b w:val="0"/>
           <w:sz w:val="24"/>
         </w:rPr>
         <w:t>????????????????????????</w:t>
@@ -4038,6 +4459,7 @@
       <w:r>
         <w:rPr>
           <w:rFonts w:ascii="Arial" w:hAnsi="Arial" w:cs="Arial"/>
+          <w:b/>
           <w:sz w:val="32"/>
         </w:rPr>
         <w:t>11. תיאור מימוש הפרויקט</w:t>
@@ -4053,6 +4475,7 @@
       <w:r>
         <w:rPr>
           <w:rFonts w:ascii="Arial" w:hAnsi="Arial" w:cs="Arial"/>
+          <w:b/>
           <w:sz w:val="28"/>
         </w:rPr>
         <w:t>סביבת פיתוח</w:t>
@@ -4067,6 +4490,7 @@
       <w:r>
         <w:rPr>
           <w:rFonts w:ascii="Arial" w:hAnsi="Arial" w:cs="Arial"/>
+          <w:b w:val="0"/>
           <w:sz w:val="24"/>
         </w:rPr>
         <w:t>שפת תכנות: Python</w:t>
@@ -4080,6 +4504,7 @@
       <w:r>
         <w:rPr>
           <w:rFonts w:ascii="Arial" w:hAnsi="Arial" w:cs="Arial"/>
+          <w:b w:val="0"/>
           <w:sz w:val="24"/>
         </w:rPr>
         <w:t>ממשק משתמש: Tkinter</w:t>
@@ -4093,6 +4518,7 @@
       <w:r>
         <w:rPr>
           <w:rFonts w:ascii="Arial" w:hAnsi="Arial" w:cs="Arial"/>
+          <w:b w:val="0"/>
           <w:sz w:val="24"/>
         </w:rPr>
         <w:t>בסיס נתונים: SQLite</w:t>
@@ -4106,6 +4532,7 @@
       <w:r>
         <w:rPr>
           <w:rFonts w:ascii="Arial" w:hAnsi="Arial" w:cs="Arial"/>
+          <w:b w:val="0"/>
           <w:sz w:val="24"/>
         </w:rPr>
         <w:t>תקשורת: TCP sockets</w:t>
@@ -4119,6 +4546,7 @@
       <w:r>
         <w:rPr>
           <w:rFonts w:ascii="Arial" w:hAnsi="Arial" w:cs="Arial"/>
+          <w:b w:val="0"/>
           <w:sz w:val="24"/>
         </w:rPr>
         <w:t>הצפנה: TLS דרך ספריית ssl</w:t>
@@ -4132,6 +4560,7 @@
       <w:r>
         <w:rPr>
           <w:rFonts w:ascii="Arial" w:hAnsi="Arial" w:cs="Arial"/>
+          <w:b w:val="0"/>
           <w:sz w:val="24"/>
         </w:rPr>
         <w:t>ספרייה לתמונות: Pillow</w:t>
@@ -4145,6 +4574,7 @@
       <w:r>
         <w:rPr>
           <w:rFonts w:ascii="Arial" w:hAnsi="Arial" w:cs="Arial"/>
+          <w:b w:val="0"/>
           <w:sz w:val="24"/>
         </w:rPr>
         <w:t>ניהול גרסאות: Git ו-GitHub</w:t>
@@ -4160,6 +4590,7 @@
       <w:r>
         <w:rPr>
           <w:rFonts w:ascii="Arial" w:hAnsi="Arial" w:cs="Arial"/>
+          <w:b/>
           <w:sz w:val="28"/>
         </w:rPr>
         <w:t>הרצת השרת</w:t>
@@ -4173,6 +4604,7 @@
       <w:r>
         <w:rPr>
           <w:rFonts w:ascii="Consolas" w:hAnsi="Consolas" w:cs="Consolas"/>
+          <w:b w:val="0"/>
           <w:sz w:val="20"/>
         </w:rPr>
         <w:t>python -m secure_chat.server</w:t>
@@ -4188,6 +4620,7 @@
       <w:r>
         <w:rPr>
           <w:rFonts w:ascii="Arial" w:hAnsi="Arial" w:cs="Arial"/>
+          <w:b/>
           <w:sz w:val="28"/>
         </w:rPr>
         <w:t>הרצת לקוח</w:t>
@@ -4201,6 +4634,7 @@
       <w:r>
         <w:rPr>
           <w:rFonts w:ascii="Consolas" w:hAnsi="Consolas" w:cs="Consolas"/>
+          <w:b w:val="0"/>
           <w:sz w:val="20"/>
         </w:rPr>
         <w:t>python -m secure_chat.client_gui</w:t>
@@ -4216,6 +4650,7 @@
       <w:r>
         <w:rPr>
           <w:rFonts w:ascii="Arial" w:hAnsi="Arial" w:cs="Arial"/>
+          <w:b/>
           <w:sz w:val="28"/>
         </w:rPr>
         <w:t>התקנת תלויות</w:t>
@@ -4229,6 +4664,7 @@
       <w:r>
         <w:rPr>
           <w:rFonts w:ascii="Consolas" w:hAnsi="Consolas" w:cs="Consolas"/>
+          <w:b w:val="0"/>
           <w:sz w:val="20"/>
         </w:rPr>
         <w:t>pip install -r requirements.txt</w:t>
@@ -4244,6 +4680,7 @@
       <w:r>
         <w:rPr>
           <w:rFonts w:ascii="Arial" w:hAnsi="Arial" w:cs="Arial"/>
+          <w:b/>
           <w:sz w:val="28"/>
         </w:rPr>
         <w:t>מבנה תיקיות</w:t>
@@ -4257,6 +4694,7 @@
       <w:r>
         <w:rPr>
           <w:rFonts w:ascii="Consolas" w:hAnsi="Consolas" w:cs="Consolas"/>
+          <w:b w:val="0"/>
           <w:sz w:val="20"/>
         </w:rPr>
         <w:t>secure_chat/</w:t>
@@ -4269,6 +4707,7 @@
       <w:r>
         <w:rPr>
           <w:rFonts w:ascii="Consolas" w:hAnsi="Consolas" w:cs="Consolas"/>
+          <w:b w:val="0"/>
           <w:sz w:val="20"/>
         </w:rPr>
         <w:t xml:space="preserve">  client_gui.py</w:t>
@@ -4281,6 +4720,7 @@
       <w:r>
         <w:rPr>
           <w:rFonts w:ascii="Consolas" w:hAnsi="Consolas" w:cs="Consolas"/>
+          <w:b w:val="0"/>
           <w:sz w:val="20"/>
         </w:rPr>
         <w:t xml:space="preserve">  server.py</w:t>
@@ -4293,6 +4733,7 @@
       <w:r>
         <w:rPr>
           <w:rFonts w:ascii="Consolas" w:hAnsi="Consolas" w:cs="Consolas"/>
+          <w:b w:val="0"/>
           <w:sz w:val="20"/>
         </w:rPr>
         <w:t xml:space="preserve">  protocol.py</w:t>
@@ -4305,6 +4746,7 @@
       <w:r>
         <w:rPr>
           <w:rFonts w:ascii="Consolas" w:hAnsi="Consolas" w:cs="Consolas"/>
+          <w:b w:val="0"/>
           <w:sz w:val="20"/>
         </w:rPr>
         <w:t xml:space="preserve">  storage.py</w:t>
@@ -4317,6 +4759,7 @@
       <w:r>
         <w:rPr>
           <w:rFonts w:ascii="Consolas" w:hAnsi="Consolas" w:cs="Consolas"/>
+          <w:b w:val="0"/>
           <w:sz w:val="20"/>
         </w:rPr>
         <w:t xml:space="preserve">  security.py</w:t>
@@ -4329,6 +4772,7 @@
       <w:r>
         <w:rPr>
           <w:rFonts w:ascii="Consolas" w:hAnsi="Consolas" w:cs="Consolas"/>
+          <w:b w:val="0"/>
           <w:sz w:val="20"/>
         </w:rPr>
         <w:t xml:space="preserve">  models.py</w:t>
@@ -4341,6 +4785,7 @@
       <w:r>
         <w:rPr>
           <w:rFonts w:ascii="Consolas" w:hAnsi="Consolas" w:cs="Consolas"/>
+          <w:b w:val="0"/>
           <w:sz w:val="20"/>
         </w:rPr>
         <w:t xml:space="preserve">  config.py</w:t>
@@ -4353,6 +4798,7 @@
       <w:r>
         <w:rPr>
           <w:rFonts w:ascii="Consolas" w:hAnsi="Consolas" w:cs="Consolas"/>
+          <w:b w:val="0"/>
           <w:sz w:val="20"/>
         </w:rPr>
       </w:r>
@@ -4364,6 +4810,7 @@
       <w:r>
         <w:rPr>
           <w:rFonts w:ascii="Consolas" w:hAnsi="Consolas" w:cs="Consolas"/>
+          <w:b w:val="0"/>
           <w:sz w:val="20"/>
         </w:rPr>
         <w:t>tools/</w:t>
@@ -4376,6 +4823,7 @@
       <w:r>
         <w:rPr>
           <w:rFonts w:ascii="Consolas" w:hAnsi="Consolas" w:cs="Consolas"/>
+          <w:b w:val="0"/>
           <w:sz w:val="20"/>
         </w:rPr>
         <w:t xml:space="preserve">  create_dev_certificate.py</w:t>
@@ -4388,6 +4836,7 @@
       <w:r>
         <w:rPr>
           <w:rFonts w:ascii="Consolas" w:hAnsi="Consolas" w:cs="Consolas"/>
+          <w:b w:val="0"/>
           <w:sz w:val="20"/>
         </w:rPr>
       </w:r>
@@ -4399,6 +4848,7 @@
       <w:r>
         <w:rPr>
           <w:rFonts w:ascii="Consolas" w:hAnsi="Consolas" w:cs="Consolas"/>
+          <w:b w:val="0"/>
           <w:sz w:val="20"/>
         </w:rPr>
         <w:t>data/</w:t>
@@ -4411,6 +4861,7 @@
       <w:r>
         <w:rPr>
           <w:rFonts w:ascii="Consolas" w:hAnsi="Consolas" w:cs="Consolas"/>
+          <w:b w:val="0"/>
           <w:sz w:val="20"/>
         </w:rPr>
         <w:t xml:space="preserve">  secure_chat.db</w:t>
@@ -4423,6 +4874,7 @@
       <w:r>
         <w:rPr>
           <w:rFonts w:ascii="Consolas" w:hAnsi="Consolas" w:cs="Consolas"/>
+          <w:b w:val="0"/>
           <w:sz w:val="20"/>
         </w:rPr>
         <w:t xml:space="preserve">  uploads/</w:t>
@@ -4435,6 +4887,7 @@
       <w:r>
         <w:rPr>
           <w:rFonts w:ascii="Consolas" w:hAnsi="Consolas" w:cs="Consolas"/>
+          <w:b w:val="0"/>
           <w:sz w:val="20"/>
         </w:rPr>
       </w:r>
@@ -4446,6 +4899,7 @@
       <w:r>
         <w:rPr>
           <w:rFonts w:ascii="Consolas" w:hAnsi="Consolas" w:cs="Consolas"/>
+          <w:b w:val="0"/>
           <w:sz w:val="20"/>
         </w:rPr>
         <w:t>downloads/</w:t>
@@ -4458,6 +4912,7 @@
       <w:r>
         <w:rPr>
           <w:rFonts w:ascii="Consolas" w:hAnsi="Consolas" w:cs="Consolas"/>
+          <w:b w:val="0"/>
           <w:sz w:val="20"/>
         </w:rPr>
         <w:t xml:space="preserve">  received files</w:t>
@@ -4472,6 +4927,7 @@
       <w:r>
         <w:rPr>
           <w:rFonts w:ascii="Arial" w:hAnsi="Arial" w:cs="Arial"/>
+          <w:b w:val="0"/>
           <w:sz w:val="24"/>
         </w:rPr>
         <w:t>????????????????????????</w:t>
@@ -4487,6 +4943,7 @@
       <w:r>
         <w:rPr>
           <w:rFonts w:ascii="Arial" w:hAnsi="Arial" w:cs="Arial"/>
+          <w:b/>
           <w:sz w:val="32"/>
         </w:rPr>
         <w:t>12. תכנות מונחה עצמים</w:t>
@@ -4501,6 +4958,7 @@
       <w:r>
         <w:rPr>
           <w:rFonts w:ascii="Arial" w:hAnsi="Arial" w:cs="Arial"/>
+          <w:b w:val="0"/>
           <w:sz w:val="24"/>
         </w:rPr>
         <w:t>הפרויקט עומד בדרישת תכנות מונחה עצמים ומכיל הרבה יותר מארבע מחלקות.</w:t>
@@ -4516,6 +4974,7 @@
       <w:r>
         <w:rPr>
           <w:rFonts w:ascii="Arial" w:hAnsi="Arial" w:cs="Arial"/>
+          <w:b/>
           <w:sz w:val="28"/>
         </w:rPr>
         <w:t>מחלקות מרכזיות</w:t>
@@ -4530,6 +4989,7 @@
       <w:r>
         <w:rPr>
           <w:rFonts w:ascii="Arial" w:hAnsi="Arial" w:cs="Arial"/>
+          <w:b w:val="0"/>
           <w:sz w:val="24"/>
         </w:rPr>
         <w:t>1. ChatClientConnection</w:t>
@@ -4543,6 +5003,7 @@
       <w:r>
         <w:rPr>
           <w:rFonts w:ascii="Arial" w:hAnsi="Arial" w:cs="Arial"/>
+          <w:b w:val="0"/>
           <w:sz w:val="24"/>
         </w:rPr>
         <w:t xml:space="preserve">   אחראית על החיבור של הלקוח לשרת, שליחה וקבלה של packets.</w:t>
@@ -4557,6 +5018,7 @@
       <w:r>
         <w:rPr>
           <w:rFonts w:ascii="Arial" w:hAnsi="Arial" w:cs="Arial"/>
+          <w:b w:val="0"/>
           <w:sz w:val="24"/>
         </w:rPr>
         <w:t>2. SecureChatApp</w:t>
@@ -4570,6 +5032,7 @@
       <w:r>
         <w:rPr>
           <w:rFonts w:ascii="Arial" w:hAnsi="Arial" w:cs="Arial"/>
+          <w:b w:val="0"/>
           <w:sz w:val="24"/>
         </w:rPr>
         <w:t xml:space="preserve">   אחראית על הממשק הגרפי של הלקוח.</w:t>
@@ -4584,6 +5047,7 @@
       <w:r>
         <w:rPr>
           <w:rFonts w:ascii="Arial" w:hAnsi="Arial" w:cs="Arial"/>
+          <w:b w:val="0"/>
           <w:sz w:val="24"/>
         </w:rPr>
         <w:t>3. SecureChatServer</w:t>
@@ -4597,6 +5061,7 @@
       <w:r>
         <w:rPr>
           <w:rFonts w:ascii="Arial" w:hAnsi="Arial" w:cs="Arial"/>
+          <w:b w:val="0"/>
           <w:sz w:val="24"/>
         </w:rPr>
         <w:t xml:space="preserve">   אחראית על הפעלת השרת, ניהול לקוחות והפצת הודעות.</w:t>
@@ -4611,6 +5076,7 @@
       <w:r>
         <w:rPr>
           <w:rFonts w:ascii="Arial" w:hAnsi="Arial" w:cs="Arial"/>
+          <w:b w:val="0"/>
           <w:sz w:val="24"/>
         </w:rPr>
         <w:t>4. ClientHandler</w:t>
@@ -4624,6 +5090,7 @@
       <w:r>
         <w:rPr>
           <w:rFonts w:ascii="Arial" w:hAnsi="Arial" w:cs="Arial"/>
+          <w:b w:val="0"/>
           <w:sz w:val="24"/>
         </w:rPr>
         <w:t xml:space="preserve">   מייצגת לקוח יחיד בצד השרת ורצה בתוך Thread.</w:t>
@@ -4638,6 +5105,7 @@
       <w:r>
         <w:rPr>
           <w:rFonts w:ascii="Arial" w:hAnsi="Arial" w:cs="Arial"/>
+          <w:b w:val="0"/>
           <w:sz w:val="24"/>
         </w:rPr>
         <w:t>5. ChatProtocol</w:t>
@@ -4651,6 +5119,7 @@
       <w:r>
         <w:rPr>
           <w:rFonts w:ascii="Arial" w:hAnsi="Arial" w:cs="Arial"/>
+          <w:b w:val="0"/>
           <w:sz w:val="24"/>
         </w:rPr>
         <w:t xml:space="preserve">   אחראית על שליחה וקבלה של הודעות לפי הפרוטוקול.</w:t>
@@ -4665,6 +5134,7 @@
       <w:r>
         <w:rPr>
           <w:rFonts w:ascii="Arial" w:hAnsi="Arial" w:cs="Arial"/>
+          <w:b w:val="0"/>
           <w:sz w:val="24"/>
         </w:rPr>
         <w:t>6. ChatDatabase</w:t>
@@ -4678,6 +5148,7 @@
       <w:r>
         <w:rPr>
           <w:rFonts w:ascii="Arial" w:hAnsi="Arial" w:cs="Arial"/>
+          <w:b w:val="0"/>
           <w:sz w:val="24"/>
         </w:rPr>
         <w:t xml:space="preserve">   אחראית על כל הגישה לבסיס הנתונים.</w:t>
@@ -4692,6 +5163,7 @@
       <w:r>
         <w:rPr>
           <w:rFonts w:ascii="Arial" w:hAnsi="Arial" w:cs="Arial"/>
+          <w:b w:val="0"/>
           <w:sz w:val="24"/>
         </w:rPr>
         <w:t>7. PasswordHasher</w:t>
@@ -4705,6 +5177,7 @@
       <w:r>
         <w:rPr>
           <w:rFonts w:ascii="Arial" w:hAnsi="Arial" w:cs="Arial"/>
+          <w:b w:val="0"/>
           <w:sz w:val="24"/>
         </w:rPr>
         <w:t xml:space="preserve">   אחראית על hashing ואימות סיסמאות.</w:t>
@@ -4719,6 +5192,7 @@
       <w:r>
         <w:rPr>
           <w:rFonts w:ascii="Arial" w:hAnsi="Arial" w:cs="Arial"/>
+          <w:b w:val="0"/>
           <w:sz w:val="24"/>
         </w:rPr>
         <w:t>8. InputValidator</w:t>
@@ -4732,6 +5206,7 @@
       <w:r>
         <w:rPr>
           <w:rFonts w:ascii="Arial" w:hAnsi="Arial" w:cs="Arial"/>
+          <w:b w:val="0"/>
           <w:sz w:val="24"/>
         </w:rPr>
         <w:t xml:space="preserve">   אחראית על בדיקת קלטים.</w:t>
@@ -4746,6 +5221,7 @@
       <w:r>
         <w:rPr>
           <w:rFonts w:ascii="Arial" w:hAnsi="Arial" w:cs="Arial"/>
+          <w:b w:val="0"/>
           <w:sz w:val="24"/>
         </w:rPr>
         <w:t>9. TLSContextFactory</w:t>
@@ -4759,6 +5235,7 @@
       <w:r>
         <w:rPr>
           <w:rFonts w:ascii="Arial" w:hAnsi="Arial" w:cs="Arial"/>
+          <w:b w:val="0"/>
           <w:sz w:val="24"/>
         </w:rPr>
         <w:t xml:space="preserve">   אחראית על יצירת הקשרי TLS לשרת וללקוח.</w:t>
@@ -4773,6 +5250,7 @@
       <w:r>
         <w:rPr>
           <w:rFonts w:ascii="Arial" w:hAnsi="Arial" w:cs="Arial"/>
+          <w:b w:val="0"/>
           <w:sz w:val="24"/>
         </w:rPr>
         <w:t>10. ChatMessage, User, ClientInfo, ServerEvent</w:t>
@@ -4786,6 +5264,7 @@
       <w:r>
         <w:rPr>
           <w:rFonts w:ascii="Arial" w:hAnsi="Arial" w:cs="Arial"/>
+          <w:b w:val="0"/>
           <w:sz w:val="24"/>
         </w:rPr>
         <w:t xml:space="preserve">    מחלקות נתונים המתארות ישויות במערכת.</w:t>
@@ -4801,6 +5280,7 @@
       <w:r>
         <w:rPr>
           <w:rFonts w:ascii="Arial" w:hAnsi="Arial" w:cs="Arial"/>
+          <w:b/>
           <w:sz w:val="28"/>
         </w:rPr>
         <w:t>יתרונות החלוקה למחלקות</w:t>
@@ -4815,6 +5295,7 @@
       <w:r>
         <w:rPr>
           <w:rFonts w:ascii="Arial" w:hAnsi="Arial" w:cs="Arial"/>
+          <w:b w:val="0"/>
           <w:sz w:val="24"/>
         </w:rPr>
         <w:t>1. כל מחלקה אחראית על נושא ברור.</w:t>
@@ -4828,6 +5309,7 @@
       <w:r>
         <w:rPr>
           <w:rFonts w:ascii="Arial" w:hAnsi="Arial" w:cs="Arial"/>
+          <w:b w:val="0"/>
           <w:sz w:val="24"/>
         </w:rPr>
         <w:t>2. קל יותר לבדוק ולתחזק את הקוד.</w:t>
@@ -4841,6 +5323,7 @@
       <w:r>
         <w:rPr>
           <w:rFonts w:ascii="Arial" w:hAnsi="Arial" w:cs="Arial"/>
+          <w:b w:val="0"/>
           <w:sz w:val="24"/>
         </w:rPr>
         <w:t>3. השרת והלקוח מופרדים בצורה ברורה.</w:t>
@@ -4854,6 +5337,7 @@
       <w:r>
         <w:rPr>
           <w:rFonts w:ascii="Arial" w:hAnsi="Arial" w:cs="Arial"/>
+          <w:b w:val="0"/>
           <w:sz w:val="24"/>
         </w:rPr>
         <w:t>4. שכבת האבטחה מופרדת מה-GUI.</w:t>
@@ -4867,6 +5351,7 @@
       <w:r>
         <w:rPr>
           <w:rFonts w:ascii="Arial" w:hAnsi="Arial" w:cs="Arial"/>
+          <w:b w:val="0"/>
           <w:sz w:val="24"/>
         </w:rPr>
         <w:t>5. שכבת בסיס הנתונים מופרדת מלוגיקת התקשורת.</w:t>
@@ -4881,6 +5366,7 @@
       <w:r>
         <w:rPr>
           <w:rFonts w:ascii="Arial" w:hAnsi="Arial" w:cs="Arial"/>
+          <w:b w:val="0"/>
           <w:sz w:val="24"/>
         </w:rPr>
         <w:t>????????????????????????</w:t>
@@ -4896,6 +5382,7 @@
       <w:r>
         <w:rPr>
           <w:rFonts w:ascii="Arial" w:hAnsi="Arial" w:cs="Arial"/>
+          <w:b/>
           <w:sz w:val="32"/>
         </w:rPr>
         <w:t>13. שמירת נתונים וקבצים</w:t>
@@ -4911,6 +5398,7 @@
       <w:r>
         <w:rPr>
           <w:rFonts w:ascii="Arial" w:hAnsi="Arial" w:cs="Arial"/>
+          <w:b/>
           <w:sz w:val="28"/>
         </w:rPr>
         <w:t>בסיס הנתונים</w:t>
@@ -4925,6 +5413,7 @@
       <w:r>
         <w:rPr>
           <w:rFonts w:ascii="Arial" w:hAnsi="Arial" w:cs="Arial"/>
+          <w:b w:val="0"/>
           <w:sz w:val="24"/>
         </w:rPr>
         <w:t>המערכת משתמשת בקובץ SQLite בשם secure_chat.db. בסיס הנתונים כולל מידע על:</w:t>
@@ -4939,6 +5428,7 @@
       <w:r>
         <w:rPr>
           <w:rFonts w:ascii="Arial" w:hAnsi="Arial" w:cs="Arial"/>
+          <w:b w:val="0"/>
           <w:sz w:val="24"/>
         </w:rPr>
         <w:t>1. משתמשים.</w:t>
@@ -4952,6 +5442,7 @@
       <w:r>
         <w:rPr>
           <w:rFonts w:ascii="Arial" w:hAnsi="Arial" w:cs="Arial"/>
+          <w:b w:val="0"/>
           <w:sz w:val="24"/>
         </w:rPr>
         <w:t>2. הודעות.</w:t>
@@ -4965,6 +5456,7 @@
       <w:r>
         <w:rPr>
           <w:rFonts w:ascii="Arial" w:hAnsi="Arial" w:cs="Arial"/>
+          <w:b w:val="0"/>
           <w:sz w:val="24"/>
         </w:rPr>
         <w:t>3. חדרים.</w:t>
@@ -4978,6 +5470,7 @@
       <w:r>
         <w:rPr>
           <w:rFonts w:ascii="Arial" w:hAnsi="Arial" w:cs="Arial"/>
+          <w:b w:val="0"/>
           <w:sz w:val="24"/>
         </w:rPr>
         <w:t>4. לוגים.</w:t>
@@ -4991,6 +5484,7 @@
       <w:r>
         <w:rPr>
           <w:rFonts w:ascii="Arial" w:hAnsi="Arial" w:cs="Arial"/>
+          <w:b w:val="0"/>
           <w:sz w:val="24"/>
         </w:rPr>
         <w:t>5. חברים.</w:t>
@@ -5004,6 +5498,7 @@
       <w:r>
         <w:rPr>
           <w:rFonts w:ascii="Arial" w:hAnsi="Arial" w:cs="Arial"/>
+          <w:b w:val="0"/>
           <w:sz w:val="24"/>
         </w:rPr>
         <w:t>6. הורדות.</w:t>
@@ -5019,6 +5514,7 @@
       <w:r>
         <w:rPr>
           <w:rFonts w:ascii="Arial" w:hAnsi="Arial" w:cs="Arial"/>
+          <w:b/>
           <w:sz w:val="28"/>
         </w:rPr>
         <w:t>שמירת קבצים</w:t>
@@ -5033,6 +5529,7 @@
       <w:r>
         <w:rPr>
           <w:rFonts w:ascii="Arial" w:hAnsi="Arial" w:cs="Arial"/>
+          <w:b w:val="0"/>
           <w:sz w:val="24"/>
         </w:rPr>
         <w:t>כאשר משתמש שולח קובץ, השרת שומר עותק בתיקיית data/uploads. הלקוח המקבל שומר את הקובץ בתיקיית downloads.</w:t>
@@ -5048,6 +5545,7 @@
       <w:r>
         <w:rPr>
           <w:rFonts w:ascii="Arial" w:hAnsi="Arial" w:cs="Arial"/>
+          <w:b/>
           <w:sz w:val="28"/>
         </w:rPr>
         <w:t>שמירת היסטוריית הודעות</w:t>
@@ -5062,6 +5560,7 @@
       <w:r>
         <w:rPr>
           <w:rFonts w:ascii="Arial" w:hAnsi="Arial" w:cs="Arial"/>
+          <w:b w:val="0"/>
           <w:sz w:val="24"/>
         </w:rPr>
         <w:t>הודעות נשמרות בטבלת messages. כאשר משתמש מצטרף לחדר, השרת שולח לו את ההודעות האחרונות של החדר.</w:t>
@@ -5076,6 +5575,7 @@
       <w:r>
         <w:rPr>
           <w:rFonts w:ascii="Arial" w:hAnsi="Arial" w:cs="Arial"/>
+          <w:b w:val="0"/>
           <w:sz w:val="24"/>
         </w:rPr>
         <w:t>????????????????????????</w:t>
@@ -5091,6 +5591,7 @@
       <w:r>
         <w:rPr>
           <w:rFonts w:ascii="Arial" w:hAnsi="Arial" w:cs="Arial"/>
+          <w:b/>
           <w:sz w:val="32"/>
         </w:rPr>
         <w:t>14. בדיקות</w:t>
@@ -5106,6 +5607,7 @@
       <w:r>
         <w:rPr>
           <w:rFonts w:ascii="Arial" w:hAnsi="Arial" w:cs="Arial"/>
+          <w:b/>
           <w:sz w:val="28"/>
         </w:rPr>
         <w:t>בדיקה 1: הפעלת שרת</w:t>
@@ -5120,6 +5622,7 @@
       <w:r>
         <w:rPr>
           <w:rFonts w:ascii="Arial" w:hAnsi="Arial" w:cs="Arial"/>
+          <w:b w:val="0"/>
           <w:sz w:val="24"/>
         </w:rPr>
         <w:t>מטרה: לוודא שהשרת עולה ומאזין ל-port.</w:t>
@@ -5133,6 +5636,7 @@
       <w:r>
         <w:rPr>
           <w:rFonts w:ascii="Arial" w:hAnsi="Arial" w:cs="Arial"/>
+          <w:b w:val="0"/>
           <w:sz w:val="24"/>
         </w:rPr>
         <w:t>פעולה: להריץ python -m secure_chat.server.</w:t>
@@ -5146,6 +5650,7 @@
       <w:r>
         <w:rPr>
           <w:rFonts w:ascii="Arial" w:hAnsi="Arial" w:cs="Arial"/>
+          <w:b w:val="0"/>
           <w:sz w:val="24"/>
         </w:rPr>
         <w:t>תוצאה צפויה: מופיעה הודעה שהשרת מאזין לכתובת ול-port.</w:t>
@@ -5159,6 +5664,7 @@
       <w:r>
         <w:rPr>
           <w:rFonts w:ascii="Arial" w:hAnsi="Arial" w:cs="Arial"/>
+          <w:b w:val="0"/>
           <w:sz w:val="24"/>
         </w:rPr>
         <w:t>תוצאה בפועל: השרת עולה בהצלחה.</w:t>
@@ -5174,6 +5680,7 @@
       <w:r>
         <w:rPr>
           <w:rFonts w:ascii="Arial" w:hAnsi="Arial" w:cs="Arial"/>
+          <w:b/>
           <w:sz w:val="28"/>
         </w:rPr>
         <w:t>בדיקה 2: הרשמה</w:t>
@@ -5188,6 +5695,7 @@
       <w:r>
         <w:rPr>
           <w:rFonts w:ascii="Arial" w:hAnsi="Arial" w:cs="Arial"/>
+          <w:b w:val="0"/>
           <w:sz w:val="24"/>
         </w:rPr>
         <w:t>מטרה: לוודא שמשתמש חדש יכול להירשם.</w:t>
@@ -5201,6 +5709,7 @@
       <w:r>
         <w:rPr>
           <w:rFonts w:ascii="Arial" w:hAnsi="Arial" w:cs="Arial"/>
+          <w:b w:val="0"/>
           <w:sz w:val="24"/>
         </w:rPr>
         <w:t>פעולה: להפעיל לקוח, להזין שם משתמש וסיסמה וללחוץ Register.</w:t>
@@ -5214,6 +5723,7 @@
       <w:r>
         <w:rPr>
           <w:rFonts w:ascii="Arial" w:hAnsi="Arial" w:cs="Arial"/>
+          <w:b w:val="0"/>
           <w:sz w:val="24"/>
         </w:rPr>
         <w:t>תוצאה צפויה: הודעת הצלחה והתחברות למערכת.</w:t>
@@ -5227,6 +5737,7 @@
       <w:r>
         <w:rPr>
           <w:rFonts w:ascii="Arial" w:hAnsi="Arial" w:cs="Arial"/>
+          <w:b w:val="0"/>
           <w:sz w:val="24"/>
         </w:rPr>
         <w:t>תוצאה בפועל: המשתמש נרשם ונכנס למסך הצ'אט.</w:t>
@@ -5242,6 +5753,7 @@
       <w:r>
         <w:rPr>
           <w:rFonts w:ascii="Arial" w:hAnsi="Arial" w:cs="Arial"/>
+          <w:b/>
           <w:sz w:val="28"/>
         </w:rPr>
         <w:t>בדיקה 3: התחברות</w:t>
@@ -5256,6 +5768,7 @@
       <w:r>
         <w:rPr>
           <w:rFonts w:ascii="Arial" w:hAnsi="Arial" w:cs="Arial"/>
+          <w:b w:val="0"/>
           <w:sz w:val="24"/>
         </w:rPr>
         <w:t>מטרה: לוודא שמשתמש קיים יכול להתחבר.</w:t>
@@ -5269,6 +5782,7 @@
       <w:r>
         <w:rPr>
           <w:rFonts w:ascii="Arial" w:hAnsi="Arial" w:cs="Arial"/>
+          <w:b w:val="0"/>
           <w:sz w:val="24"/>
         </w:rPr>
         <w:t>פעולה: להזין שם משתמש וסיסמה קיימים וללחוץ Login.</w:t>
@@ -5282,6 +5796,7 @@
       <w:r>
         <w:rPr>
           <w:rFonts w:ascii="Arial" w:hAnsi="Arial" w:cs="Arial"/>
+          <w:b w:val="0"/>
           <w:sz w:val="24"/>
         </w:rPr>
         <w:t>תוצאה צפויה: מעבר למסך הצ'אט.</w:t>
@@ -5295,6 +5810,7 @@
       <w:r>
         <w:rPr>
           <w:rFonts w:ascii="Arial" w:hAnsi="Arial" w:cs="Arial"/>
+          <w:b w:val="0"/>
           <w:sz w:val="24"/>
         </w:rPr>
         <w:t>תוצאה בפועל: המשתמש מתחבר בהצלחה.</w:t>
@@ -5310,6 +5826,7 @@
       <w:r>
         <w:rPr>
           <w:rFonts w:ascii="Arial" w:hAnsi="Arial" w:cs="Arial"/>
+          <w:b/>
           <w:sz w:val="28"/>
         </w:rPr>
         <w:t>בדיקה 4: שם משתמש לא חוקי</w:t>
@@ -5324,6 +5841,7 @@
       <w:r>
         <w:rPr>
           <w:rFonts w:ascii="Arial" w:hAnsi="Arial" w:cs="Arial"/>
+          <w:b w:val="0"/>
           <w:sz w:val="24"/>
         </w:rPr>
         <w:t>מטרה: לבדוק טיפול בקלט לא תקין.</w:t>
@@ -5337,6 +5855,7 @@
       <w:r>
         <w:rPr>
           <w:rFonts w:ascii="Arial" w:hAnsi="Arial" w:cs="Arial"/>
+          <w:b w:val="0"/>
           <w:sz w:val="24"/>
         </w:rPr>
         <w:t>פעולה: להזין שם משתמש קצר מדי או עם תווים לא חוקיים.</w:t>
@@ -5350,6 +5869,7 @@
       <w:r>
         <w:rPr>
           <w:rFonts w:ascii="Arial" w:hAnsi="Arial" w:cs="Arial"/>
+          <w:b w:val="0"/>
           <w:sz w:val="24"/>
         </w:rPr>
         <w:t>תוצאה צפויה: הודעת שגיאה.</w:t>
@@ -5363,6 +5883,7 @@
       <w:r>
         <w:rPr>
           <w:rFonts w:ascii="Arial" w:hAnsi="Arial" w:cs="Arial"/>
+          <w:b w:val="0"/>
           <w:sz w:val="24"/>
         </w:rPr>
         <w:t>תוצאה בפועל: מוצגת הודעת שגיאה.</w:t>
@@ -5378,6 +5899,7 @@
       <w:r>
         <w:rPr>
           <w:rFonts w:ascii="Arial" w:hAnsi="Arial" w:cs="Arial"/>
+          <w:b/>
           <w:sz w:val="28"/>
         </w:rPr>
         <w:t>בדיקה 5: שני לקוחות באותו חדר</w:t>
@@ -5392,6 +5914,7 @@
       <w:r>
         <w:rPr>
           <w:rFonts w:ascii="Arial" w:hAnsi="Arial" w:cs="Arial"/>
+          <w:b w:val="0"/>
           <w:sz w:val="24"/>
         </w:rPr>
         <w:t>מטרה: לבדוק שרת מרובה לקוחות.</w:t>
@@ -5405,6 +5928,7 @@
       <w:r>
         <w:rPr>
           <w:rFonts w:ascii="Arial" w:hAnsi="Arial" w:cs="Arial"/>
+          <w:b w:val="0"/>
           <w:sz w:val="24"/>
         </w:rPr>
         <w:t>פעולה: לפתוח שני לקוחות, להתחבר בשני משתמשים ולשלוח הודעה.</w:t>
@@ -5418,6 +5942,7 @@
       <w:r>
         <w:rPr>
           <w:rFonts w:ascii="Arial" w:hAnsi="Arial" w:cs="Arial"/>
+          <w:b w:val="0"/>
           <w:sz w:val="24"/>
         </w:rPr>
         <w:t>תוצאה צפויה: ההודעה מופיעה אצל שני המשתמשים.</w:t>
@@ -5431,6 +5956,7 @@
       <w:r>
         <w:rPr>
           <w:rFonts w:ascii="Arial" w:hAnsi="Arial" w:cs="Arial"/>
+          <w:b w:val="0"/>
           <w:sz w:val="24"/>
         </w:rPr>
         <w:t>תוצאה בפועל: ההודעה עוברת בהצלחה.</w:t>
@@ -5446,6 +5972,7 @@
       <w:r>
         <w:rPr>
           <w:rFonts w:ascii="Arial" w:hAnsi="Arial" w:cs="Arial"/>
+          <w:b/>
           <w:sz w:val="28"/>
         </w:rPr>
         <w:t>בדיקה 6: יצירת חדר</w:t>
@@ -5460,6 +5987,7 @@
       <w:r>
         <w:rPr>
           <w:rFonts w:ascii="Arial" w:hAnsi="Arial" w:cs="Arial"/>
+          <w:b w:val="0"/>
           <w:sz w:val="24"/>
         </w:rPr>
         <w:t>מטרה: לבדוק יצירת חדר חדש.</w:t>
@@ -5473,6 +6001,7 @@
       <w:r>
         <w:rPr>
           <w:rFonts w:ascii="Arial" w:hAnsi="Arial" w:cs="Arial"/>
+          <w:b w:val="0"/>
           <w:sz w:val="24"/>
         </w:rPr>
         <w:t>פעולה: להזין שם חדר וללחוץ Create Room.</w:t>
@@ -5486,6 +6015,7 @@
       <w:r>
         <w:rPr>
           <w:rFonts w:ascii="Arial" w:hAnsi="Arial" w:cs="Arial"/>
+          <w:b w:val="0"/>
           <w:sz w:val="24"/>
         </w:rPr>
         <w:t>תוצאה צפויה: החדר מופיע ברשימת החדרים.</w:t>
@@ -5499,6 +6029,7 @@
       <w:r>
         <w:rPr>
           <w:rFonts w:ascii="Arial" w:hAnsi="Arial" w:cs="Arial"/>
+          <w:b w:val="0"/>
           <w:sz w:val="24"/>
         </w:rPr>
         <w:t>תוצאה בפועל: החדר נוצר ומופיע ברשימה.</w:t>
@@ -5514,6 +6045,7 @@
       <w:r>
         <w:rPr>
           <w:rFonts w:ascii="Arial" w:hAnsi="Arial" w:cs="Arial"/>
+          <w:b/>
           <w:sz w:val="28"/>
         </w:rPr>
         <w:t>בדיקה 7: חדר עם סיסמה</w:t>
@@ -5528,6 +6060,7 @@
       <w:r>
         <w:rPr>
           <w:rFonts w:ascii="Arial" w:hAnsi="Arial" w:cs="Arial"/>
+          <w:b w:val="0"/>
           <w:sz w:val="24"/>
         </w:rPr>
         <w:t>מטרה: לבדוק חדר מוגן בסיסמה.</w:t>
@@ -5541,6 +6074,7 @@
       <w:r>
         <w:rPr>
           <w:rFonts w:ascii="Arial" w:hAnsi="Arial" w:cs="Arial"/>
+          <w:b w:val="0"/>
           <w:sz w:val="24"/>
         </w:rPr>
         <w:t>פעולה: ליצור חדר בפורמט secret:1234 ולנסות להצטרף עם סיסמה נכונה ושגויה.</w:t>
@@ -5554,6 +6088,7 @@
       <w:r>
         <w:rPr>
           <w:rFonts w:ascii="Arial" w:hAnsi="Arial" w:cs="Arial"/>
+          <w:b w:val="0"/>
           <w:sz w:val="24"/>
         </w:rPr>
         <w:t>תוצאה צפויה: כניסה רק עם סיסמה נכונה.</w:t>
@@ -5567,6 +6102,7 @@
       <w:r>
         <w:rPr>
           <w:rFonts w:ascii="Arial" w:hAnsi="Arial" w:cs="Arial"/>
+          <w:b w:val="0"/>
           <w:sz w:val="24"/>
         </w:rPr>
         <w:t>תוצאה בפועל: המערכת בודקת את הסיסמה.</w:t>
@@ -5582,6 +6118,7 @@
       <w:r>
         <w:rPr>
           <w:rFonts w:ascii="Arial" w:hAnsi="Arial" w:cs="Arial"/>
+          <w:b/>
           <w:sz w:val="28"/>
         </w:rPr>
         <w:t>בדיקה 8: שליחת תמונה</w:t>
@@ -5596,6 +6133,7 @@
       <w:r>
         <w:rPr>
           <w:rFonts w:ascii="Arial" w:hAnsi="Arial" w:cs="Arial"/>
+          <w:b w:val="0"/>
           <w:sz w:val="24"/>
         </w:rPr>
         <w:t>מטרה: לוודא שתמונה נשלחת ומוצגת.</w:t>
@@ -5609,6 +6147,7 @@
       <w:r>
         <w:rPr>
           <w:rFonts w:ascii="Arial" w:hAnsi="Arial" w:cs="Arial"/>
+          <w:b w:val="0"/>
           <w:sz w:val="24"/>
         </w:rPr>
         <w:t>פעולה: ללחוץ Send Image ולבחור תמונה.</w:t>
@@ -5622,6 +6161,7 @@
       <w:r>
         <w:rPr>
           <w:rFonts w:ascii="Arial" w:hAnsi="Arial" w:cs="Arial"/>
+          <w:b w:val="0"/>
           <w:sz w:val="24"/>
         </w:rPr>
         <w:t>תוצאה צפויה: התמונה מופיעה בצ'אט כתצוגה מקדימה.</w:t>
@@ -5635,6 +6175,7 @@
       <w:r>
         <w:rPr>
           <w:rFonts w:ascii="Arial" w:hAnsi="Arial" w:cs="Arial"/>
+          <w:b w:val="0"/>
           <w:sz w:val="24"/>
         </w:rPr>
         <w:t>תוצאה בפועל: התמונה מוצגת ונשמרת בתיקיית downloads.</w:t>
@@ -5650,6 +6191,7 @@
       <w:r>
         <w:rPr>
           <w:rFonts w:ascii="Arial" w:hAnsi="Arial" w:cs="Arial"/>
+          <w:b/>
           <w:sz w:val="28"/>
         </w:rPr>
         <w:t>בדיקה 9: שליחת קובץ</w:t>
@@ -5664,6 +6206,7 @@
       <w:r>
         <w:rPr>
           <w:rFonts w:ascii="Arial" w:hAnsi="Arial" w:cs="Arial"/>
+          <w:b w:val="0"/>
           <w:sz w:val="24"/>
         </w:rPr>
         <w:t>מטרה: לוודא שקובץ נשלח ונפתח.</w:t>
@@ -5677,6 +6220,7 @@
       <w:r>
         <w:rPr>
           <w:rFonts w:ascii="Arial" w:hAnsi="Arial" w:cs="Arial"/>
+          <w:b w:val="0"/>
           <w:sz w:val="24"/>
         </w:rPr>
         <w:t>פעולה: ללחוץ Send File, לבחור קובץ וללחוץ על הקישור שהתקבל.</w:t>
@@ -5690,6 +6234,7 @@
       <w:r>
         <w:rPr>
           <w:rFonts w:ascii="Arial" w:hAnsi="Arial" w:cs="Arial"/>
+          <w:b w:val="0"/>
           <w:sz w:val="24"/>
         </w:rPr>
         <w:t>תוצאה צפויה: הקובץ נפתח בתוכנת ברירת המחדל.</w:t>
@@ -5703,6 +6248,7 @@
       <w:r>
         <w:rPr>
           <w:rFonts w:ascii="Arial" w:hAnsi="Arial" w:cs="Arial"/>
+          <w:b w:val="0"/>
           <w:sz w:val="24"/>
         </w:rPr>
         <w:t>תוצאה בפועל: הקובץ נפתח.</w:t>
@@ -5718,6 +6264,7 @@
       <w:r>
         <w:rPr>
           <w:rFonts w:ascii="Arial" w:hAnsi="Arial" w:cs="Arial"/>
+          <w:b/>
           <w:sz w:val="28"/>
         </w:rPr>
         <w:t>בדיקה 10: הודעה פרטית</w:t>
@@ -5732,6 +6279,7 @@
       <w:r>
         <w:rPr>
           <w:rFonts w:ascii="Arial" w:hAnsi="Arial" w:cs="Arial"/>
+          <w:b w:val="0"/>
           <w:sz w:val="24"/>
         </w:rPr>
         <w:t>מטרה: לבדוק פקודת DM.</w:t>
@@ -5745,6 +6293,7 @@
       <w:r>
         <w:rPr>
           <w:rFonts w:ascii="Arial" w:hAnsi="Arial" w:cs="Arial"/>
+          <w:b w:val="0"/>
           <w:sz w:val="24"/>
         </w:rPr>
         <w:t>פעולה: לשלוח /dm user hello.</w:t>
@@ -5758,6 +6307,7 @@
       <w:r>
         <w:rPr>
           <w:rFonts w:ascii="Arial" w:hAnsi="Arial" w:cs="Arial"/>
+          <w:b w:val="0"/>
           <w:sz w:val="24"/>
         </w:rPr>
         <w:t>תוצאה צפויה: ההודעה נשלחת כהודעה פרטית.</w:t>
@@ -5771,6 +6321,7 @@
       <w:r>
         <w:rPr>
           <w:rFonts w:ascii="Arial" w:hAnsi="Arial" w:cs="Arial"/>
+          <w:b w:val="0"/>
           <w:sz w:val="24"/>
         </w:rPr>
         <w:t>תוצאה בפועל: ההודעה מופיעה כהודעה פרטית.</w:t>
@@ -5786,6 +6337,7 @@
       <w:r>
         <w:rPr>
           <w:rFonts w:ascii="Arial" w:hAnsi="Arial" w:cs="Arial"/>
+          <w:b/>
           <w:sz w:val="28"/>
         </w:rPr>
         <w:t>בדיקה 11: חיפוש הודעות</w:t>
@@ -5800,6 +6352,7 @@
       <w:r>
         <w:rPr>
           <w:rFonts w:ascii="Arial" w:hAnsi="Arial" w:cs="Arial"/>
+          <w:b w:val="0"/>
           <w:sz w:val="24"/>
         </w:rPr>
         <w:t>מטרה: לבדוק חיפוש בהיסטוריית חדר.</w:t>
@@ -5813,6 +6366,7 @@
       <w:r>
         <w:rPr>
           <w:rFonts w:ascii="Arial" w:hAnsi="Arial" w:cs="Arial"/>
+          <w:b w:val="0"/>
           <w:sz w:val="24"/>
         </w:rPr>
         <w:t>פעולה: לשלוח /search word.</w:t>
@@ -5826,6 +6380,7 @@
       <w:r>
         <w:rPr>
           <w:rFonts w:ascii="Arial" w:hAnsi="Arial" w:cs="Arial"/>
+          <w:b w:val="0"/>
           <w:sz w:val="24"/>
         </w:rPr>
         <w:t>תוצאה צפויה: מתקבלת רשימת הודעות מתאימות.</w:t>
@@ -5839,6 +6394,7 @@
       <w:r>
         <w:rPr>
           <w:rFonts w:ascii="Arial" w:hAnsi="Arial" w:cs="Arial"/>
+          <w:b w:val="0"/>
           <w:sz w:val="24"/>
         </w:rPr>
         <w:t>תוצאה בפועל: המערכת מחזירה תוצאות.</w:t>
@@ -5854,6 +6410,7 @@
       <w:r>
         <w:rPr>
           <w:rFonts w:ascii="Arial" w:hAnsi="Arial" w:cs="Arial"/>
+          <w:b/>
           <w:sz w:val="28"/>
         </w:rPr>
         <w:t>בדיקה 12: פאנל מנהל</w:t>
@@ -5868,6 +6425,7 @@
       <w:r>
         <w:rPr>
           <w:rFonts w:ascii="Arial" w:hAnsi="Arial" w:cs="Arial"/>
+          <w:b w:val="0"/>
           <w:sz w:val="24"/>
         </w:rPr>
         <w:t>מטרה: לבדוק יכולות מנהל.</w:t>
@@ -5881,6 +6439,7 @@
       <w:r>
         <w:rPr>
           <w:rFonts w:ascii="Arial" w:hAnsi="Arial" w:cs="Arial"/>
+          <w:b w:val="0"/>
           <w:sz w:val="24"/>
         </w:rPr>
         <w:t>פעולה: להתחבר כמנהל ולשלוח /admin logs.</w:t>
@@ -5894,6 +6453,7 @@
       <w:r>
         <w:rPr>
           <w:rFonts w:ascii="Arial" w:hAnsi="Arial" w:cs="Arial"/>
+          <w:b w:val="0"/>
           <w:sz w:val="24"/>
         </w:rPr>
         <w:t>תוצאה צפויה: מוצגים לוגים.</w:t>
@@ -5907,6 +6467,7 @@
       <w:r>
         <w:rPr>
           <w:rFonts w:ascii="Arial" w:hAnsi="Arial" w:cs="Arial"/>
+          <w:b w:val="0"/>
           <w:sz w:val="24"/>
         </w:rPr>
         <w:t>תוצאה בפועל: לוגים מוצגים בצ'אט.</w:t>
@@ -5921,6 +6482,7 @@
       <w:r>
         <w:rPr>
           <w:rFonts w:ascii="Arial" w:hAnsi="Arial" w:cs="Arial"/>
+          <w:b w:val="0"/>
           <w:sz w:val="24"/>
         </w:rPr>
         <w:t>????????????????????????</w:t>
@@ -5936,6 +6498,7 @@
       <w:r>
         <w:rPr>
           <w:rFonts w:ascii="Arial" w:hAnsi="Arial" w:cs="Arial"/>
+          <w:b/>
           <w:sz w:val="32"/>
         </w:rPr>
         <w:t>15. מדריך למשתמש</w:t>
@@ -5951,6 +6514,7 @@
       <w:r>
         <w:rPr>
           <w:rFonts w:ascii="Arial" w:hAnsi="Arial" w:cs="Arial"/>
+          <w:b/>
           <w:sz w:val="28"/>
         </w:rPr>
         <w:t>התחלת עבודה</w:t>
@@ -5965,6 +6529,7 @@
       <w:r>
         <w:rPr>
           <w:rFonts w:ascii="Arial" w:hAnsi="Arial" w:cs="Arial"/>
+          <w:b w:val="0"/>
           <w:sz w:val="24"/>
         </w:rPr>
         <w:t>1. התקן תלויות בעזרת pip install -r requirements.txt.</w:t>
@@ -5978,6 +6543,7 @@
       <w:r>
         <w:rPr>
           <w:rFonts w:ascii="Arial" w:hAnsi="Arial" w:cs="Arial"/>
+          <w:b w:val="0"/>
           <w:sz w:val="24"/>
         </w:rPr>
         <w:t>2. הפעל את השרת.</w:t>
@@ -5991,6 +6557,7 @@
       <w:r>
         <w:rPr>
           <w:rFonts w:ascii="Arial" w:hAnsi="Arial" w:cs="Arial"/>
+          <w:b w:val="0"/>
           <w:sz w:val="24"/>
         </w:rPr>
         <w:t>3. הפעל לקוח אחד או יותר.</w:t>
@@ -6004,6 +6571,7 @@
       <w:r>
         <w:rPr>
           <w:rFonts w:ascii="Arial" w:hAnsi="Arial" w:cs="Arial"/>
+          <w:b w:val="0"/>
           <w:sz w:val="24"/>
         </w:rPr>
         <w:t>4. הירשם עם שם משתמש וסיסמה.</w:t>
@@ -6017,6 +6585,7 @@
       <w:r>
         <w:rPr>
           <w:rFonts w:ascii="Arial" w:hAnsi="Arial" w:cs="Arial"/>
+          <w:b w:val="0"/>
           <w:sz w:val="24"/>
         </w:rPr>
         <w:t>5. לאחר הרשמה או התחברות תועבר למסך הצ'אט.</w:t>
@@ -6032,6 +6601,7 @@
       <w:r>
         <w:rPr>
           <w:rFonts w:ascii="Arial" w:hAnsi="Arial" w:cs="Arial"/>
+          <w:b/>
           <w:sz w:val="28"/>
         </w:rPr>
         <w:t>שימוש בצ'אט</w:t>
@@ -6046,6 +6616,7 @@
       <w:r>
         <w:rPr>
           <w:rFonts w:ascii="Arial" w:hAnsi="Arial" w:cs="Arial"/>
+          <w:b w:val="0"/>
           <w:sz w:val="24"/>
         </w:rPr>
         <w:t>1. כתוב הודעה בתיבת ההודעה.</w:t>
@@ -6059,6 +6630,7 @@
       <w:r>
         <w:rPr>
           <w:rFonts w:ascii="Arial" w:hAnsi="Arial" w:cs="Arial"/>
+          <w:b w:val="0"/>
           <w:sz w:val="24"/>
         </w:rPr>
         <w:t>2. לחץ Send או Enter.</w:t>
@@ -6072,6 +6644,7 @@
       <w:r>
         <w:rPr>
           <w:rFonts w:ascii="Arial" w:hAnsi="Arial" w:cs="Arial"/>
+          <w:b w:val="0"/>
           <w:sz w:val="24"/>
         </w:rPr>
         <w:t>3. להוספת אימוג'י לחץ על אחד מכפתורי האימוג'י.</w:t>
@@ -6085,6 +6658,7 @@
       <w:r>
         <w:rPr>
           <w:rFonts w:ascii="Arial" w:hAnsi="Arial" w:cs="Arial"/>
+          <w:b w:val="0"/>
           <w:sz w:val="24"/>
         </w:rPr>
         <w:t>4. לשליחת קובץ לחץ Send File.</w:t>
@@ -6098,6 +6672,7 @@
       <w:r>
         <w:rPr>
           <w:rFonts w:ascii="Arial" w:hAnsi="Arial" w:cs="Arial"/>
+          <w:b w:val="0"/>
           <w:sz w:val="24"/>
         </w:rPr>
         <w:t>5. לשליחת תמונה לחץ Send Image.</w:t>
@@ -6111,6 +6686,7 @@
       <w:r>
         <w:rPr>
           <w:rFonts w:ascii="Arial" w:hAnsi="Arial" w:cs="Arial"/>
+          <w:b w:val="0"/>
           <w:sz w:val="24"/>
         </w:rPr>
         <w:t>6. לשליחת סרטון לחץ Send Video.</w:t>
@@ -6126,6 +6702,7 @@
       <w:r>
         <w:rPr>
           <w:rFonts w:ascii="Arial" w:hAnsi="Arial" w:cs="Arial"/>
+          <w:b/>
           <w:sz w:val="28"/>
         </w:rPr>
         <w:t>שימוש בחדרים</w:t>
@@ -6140,6 +6717,7 @@
       <w:r>
         <w:rPr>
           <w:rFonts w:ascii="Arial" w:hAnsi="Arial" w:cs="Arial"/>
+          <w:b w:val="0"/>
           <w:sz w:val="24"/>
         </w:rPr>
         <w:t>1. בחר חדר מרשימת החדרים.</w:t>
@@ -6153,6 +6731,7 @@
       <w:r>
         <w:rPr>
           <w:rFonts w:ascii="Arial" w:hAnsi="Arial" w:cs="Arial"/>
+          <w:b w:val="0"/>
           <w:sz w:val="24"/>
         </w:rPr>
         <w:t>2. לחץ Join Selected.</w:t>
@@ -6166,6 +6745,7 @@
       <w:r>
         <w:rPr>
           <w:rFonts w:ascii="Arial" w:hAnsi="Arial" w:cs="Arial"/>
+          <w:b w:val="0"/>
           <w:sz w:val="24"/>
         </w:rPr>
         <w:t>3. ליצירת חדר חדש כתוב שם חדר ולחץ Create Room.</w:t>
@@ -6179,6 +6759,7 @@
       <w:r>
         <w:rPr>
           <w:rFonts w:ascii="Arial" w:hAnsi="Arial" w:cs="Arial"/>
+          <w:b w:val="0"/>
           <w:sz w:val="24"/>
         </w:rPr>
         <w:t>4. לחדר עם סיסמה כתוב room:password.</w:t>
@@ -6194,6 +6775,7 @@
       <w:r>
         <w:rPr>
           <w:rFonts w:ascii="Arial" w:hAnsi="Arial" w:cs="Arial"/>
+          <w:b/>
           <w:sz w:val="28"/>
         </w:rPr>
         <w:t>פקודות מתקדמות</w:t>
@@ -6207,6 +6789,7 @@
       <w:r>
         <w:rPr>
           <w:rFonts w:ascii="Consolas" w:hAnsi="Consolas" w:cs="Consolas"/>
+          <w:b w:val="0"/>
           <w:sz w:val="20"/>
         </w:rPr>
         <w:t>/dm USER MESSAGE</w:t>
@@ -6219,6 +6802,7 @@
       <w:r>
         <w:rPr>
           <w:rFonts w:ascii="Consolas" w:hAnsi="Consolas" w:cs="Consolas"/>
+          <w:b w:val="0"/>
           <w:sz w:val="20"/>
         </w:rPr>
         <w:t>/profile set TEXT</w:t>
@@ -6231,6 +6815,7 @@
       <w:r>
         <w:rPr>
           <w:rFonts w:ascii="Consolas" w:hAnsi="Consolas" w:cs="Consolas"/>
+          <w:b w:val="0"/>
           <w:sz w:val="20"/>
         </w:rPr>
         <w:t>/profile USER</w:t>
@@ -6243,6 +6828,7 @@
       <w:r>
         <w:rPr>
           <w:rFonts w:ascii="Consolas" w:hAnsi="Consolas" w:cs="Consolas"/>
+          <w:b w:val="0"/>
           <w:sz w:val="20"/>
         </w:rPr>
         <w:t>/search TEXT</w:t>
@@ -6255,6 +6841,7 @@
       <w:r>
         <w:rPr>
           <w:rFonts w:ascii="Consolas" w:hAnsi="Consolas" w:cs="Consolas"/>
+          <w:b w:val="0"/>
           <w:sz w:val="20"/>
         </w:rPr>
         <w:t>/friend USER</w:t>
@@ -6267,6 +6854,7 @@
       <w:r>
         <w:rPr>
           <w:rFonts w:ascii="Consolas" w:hAnsi="Consolas" w:cs="Consolas"/>
+          <w:b w:val="0"/>
           <w:sz w:val="20"/>
         </w:rPr>
         <w:t>/accept USER</w:t>
@@ -6279,6 +6867,7 @@
       <w:r>
         <w:rPr>
           <w:rFonts w:ascii="Consolas" w:hAnsi="Consolas" w:cs="Consolas"/>
+          <w:b w:val="0"/>
           <w:sz w:val="20"/>
         </w:rPr>
         <w:t>/friends</w:t>
@@ -6291,6 +6880,7 @@
       <w:r>
         <w:rPr>
           <w:rFonts w:ascii="Consolas" w:hAnsi="Consolas" w:cs="Consolas"/>
+          <w:b w:val="0"/>
           <w:sz w:val="20"/>
         </w:rPr>
         <w:t>/gallery</w:t>
@@ -6303,6 +6893,7 @@
       <w:r>
         <w:rPr>
           <w:rFonts w:ascii="Consolas" w:hAnsi="Consolas" w:cs="Consolas"/>
+          <w:b w:val="0"/>
           <w:sz w:val="20"/>
         </w:rPr>
         <w:t>/admin logs</w:t>
@@ -6315,6 +6906,7 @@
       <w:r>
         <w:rPr>
           <w:rFonts w:ascii="Consolas" w:hAnsi="Consolas" w:cs="Consolas"/>
+          <w:b w:val="0"/>
           <w:sz w:val="20"/>
         </w:rPr>
         <w:t>/kick USER</w:t>
@@ -6327,6 +6919,7 @@
       <w:r>
         <w:rPr>
           <w:rFonts w:ascii="Consolas" w:hAnsi="Consolas" w:cs="Consolas"/>
+          <w:b w:val="0"/>
           <w:sz w:val="20"/>
         </w:rPr>
         <w:t>/edit MESSAGE_ID TEXT</w:t>
@@ -6339,6 +6932,7 @@
       <w:r>
         <w:rPr>
           <w:rFonts w:ascii="Consolas" w:hAnsi="Consolas" w:cs="Consolas"/>
+          <w:b w:val="0"/>
           <w:sz w:val="20"/>
         </w:rPr>
         <w:t>/delete MESSAGE_ID</w:t>
@@ -6351,6 +6945,7 @@
       <w:r>
         <w:rPr>
           <w:rFonts w:ascii="Consolas" w:hAnsi="Consolas" w:cs="Consolas"/>
+          <w:b w:val="0"/>
           <w:sz w:val="20"/>
         </w:rPr>
         <w:t>/2fa</w:t>
@@ -6366,6 +6961,7 @@
       <w:r>
         <w:rPr>
           <w:rFonts w:ascii="Arial" w:hAnsi="Arial" w:cs="Arial"/>
+          <w:b/>
           <w:sz w:val="28"/>
         </w:rPr>
         <w:t>צילומי מסך להוספה</w:t>
@@ -6380,6 +6976,7 @@
       <w:r>
         <w:rPr>
           <w:rFonts w:ascii="Arial" w:hAnsi="Arial" w:cs="Arial"/>
+          <w:b w:val="0"/>
           <w:sz w:val="24"/>
         </w:rPr>
         <w:t>יש להוסיף למסמך הסופי צילומי מסך של:</w:t>
@@ -6394,6 +6991,7 @@
       <w:r>
         <w:rPr>
           <w:rFonts w:ascii="Arial" w:hAnsi="Arial" w:cs="Arial"/>
+          <w:b w:val="0"/>
           <w:sz w:val="24"/>
         </w:rPr>
         <w:t>1. מסך הרשמה והתחברות.</w:t>
@@ -6407,6 +7005,7 @@
       <w:r>
         <w:rPr>
           <w:rFonts w:ascii="Arial" w:hAnsi="Arial" w:cs="Arial"/>
+          <w:b w:val="0"/>
           <w:sz w:val="24"/>
         </w:rPr>
         <w:t>2. מסך צ'אט לאחר התחברות.</w:t>
@@ -6420,6 +7019,7 @@
       <w:r>
         <w:rPr>
           <w:rFonts w:ascii="Arial" w:hAnsi="Arial" w:cs="Arial"/>
+          <w:b w:val="0"/>
           <w:sz w:val="24"/>
         </w:rPr>
         <w:t>3. שני לקוחות שמדברים באותו חדר.</w:t>
@@ -6433,6 +7033,7 @@
       <w:r>
         <w:rPr>
           <w:rFonts w:ascii="Arial" w:hAnsi="Arial" w:cs="Arial"/>
+          <w:b w:val="0"/>
           <w:sz w:val="24"/>
         </w:rPr>
         <w:t>4. שליחת תמונה והצגה בצ'אט.</w:t>
@@ -6446,6 +7047,7 @@
       <w:r>
         <w:rPr>
           <w:rFonts w:ascii="Arial" w:hAnsi="Arial" w:cs="Arial"/>
+          <w:b w:val="0"/>
           <w:sz w:val="24"/>
         </w:rPr>
         <w:t>5. שליחת קובץ וקישור לפתיחה.</w:t>
@@ -6459,6 +7061,7 @@
       <w:r>
         <w:rPr>
           <w:rFonts w:ascii="Arial" w:hAnsi="Arial" w:cs="Arial"/>
+          <w:b w:val="0"/>
           <w:sz w:val="24"/>
         </w:rPr>
         <w:t>6. רשימת חדרים.</w:t>
@@ -6472,6 +7075,7 @@
       <w:r>
         <w:rPr>
           <w:rFonts w:ascii="Arial" w:hAnsi="Arial" w:cs="Arial"/>
+          <w:b w:val="0"/>
           <w:sz w:val="24"/>
         </w:rPr>
         <w:t>7. פקודת /admin logs.</w:t>
@@ -6486,6 +7090,7 @@
       <w:r>
         <w:rPr>
           <w:rFonts w:ascii="Arial" w:hAnsi="Arial" w:cs="Arial"/>
+          <w:b w:val="0"/>
           <w:sz w:val="24"/>
         </w:rPr>
         <w:t>????????????????????????</w:t>
@@ -6501,6 +7106,7 @@
       <w:r>
         <w:rPr>
           <w:rFonts w:ascii="Arial" w:hAnsi="Arial" w:cs="Arial"/>
+          <w:b/>
           <w:sz w:val="32"/>
         </w:rPr>
         <w:t>16. סיכום אישי ורפלקציה</w:t>
@@ -6515,6 +7121,7 @@
       <w:r>
         <w:rPr>
           <w:rFonts w:ascii="Arial" w:hAnsi="Arial" w:cs="Arial"/>
+          <w:b w:val="0"/>
           <w:sz w:val="24"/>
         </w:rPr>
         <w:t>במהלך העבודה על הפרויקט למדתי כיצד לבנות מערכת תקשורת אמיתית שמורכבת משרת ומלקוח. למדתי להשתמש בסוקטים, להבין כיצד מידע עובר ברשת, וכיצד שרת יכול לטפל בכמה לקוחות במקביל באמצעות Thread.</w:t>
@@ -6529,6 +7136,7 @@
       <w:r>
         <w:rPr>
           <w:rFonts w:ascii="Arial" w:hAnsi="Arial" w:cs="Arial"/>
+          <w:b w:val="0"/>
           <w:sz w:val="24"/>
         </w:rPr>
         <w:t>בנוסף למדתי על חשיבות אבטחת מידע. בתחילת הפרויקט היה קל לחשוב רק על שליחת הודעות, אבל בהמשך הבנתי שמערכת אמיתית חייבת להגן על סיסמאות, לבדוק קלטים, להצפין תעבורה ולמנוע קריסות.</w:t>
@@ -6543,6 +7151,7 @@
       <w:r>
         <w:rPr>
           <w:rFonts w:ascii="Arial" w:hAnsi="Arial" w:cs="Arial"/>
+          <w:b w:val="0"/>
           <w:sz w:val="24"/>
         </w:rPr>
         <w:t>למדתי גם על עבודה עם בסיס נתונים SQLite, שמירת משתמשים, הודעות, חדרים ולוגים. הבנתי את החשיבות של חלוקת הקוד למחלקות ומודולים, כי פרויקט גדול בקובץ אחד הופך מהר מאוד לקשה לתחזוקה.</w:t>
@@ -6557,6 +7166,7 @@
       <w:r>
         <w:rPr>
           <w:rFonts w:ascii="Arial" w:hAnsi="Arial" w:cs="Arial"/>
+          <w:b w:val="0"/>
           <w:sz w:val="24"/>
         </w:rPr>
         <w:t>החלק המאתגר ביותר היה שילוב כל הרכיבים ביחד: GUI, תקשורת, שרת מרובה לקוחות, הצפנה, בסיס נתונים וקבצים. כל שינוי בצד אחד השפיע על הצד השני, ולכן היה צורך לבדוק את המערכת בצורה מסודרת.</w:t>
@@ -6571,6 +7181,7 @@
       <w:r>
         <w:rPr>
           <w:rFonts w:ascii="Arial" w:hAnsi="Arial" w:cs="Arial"/>
+          <w:b w:val="0"/>
           <w:sz w:val="24"/>
         </w:rPr>
         <w:t>אם הייתי ממשיך לפתח את המערכת, הייתי מוסיף אפליקציית מובייל, אימות דו שלבי אמיתי, הרשאות מתקדמות יותר, עיצוב מודרני יותר וסריקת קבצים לפני פתיחה.</w:t>
@@ -6585,6 +7196,7 @@
       <w:r>
         <w:rPr>
           <w:rFonts w:ascii="Arial" w:hAnsi="Arial" w:cs="Arial"/>
+          <w:b w:val="0"/>
           <w:sz w:val="24"/>
         </w:rPr>
         <w:t>????????????????????????</w:t>
@@ -6600,6 +7212,7 @@
       <w:r>
         <w:rPr>
           <w:rFonts w:ascii="Arial" w:hAnsi="Arial" w:cs="Arial"/>
+          <w:b/>
           <w:sz w:val="32"/>
         </w:rPr>
         <w:t>17. ביבליוגרפיה</w:t>
@@ -6614,6 +7227,7 @@
       <w:r>
         <w:rPr>
           <w:rFonts w:ascii="Arial" w:hAnsi="Arial" w:cs="Arial"/>
+          <w:b w:val="0"/>
           <w:sz w:val="24"/>
         </w:rPr>
         <w:t>1. Python Documentation - Socket Programming</w:t>
@@ -6627,6 +7241,7 @@
       <w:r>
         <w:rPr>
           <w:rFonts w:ascii="Arial" w:hAnsi="Arial" w:cs="Arial"/>
+          <w:b w:val="0"/>
           <w:sz w:val="24"/>
         </w:rPr>
         <w:t xml:space="preserve">   https://docs.python.org/3/library/socket.html</w:t>
@@ -6641,6 +7256,7 @@
       <w:r>
         <w:rPr>
           <w:rFonts w:ascii="Arial" w:hAnsi="Arial" w:cs="Arial"/>
+          <w:b w:val="0"/>
           <w:sz w:val="24"/>
         </w:rPr>
         <w:t>2. Python Documentation - ssl</w:t>
@@ -6654,6 +7270,7 @@
       <w:r>
         <w:rPr>
           <w:rFonts w:ascii="Arial" w:hAnsi="Arial" w:cs="Arial"/>
+          <w:b w:val="0"/>
           <w:sz w:val="24"/>
         </w:rPr>
         <w:t xml:space="preserve">   https://docs.python.org/3/library/ssl.html</w:t>
@@ -6668,6 +7285,7 @@
       <w:r>
         <w:rPr>
           <w:rFonts w:ascii="Arial" w:hAnsi="Arial" w:cs="Arial"/>
+          <w:b w:val="0"/>
           <w:sz w:val="24"/>
         </w:rPr>
         <w:t>3. Python Documentation - threading</w:t>
@@ -6681,6 +7299,7 @@
       <w:r>
         <w:rPr>
           <w:rFonts w:ascii="Arial" w:hAnsi="Arial" w:cs="Arial"/>
+          <w:b w:val="0"/>
           <w:sz w:val="24"/>
         </w:rPr>
         <w:t xml:space="preserve">   https://docs.python.org/3/library/threading.html</w:t>
@@ -6695,6 +7314,7 @@
       <w:r>
         <w:rPr>
           <w:rFonts w:ascii="Arial" w:hAnsi="Arial" w:cs="Arial"/>
+          <w:b w:val="0"/>
           <w:sz w:val="24"/>
         </w:rPr>
         <w:t>4. Python Documentation - sqlite3</w:t>
@@ -6708,6 +7328,7 @@
       <w:r>
         <w:rPr>
           <w:rFonts w:ascii="Arial" w:hAnsi="Arial" w:cs="Arial"/>
+          <w:b w:val="0"/>
           <w:sz w:val="24"/>
         </w:rPr>
         <w:t xml:space="preserve">   https://docs.python.org/3/library/sqlite3.html</w:t>
@@ -6722,6 +7343,7 @@
       <w:r>
         <w:rPr>
           <w:rFonts w:ascii="Arial" w:hAnsi="Arial" w:cs="Arial"/>
+          <w:b w:val="0"/>
           <w:sz w:val="24"/>
         </w:rPr>
         <w:t>5. Python Documentation - tkinter</w:t>
@@ -6735,6 +7357,7 @@
       <w:r>
         <w:rPr>
           <w:rFonts w:ascii="Arial" w:hAnsi="Arial" w:cs="Arial"/>
+          <w:b w:val="0"/>
           <w:sz w:val="24"/>
         </w:rPr>
         <w:t xml:space="preserve">   https://docs.python.org/3/library/tkinter.html</w:t>
@@ -6749,6 +7372,7 @@
       <w:r>
         <w:rPr>
           <w:rFonts w:ascii="Arial" w:hAnsi="Arial" w:cs="Arial"/>
+          <w:b w:val="0"/>
           <w:sz w:val="24"/>
         </w:rPr>
         <w:t>6. OWASP - Password Storage Cheat Sheet</w:t>
@@ -6762,6 +7386,7 @@
       <w:r>
         <w:rPr>
           <w:rFonts w:ascii="Arial" w:hAnsi="Arial" w:cs="Arial"/>
+          <w:b w:val="0"/>
           <w:sz w:val="24"/>
         </w:rPr>
         <w:t xml:space="preserve">   https://cheatsheetseries.owasp.org/cheatsheets/Password_Storage_Cheat_Sheet.html</w:t>
@@ -6776,6 +7401,7 @@
       <w:r>
         <w:rPr>
           <w:rFonts w:ascii="Arial" w:hAnsi="Arial" w:cs="Arial"/>
+          <w:b w:val="0"/>
           <w:sz w:val="24"/>
         </w:rPr>
         <w:t>7. OWASP - Transport Layer Protection</w:t>
@@ -6789,6 +7415,7 @@
       <w:r>
         <w:rPr>
           <w:rFonts w:ascii="Arial" w:hAnsi="Arial" w:cs="Arial"/>
+          <w:b w:val="0"/>
           <w:sz w:val="24"/>
         </w:rPr>
         <w:t xml:space="preserve">   https://owasp.org/www-project-top-ten/</w:t>
@@ -6803,6 +7430,7 @@
       <w:r>
         <w:rPr>
           <w:rFonts w:ascii="Arial" w:hAnsi="Arial" w:cs="Arial"/>
+          <w:b w:val="0"/>
           <w:sz w:val="24"/>
         </w:rPr>
         <w:t>8. SQLite Documentation</w:t>
@@ -6816,6 +7444,7 @@
       <w:r>
         <w:rPr>
           <w:rFonts w:ascii="Arial" w:hAnsi="Arial" w:cs="Arial"/>
+          <w:b w:val="0"/>
           <w:sz w:val="24"/>
         </w:rPr>
         <w:t xml:space="preserve">   https://www.sqlite.org/docs.html</w:t>
@@ -6830,6 +7459,7 @@
       <w:r>
         <w:rPr>
           <w:rFonts w:ascii="Arial" w:hAnsi="Arial" w:cs="Arial"/>
+          <w:b w:val="0"/>
           <w:sz w:val="24"/>
         </w:rPr>
         <w:t>9. Pillow Documentation</w:t>
@@ -6843,6 +7473,7 @@
       <w:r>
         <w:rPr>
           <w:rFonts w:ascii="Arial" w:hAnsi="Arial" w:cs="Arial"/>
+          <w:b w:val="0"/>
           <w:sz w:val="24"/>
         </w:rPr>
         <w:t xml:space="preserve">   https://pillow.readthedocs.io/</w:t>
@@ -6857,6 +7488,7 @@
       <w:r>
         <w:rPr>
           <w:rFonts w:ascii="Arial" w:hAnsi="Arial" w:cs="Arial"/>
+          <w:b w:val="0"/>
           <w:sz w:val="24"/>
         </w:rPr>
         <w:t>????????????????????????</w:t>
@@ -6872,6 +7504,7 @@
       <w:r>
         <w:rPr>
           <w:rFonts w:ascii="Arial" w:hAnsi="Arial" w:cs="Arial"/>
+          <w:b/>
           <w:sz w:val="32"/>
         </w:rPr>
         <w:t>18. נספחים</w:t>
@@ -6887,6 +7520,7 @@
       <w:r>
         <w:rPr>
           <w:rFonts w:ascii="Arial" w:hAnsi="Arial" w:cs="Arial"/>
+          <w:b/>
           <w:sz w:val="28"/>
         </w:rPr>
         <w:t>נספח א: התאמה לדרישות החובה</w:t>
@@ -6901,6 +7535,7 @@
       <w:r>
         <w:rPr>
           <w:rFonts w:ascii="Arial" w:hAnsi="Arial" w:cs="Arial"/>
+          <w:b w:val="0"/>
           <w:sz w:val="24"/>
         </w:rPr>
         <w:t>1. תכנות מונחה עצמים</w:t>
@@ -6914,6 +7549,7 @@
       <w:r>
         <w:rPr>
           <w:rFonts w:ascii="Arial" w:hAnsi="Arial" w:cs="Arial"/>
+          <w:b w:val="0"/>
           <w:sz w:val="24"/>
         </w:rPr>
         <w:t xml:space="preserve">   קיימות מחלקות רבות: SecureChatApp, ChatClientConnection, SecureChatServer, ClientHandler, ChatProtocol, ChatDatabase, PasswordHasher, InputValidator ועוד.</w:t>
@@ -6928,6 +7564,7 @@
       <w:r>
         <w:rPr>
           <w:rFonts w:ascii="Arial" w:hAnsi="Arial" w:cs="Arial"/>
+          <w:b w:val="0"/>
           <w:sz w:val="24"/>
         </w:rPr>
         <w:t>2. תקשורת</w:t>
@@ -6941,6 +7578,7 @@
       <w:r>
         <w:rPr>
           <w:rFonts w:ascii="Arial" w:hAnsi="Arial" w:cs="Arial"/>
+          <w:b w:val="0"/>
           <w:sz w:val="24"/>
         </w:rPr>
         <w:t xml:space="preserve">   המערכת מממשת שרת ולקוח מבוססי sockets. השרת תומך במספר לקוחות במקביל.</w:t>
@@ -6955,6 +7593,7 @@
       <w:r>
         <w:rPr>
           <w:rFonts w:ascii="Arial" w:hAnsi="Arial" w:cs="Arial"/>
+          <w:b w:val="0"/>
           <w:sz w:val="24"/>
         </w:rPr>
         <w:t>3. פרוטוקול</w:t>
@@ -6968,6 +7607,7 @@
       <w:r>
         <w:rPr>
           <w:rFonts w:ascii="Arial" w:hAnsi="Arial" w:cs="Arial"/>
+          <w:b w:val="0"/>
           <w:sz w:val="24"/>
         </w:rPr>
         <w:t xml:space="preserve">   קיים פרוטוקול עצמאי המבוסס על JSON עם כותרת אורך של 4 בתים.</w:t>
@@ -6982,6 +7622,7 @@
       <w:r>
         <w:rPr>
           <w:rFonts w:ascii="Arial" w:hAnsi="Arial" w:cs="Arial"/>
+          <w:b w:val="0"/>
           <w:sz w:val="24"/>
         </w:rPr>
         <w:t>4. מערכת הפעלה</w:t>
@@ -6995,6 +7636,7 @@
       <w:r>
         <w:rPr>
           <w:rFonts w:ascii="Arial" w:hAnsi="Arial" w:cs="Arial"/>
+          <w:b w:val="0"/>
           <w:sz w:val="24"/>
         </w:rPr>
         <w:t xml:space="preserve">   המערכת משתמשת ב-Thread לכל לקוח, בגישה לקבצים, בתיקיות uploads/downloads ובבסיס נתונים קובצי.</w:t>
@@ -7009,6 +7651,7 @@
       <w:r>
         <w:rPr>
           <w:rFonts w:ascii="Arial" w:hAnsi="Arial" w:cs="Arial"/>
+          <w:b w:val="0"/>
           <w:sz w:val="24"/>
         </w:rPr>
         <w:t>5. אבטחה</w:t>
@@ -7022,6 +7665,7 @@
       <w:r>
         <w:rPr>
           <w:rFonts w:ascii="Arial" w:hAnsi="Arial" w:cs="Arial"/>
+          <w:b w:val="0"/>
           <w:sz w:val="24"/>
         </w:rPr>
         <w:t xml:space="preserve">   התקשורת מוצפנת ב-TLS, סיסמאות נשמרות כ-hash, ויש בדיקות קלט והגבלות גודל.</w:t>
@@ -7036,6 +7680,7 @@
       <w:r>
         <w:rPr>
           <w:rFonts w:ascii="Arial" w:hAnsi="Arial" w:cs="Arial"/>
+          <w:b w:val="0"/>
           <w:sz w:val="24"/>
         </w:rPr>
         <w:t>6. ממשק משתמש</w:t>
@@ -7049,6 +7694,7 @@
       <w:r>
         <w:rPr>
           <w:rFonts w:ascii="Arial" w:hAnsi="Arial" w:cs="Arial"/>
+          <w:b w:val="0"/>
           <w:sz w:val="24"/>
         </w:rPr>
         <w:t xml:space="preserve">   קיים GUI אינטראקטיבי עם מסך התחברות, צ'אט, חדרים, משתמשים, אימוג'ים, קבצים ותמונות.</w:t>
@@ -7064,6 +7710,7 @@
       <w:r>
         <w:rPr>
           <w:rFonts w:ascii="Arial" w:hAnsi="Arial" w:cs="Arial"/>
+          <w:b/>
           <w:sz w:val="28"/>
         </w:rPr>
         <w:t>נספח ב: פקודות הרצה</w:t>
@@ -7077,6 +7724,7 @@
       <w:r>
         <w:rPr>
           <w:rFonts w:ascii="Consolas" w:hAnsi="Consolas" w:cs="Consolas"/>
+          <w:b w:val="0"/>
           <w:sz w:val="20"/>
         </w:rPr>
         <w:t>pip install -r requirements.txt</w:t>
@@ -7089,6 +7737,7 @@
       <w:r>
         <w:rPr>
           <w:rFonts w:ascii="Consolas" w:hAnsi="Consolas" w:cs="Consolas"/>
+          <w:b w:val="0"/>
           <w:sz w:val="20"/>
         </w:rPr>
         <w:t>python -m secure_chat.server</w:t>
@@ -7101,6 +7750,7 @@
       <w:r>
         <w:rPr>
           <w:rFonts w:ascii="Consolas" w:hAnsi="Consolas" w:cs="Consolas"/>
+          <w:b w:val="0"/>
           <w:sz w:val="20"/>
         </w:rPr>
         <w:t>python -m secure_chat.client_gui</w:t>
@@ -7116,6 +7766,7 @@
       <w:r>
         <w:rPr>
           <w:rFonts w:ascii="Arial" w:hAnsi="Arial" w:cs="Arial"/>
+          <w:b/>
           <w:sz w:val="28"/>
         </w:rPr>
         <w:t>נספח ג: GitHub</w:t>
@@ -7130,6 +7781,7 @@
       <w:r>
         <w:rPr>
           <w:rFonts w:ascii="Arial" w:hAnsi="Arial" w:cs="Arial"/>
+          <w:b w:val="0"/>
           <w:sz w:val="24"/>
         </w:rPr>
         <w:t>כתובת הפרויקט:</w:t>
@@ -7144,6 +7796,7 @@
       <w:r>
         <w:rPr>
           <w:rFonts w:ascii="Arial" w:hAnsi="Arial" w:cs="Arial"/>
+          <w:b w:val="0"/>
           <w:sz w:val="24"/>
         </w:rPr>
         <w:t>https://github.com/iriszigdon/SecureChat</w:t>
@@ -7159,6 +7812,7 @@
       <w:r>
         <w:rPr>
           <w:rFonts w:ascii="Arial" w:hAnsi="Arial" w:cs="Arial"/>
+          <w:b/>
           <w:sz w:val="28"/>
         </w:rPr>
         <w:t>נספח ד: קבצים עיקריים</w:t>
@@ -7173,6 +7827,7 @@
       <w:r>
         <w:rPr>
           <w:rFonts w:ascii="Arial" w:hAnsi="Arial" w:cs="Arial"/>
+          <w:b w:val="0"/>
           <w:sz w:val="24"/>
         </w:rPr>
         <w:t>1. secure_chat/server.py - קוד השרת.</w:t>
@@ -7186,6 +7841,7 @@
       <w:r>
         <w:rPr>
           <w:rFonts w:ascii="Arial" w:hAnsi="Arial" w:cs="Arial"/>
+          <w:b w:val="0"/>
           <w:sz w:val="24"/>
         </w:rPr>
         <w:t>2. secure_chat/client_gui.py - קוד הלקוח הגרפי.</w:t>
@@ -7199,6 +7855,7 @@
       <w:r>
         <w:rPr>
           <w:rFonts w:ascii="Arial" w:hAnsi="Arial" w:cs="Arial"/>
+          <w:b w:val="0"/>
           <w:sz w:val="24"/>
         </w:rPr>
         <w:t>3. secure_chat/protocol.py - פרוטוקול התקשורת.</w:t>
@@ -7212,6 +7869,7 @@
       <w:r>
         <w:rPr>
           <w:rFonts w:ascii="Arial" w:hAnsi="Arial" w:cs="Arial"/>
+          <w:b w:val="0"/>
           <w:sz w:val="24"/>
         </w:rPr>
         <w:t>4. secure_chat/storage.py - בסיס הנתונים.</w:t>
@@ -7225,6 +7883,7 @@
       <w:r>
         <w:rPr>
           <w:rFonts w:ascii="Arial" w:hAnsi="Arial" w:cs="Arial"/>
+          <w:b w:val="0"/>
           <w:sz w:val="24"/>
         </w:rPr>
         <w:t>5. secure_chat/security.py - אבטחה ובדיקות קלט.</w:t>
@@ -7238,6 +7897,7 @@
       <w:r>
         <w:rPr>
           <w:rFonts w:ascii="Arial" w:hAnsi="Arial" w:cs="Arial"/>
+          <w:b w:val="0"/>
           <w:sz w:val="24"/>
         </w:rPr>
         <w:t>6. secure_chat/models.py - מחלקות נתונים.</w:t>
@@ -7251,6 +7911,7 @@
       <w:r>
         <w:rPr>
           <w:rFonts w:ascii="Arial" w:hAnsi="Arial" w:cs="Arial"/>
+          <w:b w:val="0"/>
           <w:sz w:val="24"/>
         </w:rPr>
         <w:t>7. README.md - הוראות הרצה.</w:t>
@@ -7264,6 +7925,7 @@
       <w:r>
         <w:rPr>
           <w:rFonts w:ascii="Arial" w:hAnsi="Arial" w:cs="Arial"/>
+          <w:b w:val="0"/>
           <w:sz w:val="24"/>
         </w:rPr>
         <w:t>8. CODE_REMARKS.md - הערות שורה אחר שורה לקוד.</w:t>
@@ -7278,6 +7940,7 @@
       <w:r>
         <w:rPr>
           <w:rFonts w:ascii="Arial" w:hAnsi="Arial" w:cs="Arial"/>
+          <w:b w:val="0"/>
           <w:sz w:val="24"/>
         </w:rPr>
         <w:t>????????????????????????</w:t>
@@ -7293,6 +7956,7 @@
       <w:r>
         <w:rPr>
           <w:rFonts w:ascii="Arial" w:hAnsi="Arial" w:cs="Arial"/>
+          <w:b/>
           <w:sz w:val="32"/>
         </w:rPr>
         <w:t>הערה לסיום</w:t>
@@ -7307,12 +7971,15 @@
       <w:r>
         <w:rPr>
           <w:rFonts w:ascii="Arial" w:hAnsi="Arial" w:cs="Arial"/>
+          <w:b w:val="0"/>
           <w:sz w:val="24"/>
         </w:rPr>
         <w:t>ספר פרויקט זה נכתב בהתאם לדרישות פרויקט 5 יחידות בתחום מערכות הגנת סייבר: תכנון, מימוש, תקשורת, אבטחה, מערכת הפעלה, ממשק משתמש, בדיקות ותיעוד.</w:t>
       </w:r>
     </w:p>
     <w:sectPr>
+      <w:headerReference w:type="default" r:id="rId9"/>
+      <w:footerReference w:type="default" r:id="rId10"/>
       <w:pgSz w:w="12240" w:h="15840"/>
       <w:pgMar w:top="1134" w:right="1134" w:bottom="1134" w:left="1134" w:header="720" w:footer="720" w:gutter="0"/>
       <w:cols w:space="720"/>
@@ -7320,6 +7987,48 @@
     </w:sectPr>
   </w:body>
 </w:document>
+</file>
+
+<file path=word/footer1.xml><?xml version="1.0" encoding="utf-8"?>
+<w:ftr xmlns:m="http://schemas.openxmlformats.org/officeDocument/2006/math" xmlns:mc="http://schemas.openxmlformats.org/markup-compatibility/2006" xmlns:mo="http://schemas.microsoft.com/office/mac/office/2008/main" xmlns:mv="urn:schemas-microsoft-com:mac:vml" xmlns:o="urn:schemas-microsoft-com:office:office" xmlns:r="http://schemas.openxmlformats.org/officeDocument/2006/relationships" xmlns:v="urn:schemas-microsoft-com:vml" xmlns:w10="urn:schemas-microsoft-com:office:word" xmlns:w14="http://schemas.microsoft.com/office/word/2010/wordml" xmlns:w="http://schemas.openxmlformats.org/wordprocessingml/2006/main" xmlns:wne="http://schemas.microsoft.com/office/word/2006/wordml" xmlns:wp14="http://schemas.microsoft.com/office/word/2010/wordprocessingDrawing" xmlns:wp="http://schemas.openxmlformats.org/drawingml/2006/wordprocessingDrawing" xmlns:wpc="http://schemas.microsoft.com/office/word/2010/wordprocessingCanvas" xmlns:wpg="http://schemas.microsoft.com/office/word/2010/wordprocessingGroup" xmlns:wpi="http://schemas.microsoft.com/office/word/2010/wordprocessingInk" xmlns:wps="http://schemas.microsoft.com/office/word/2010/wordprocessingShape" mc:Ignorable="w14 wp14">
+  <w:p>
+    <w:pPr>
+      <w:pStyle w:val="Footer"/>
+      <w:jc w:val="center"/>
+    </w:pPr>
+    <w:r>
+      <w:rPr>
+        <w:rFonts w:ascii="Arial" w:hAnsi="Arial" w:cs="Arial"/>
+        <w:b w:val="0"/>
+        <w:sz w:val="24"/>
+      </w:rPr>
+      <w:t xml:space="preserve">???? </w:t>
+    </w:r>
+    <w:fldChar w:fldCharType="begin"/>
+    <w:instrText xml:space="preserve">PAGE</w:instrText>
+    <w:fldChar w:fldCharType="end"/>
+  </w:p>
+</w:ftr>
+</file>
+
+<file path=word/header1.xml><?xml version="1.0" encoding="utf-8"?>
+<w:hdr xmlns:m="http://schemas.openxmlformats.org/officeDocument/2006/math" xmlns:mc="http://schemas.openxmlformats.org/markup-compatibility/2006" xmlns:mo="http://schemas.microsoft.com/office/mac/office/2008/main" xmlns:mv="urn:schemas-microsoft-com:mac:vml" xmlns:o="urn:schemas-microsoft-com:office:office" xmlns:r="http://schemas.openxmlformats.org/officeDocument/2006/relationships" xmlns:v="urn:schemas-microsoft-com:vml" xmlns:w10="urn:schemas-microsoft-com:office:word" xmlns:w14="http://schemas.microsoft.com/office/word/2010/wordml" xmlns:w="http://schemas.openxmlformats.org/wordprocessingml/2006/main" xmlns:wne="http://schemas.microsoft.com/office/word/2006/wordml" xmlns:wp14="http://schemas.microsoft.com/office/word/2010/wordprocessingDrawing" xmlns:wp="http://schemas.openxmlformats.org/drawingml/2006/wordprocessingDrawing" xmlns:wpc="http://schemas.microsoft.com/office/word/2010/wordprocessingCanvas" xmlns:wpg="http://schemas.microsoft.com/office/word/2010/wordprocessingGroup" xmlns:wpi="http://schemas.microsoft.com/office/word/2010/wordprocessingInk" xmlns:wps="http://schemas.microsoft.com/office/word/2010/wordprocessingShape" mc:Ignorable="w14 wp14">
+  <w:p>
+    <w:pPr>
+      <w:pStyle w:val="Header"/>
+      <w:jc w:val="right"/>
+      <w:bidi w:val="1"/>
+    </w:pPr>
+    <w:r>
+      <w:rPr>
+        <w:rFonts w:ascii="Arial" w:hAnsi="Arial" w:cs="Arial"/>
+        <w:b w:val="0"/>
+        <w:sz w:val="20"/>
+      </w:rPr>
+      <w:t>SecureChat / ?? ??????: ____________</w:t>
+    </w:r>
+  </w:p>
+</w:hdr>
 </file>
 
 <file path=word/numbering.xml><?xml version="1.0" encoding="utf-8"?>
@@ -7749,7 +8458,7 @@
       <w:outlineLvl w:val="0"/>
     </w:pPr>
     <w:rPr>
-      <w:rFonts w:asciiTheme="majorHAnsi" w:eastAsiaTheme="majorEastAsia" w:hAnsiTheme="majorHAnsi" w:cstheme="majorBidi"/>
+      <w:rFonts w:asciiTheme="majorHAnsi" w:eastAsiaTheme="majorEastAsia" w:hAnsiTheme="majorHAnsi" w:cstheme="majorBidi" w:ascii="Arial" w:hAnsi="Arial" w:cs="Arial"/>
       <w:b/>
       <w:bCs/>
       <w:color w:val="365F91" w:themeColor="accent1" w:themeShade="BF"/>
@@ -7773,7 +8482,7 @@
       <w:outlineLvl w:val="1"/>
     </w:pPr>
     <w:rPr>
-      <w:rFonts w:asciiTheme="majorHAnsi" w:eastAsiaTheme="majorEastAsia" w:hAnsiTheme="majorHAnsi" w:cstheme="majorBidi"/>
+      <w:rFonts w:asciiTheme="majorHAnsi" w:eastAsiaTheme="majorEastAsia" w:hAnsiTheme="majorHAnsi" w:cstheme="majorBidi" w:ascii="Arial" w:hAnsi="Arial" w:cs="Arial"/>
       <w:b/>
       <w:bCs/>
       <w:color w:val="4F81BD" w:themeColor="accent1"/>
@@ -7797,7 +8506,7 @@
       <w:outlineLvl w:val="2"/>
     </w:pPr>
     <w:rPr>
-      <w:rFonts w:asciiTheme="majorHAnsi" w:eastAsiaTheme="majorEastAsia" w:hAnsiTheme="majorHAnsi" w:cstheme="majorBidi"/>
+      <w:rFonts w:asciiTheme="majorHAnsi" w:eastAsiaTheme="majorEastAsia" w:hAnsiTheme="majorHAnsi" w:cstheme="majorBidi" w:ascii="Arial" w:hAnsi="Arial" w:cs="Arial"/>
       <w:b/>
       <w:bCs/>
       <w:color w:val="4F81BD" w:themeColor="accent1"/>
@@ -8038,7 +8747,7 @@
       <w:contextualSpacing/>
     </w:pPr>
     <w:rPr>
-      <w:rFonts w:asciiTheme="majorHAnsi" w:eastAsiaTheme="majorEastAsia" w:hAnsiTheme="majorHAnsi" w:cstheme="majorBidi"/>
+      <w:rFonts w:asciiTheme="majorHAnsi" w:eastAsiaTheme="majorEastAsia" w:hAnsiTheme="majorHAnsi" w:cstheme="majorBidi" w:ascii="Arial" w:hAnsi="Arial" w:cs="Arial"/>
       <w:color w:val="17365D" w:themeColor="text2" w:themeShade="BF"/>
       <w:spacing w:val="5"/>
       <w:kern w:val="28"/>

</xml_diff>

<commit_message>
Regenerate Word book for compatibility
Co-authored-by: Cursor <cursoragent@cursor.com>
</commit_message>
<xml_diff>
--- a/secure_chat/book/SecureChat_Project_Book_HE.docx
+++ b/secure_chat/book/SecureChat_Project_Book_HE.docx
@@ -85,39 +85,6 @@
           <w:sz w:val="24"/>
         </w:rPr>
         <w:t>????? ????: ____________</w:t>
-      </w:r>
-    </w:p>
-    <w:p>
-      <w:r>
-        <w:br w:type="page"/>
-      </w:r>
-    </w:p>
-    <w:p>
-      <w:pPr>
-        <w:pStyle w:val="Heading1"/>
-        <w:jc w:val="right"/>
-        <w:bidi w:val="1"/>
-      </w:pPr>
-      <w:r>
-        <w:rPr>
-          <w:rFonts w:ascii="Arial" w:hAnsi="Arial" w:cs="Arial"/>
-          <w:b/>
-          <w:sz w:val="32"/>
-        </w:rPr>
-        <w:t>???? ??????? ???????</w:t>
-      </w:r>
-    </w:p>
-    <w:p>
-      <w:pPr>
-        <w:jc w:val="right"/>
-        <w:bidi w:val="1"/>
-      </w:pPr>
-      <w:r>
-        <w:fldChar w:fldCharType="begin"/>
-        <w:instrText xml:space="preserve">TOC \o "1-3" \h \z \u</w:instrText>
-        <w:fldChar w:fldCharType="separate"/>
-        <w:t>???? ???? ???? ?????? ??? ??? ????? ???? ??????? ???????.</w:t>
-        <w:fldChar w:fldCharType="end"/>
       </w:r>
     </w:p>
     <w:p>
@@ -8000,13 +7967,10 @@
       <w:rPr>
         <w:rFonts w:ascii="Arial" w:hAnsi="Arial" w:cs="Arial"/>
         <w:b w:val="0"/>
-        <w:sz w:val="24"/>
-      </w:rPr>
-      <w:t xml:space="preserve">???? </w:t>
+        <w:sz w:val="20"/>
+      </w:rPr>
+      <w:t>SecureChat - ?????? 5 ??????</w:t>
     </w:r>
-    <w:fldChar w:fldCharType="begin"/>
-    <w:instrText xml:space="preserve">PAGE</w:instrText>
-    <w:fldChar w:fldCharType="end"/>
   </w:p>
 </w:ftr>
 </file>
@@ -8025,7 +7989,7 @@
         <w:b w:val="0"/>
         <w:sz w:val="20"/>
       </w:rPr>
-      <w:t>SecureChat / ?? ??????: ____________</w:t>
+      <w:t>SecureChat - ??? ?????? / ?? ??????: ____________</w:t>
     </w:r>
   </w:p>
 </w:hdr>
@@ -8396,7 +8360,6 @@
     <w:rsid w:val="00FC693F"/>
     <w:rPr>
       <w:rFonts w:ascii="Arial" w:hAnsi="Arial" w:cs="Arial"/>
-      <w:sz w:val="24"/>
     </w:rPr>
   </w:style>
   <w:style w:type="paragraph" w:styleId="Header">

</xml_diff>